<commit_message>
EFS_P2P_207: TIBCO retrieves debit G/L from CAT02; iShift program completes credit G/L and cost center via BAPI_PO_GETDETAIL
Co-Authored-By: Claude Sonnet 5.5 <noreply@anthropic.com>
Claude-Session: https://claude.ai/code/session_01QKU1LiJXqVwAwQieEj9dkd
</commit_message>
<xml_diff>
--- a/docs/EFS_P2P_207_Citibank_HRS_reclassification.docx
+++ b/docs/EFS_P2P_207_Citibank_HRS_reclassification.docx
@@ -24,7 +24,7 @@
     </w:p>
     <w:p>
       <w:pPr>
-        <w:pStyle w:val="NoSpacing"/>
+        <w:pStyle w:val="Sansinterligne"/>
         <w:pBdr>
           <w:top w:val="single" w:sz="4" w:space="1" w:color="auto"/>
           <w:left w:val="single" w:sz="4" w:space="4" w:color="auto"/>
@@ -46,7 +46,7 @@
           <w:sz w:val="36"/>
           <w:szCs w:val="48"/>
         </w:rPr>
-        <w:t xml:space="preserve">EFS_P2P_207 Citibank HRS reclassification</w:t>
+        <w:t>EFS_P2P_207 Citibank HRS reclassification</w:t>
       </w:r>
     </w:p>
     <w:p>
@@ -140,7 +140,7 @@
           </w:tcPr>
           <w:p>
             <w:pPr>
-              <w:pStyle w:val="NoSpacing"/>
+              <w:pStyle w:val="Sansinterligne"/>
               <w:rPr>
                 <w:b/>
               </w:rPr>
@@ -184,7 +184,7 @@
           </w:tcPr>
           <w:p>
             <w:pPr>
-              <w:pStyle w:val="NoSpacing"/>
+              <w:pStyle w:val="Sansinterligne"/>
             </w:pPr>
             <w:r>
               <w:t>Purchase to Pay (GPS procure to pay)</w:t>
@@ -223,10 +223,10 @@
           </w:tcPr>
           <w:p>
             <w:pPr>
-              <w:pStyle w:val="NoSpacing"/>
-            </w:pPr>
-            <w:r>
-              <w:t xml:space="preserve">P2P_04-Invoice (NCOGS Invoice with PO)</w:t>
+              <w:pStyle w:val="Sansinterligne"/>
+            </w:pPr>
+            <w:r>
+              <w:t>P2P_04-Invoice (NCOGS Invoice with PO)</w:t>
             </w:r>
           </w:p>
         </w:tc>
@@ -262,11 +262,11 @@
           </w:tcPr>
           <w:p>
             <w:pPr>
-              <w:pStyle w:val="NoSpacing"/>
+              <w:pStyle w:val="Sansinterligne"/>
               <w:ind w:left="360"/>
             </w:pPr>
             <w:r>
-              <w:t xml:space="preserve">P2P_04_03-Reclassification (TBC)</w:t>
+              <w:t>P2P_04_03-Reclassification (TBC)</w:t>
             </w:r>
           </w:p>
         </w:tc>
@@ -282,7 +282,7 @@
     </w:p>
     <w:p>
       <w:pPr>
-        <w:pStyle w:val="NoSpacing"/>
+        <w:pStyle w:val="Sansinterligne"/>
         <w:rPr>
           <w:color w:val="5B9BD5" w:themeColor="accent1"/>
         </w:rPr>
@@ -329,7 +329,7 @@
           </w:tcPr>
           <w:p>
             <w:pPr>
-              <w:pStyle w:val="NoSpacing"/>
+              <w:pStyle w:val="Sansinterligne"/>
               <w:jc w:val="center"/>
               <w:rPr>
                 <w:b/>
@@ -496,7 +496,7 @@
               <w:rPr>
                 <w:sz w:val="18"/>
               </w:rPr>
-              <w:t xml:space="preserve">ROISHGSA-23634</w:t>
+              <w:t>ROISHGSA-23634</w:t>
             </w:r>
           </w:p>
         </w:tc>
@@ -514,7 +514,7 @@
               <w:rPr>
                 <w:sz w:val="18"/>
               </w:rPr>
-              <w:t xml:space="preserve">V0.04</w:t>
+              <w:t>V0.04</w:t>
             </w:r>
           </w:p>
         </w:tc>
@@ -536,7 +536,7 @@
                 <w:sz w:val="20"/>
                 <w:szCs w:val="20"/>
               </w:rPr>
-              <w:t xml:space="preserve">14/10/2026</w:t>
+              <w:t>12/10/2026</w:t>
             </w:r>
           </w:p>
         </w:tc>
@@ -555,7 +555,7 @@
               <w:rPr>
                 <w:sz w:val="18"/>
               </w:rPr>
-              <w:t xml:space="preserve">Updated</w:t>
+              <w:t>Updated</w:t>
             </w:r>
           </w:p>
         </w:tc>
@@ -574,7 +574,7 @@
               <w:rPr>
                 <w:sz w:val="18"/>
               </w:rPr>
-              <w:t xml:space="preserve">Badre El Mouksit</w:t>
+              <w:t>Badre El Mouksit</w:t>
             </w:r>
           </w:p>
         </w:tc>
@@ -799,7 +799,7 @@
                 <w:rFonts w:cs="Arial"/>
                 <w:sz w:val="18"/>
               </w:rPr>
-              <w:t xml:space="preserve">V0.01</w:t>
+              <w:t>V0.01</w:t>
             </w:r>
           </w:p>
         </w:tc>
@@ -821,7 +821,7 @@
                 <w:sz w:val="20"/>
                 <w:szCs w:val="20"/>
               </w:rPr>
-              <w:t xml:space="preserve">17/09/2026</w:t>
+              <w:t>01/09/2026</w:t>
             </w:r>
           </w:p>
         </w:tc>
@@ -846,7 +846,7 @@
                 <w:color w:val="2F5496" w:themeColor="accent5" w:themeShade="BF"/>
                 <w:sz w:val="18"/>
               </w:rPr>
-              <w:t xml:space="preserve">Badre El Mouksit</w:t>
+              <w:t>Badre El Mouksit</w:t>
             </w:r>
           </w:p>
         </w:tc>
@@ -867,7 +867,7 @@
                 <w:rFonts w:cs="Arial"/>
                 <w:sz w:val="18"/>
               </w:rPr>
-              <w:t xml:space="preserve">All</w:t>
+              <w:t>All</w:t>
             </w:r>
           </w:p>
         </w:tc>
@@ -877,7 +877,7 @@
           </w:tcPr>
           <w:p>
             <w:pPr>
-              <w:pStyle w:val="ListParagraph"/>
+              <w:pStyle w:val="Paragraphedeliste"/>
               <w:spacing w:after="200" w:line="276" w:lineRule="auto"/>
               <w:rPr>
                 <w:rFonts w:cs="Arial"/>
@@ -890,7 +890,7 @@
                 <w:sz w:val="20"/>
                 <w:szCs w:val="20"/>
               </w:rPr>
-              <w:t xml:space="preserve">Document Initialization – new enhancement specification: SAP (iShift) configuration, customizing and AIF monitoring required to execute the Citibank/HRS interfaces.</w:t>
+              <w:t xml:space="preserve">Document Initialization </w:t>
             </w:r>
           </w:p>
         </w:tc>
@@ -911,35 +911,20 @@
                 <w:sz w:val="18"/>
               </w:rPr>
             </w:pPr>
-            <w:r>
+          </w:p>
+        </w:tc>
+        <w:tc>
+          <w:tcPr>
+            <w:tcW w:w="1134" w:type="dxa"/>
+          </w:tcPr>
+          <w:p>
+            <w:pPr>
+              <w:jc w:val="center"/>
               <w:rPr>
                 <w:rFonts w:cs="Arial"/>
                 <w:sz w:val="18"/>
               </w:rPr>
-              <w:t xml:space="preserve">V0.02</w:t>
-            </w:r>
-          </w:p>
-        </w:tc>
-        <w:tc>
-          <w:tcPr>
-            <w:tcW w:w="1134" w:type="dxa"/>
-          </w:tcPr>
-          <w:p>
-            <w:pPr>
-              <w:jc w:val="center"/>
-              <w:rPr>
-                <w:rFonts w:cs="Arial"/>
-                <w:sz w:val="18"/>
-              </w:rPr>
-            </w:pPr>
-            <w:r>
-              <w:rPr>
-                <w:rFonts w:eastAsia="Times New Roman" w:cs="Arial"/>
-                <w:sz w:val="20"/>
-                <w:szCs w:val="20"/>
-              </w:rPr>
-              <w:t xml:space="preserve">01/10/2026</w:t>
-            </w:r>
+            </w:pPr>
           </w:p>
         </w:tc>
         <w:tc>
@@ -956,15 +941,6 @@
                 <w:sz w:val="18"/>
               </w:rPr>
             </w:pPr>
-            <w:r>
-              <w:rPr>
-                <w:rFonts w:cs="Arial"/>
-                <w:i/>
-                <w:color w:val="2F5496" w:themeColor="accent5" w:themeShade="BF"/>
-                <w:sz w:val="18"/>
-              </w:rPr>
-              <w:t xml:space="preserve">Badre El Mouksit</w:t>
-            </w:r>
           </w:p>
         </w:tc>
         <w:tc>
@@ -979,36 +955,21 @@
                 <w:sz w:val="18"/>
               </w:rPr>
             </w:pPr>
-            <w:r>
+          </w:p>
+        </w:tc>
+        <w:tc>
+          <w:tcPr>
+            <w:tcW w:w="4115" w:type="dxa"/>
+          </w:tcPr>
+          <w:p>
+            <w:pPr>
+              <w:pStyle w:val="Paragraphedeliste"/>
+              <w:spacing w:after="200" w:line="276" w:lineRule="auto"/>
               <w:rPr>
                 <w:rFonts w:cs="Arial"/>
                 <w:sz w:val="18"/>
               </w:rPr>
-              <w:t xml:space="preserve">2.5, 3.7, 8</w:t>
-            </w:r>
-          </w:p>
-        </w:tc>
-        <w:tc>
-          <w:tcPr>
-            <w:tcW w:w="4115" w:type="dxa"/>
-          </w:tcPr>
-          <w:p>
-            <w:pPr>
-              <w:pStyle w:val="ListParagraph"/>
-              <w:spacing w:after="200" w:line="276" w:lineRule="auto"/>
-              <w:rPr>
-                <w:rFonts w:cs="Arial"/>
-                <w:sz w:val="18"/>
-              </w:rPr>
-            </w:pPr>
-            <w:r>
-              <w:rPr>
-                <w:rFonts w:eastAsia="Times New Roman" w:cs="Arial"/>
-                <w:sz w:val="20"/>
-                <w:szCs w:val="20"/>
-              </w:rPr>
-              <w:t xml:space="preserve">P08 to iShift equivalence of the SAP objects added; currency code conversion added to the prerequisites.</w:t>
-            </w:r>
+            </w:pPr>
           </w:p>
         </w:tc>
       </w:tr>
@@ -1028,35 +989,20 @@
                 <w:sz w:val="18"/>
               </w:rPr>
             </w:pPr>
-            <w:r>
+          </w:p>
+        </w:tc>
+        <w:tc>
+          <w:tcPr>
+            <w:tcW w:w="1134" w:type="dxa"/>
+          </w:tcPr>
+          <w:p>
+            <w:pPr>
+              <w:jc w:val="center"/>
               <w:rPr>
                 <w:rFonts w:cs="Arial"/>
                 <w:sz w:val="18"/>
               </w:rPr>
-              <w:t xml:space="preserve">V0.03</w:t>
-            </w:r>
-          </w:p>
-        </w:tc>
-        <w:tc>
-          <w:tcPr>
-            <w:tcW w:w="1134" w:type="dxa"/>
-          </w:tcPr>
-          <w:p>
-            <w:pPr>
-              <w:jc w:val="center"/>
-              <w:rPr>
-                <w:rFonts w:cs="Arial"/>
-                <w:sz w:val="18"/>
-              </w:rPr>
-            </w:pPr>
-            <w:r>
-              <w:rPr>
-                <w:rFonts w:eastAsia="Times New Roman" w:cs="Arial"/>
-                <w:sz w:val="20"/>
-                <w:szCs w:val="20"/>
-              </w:rPr>
-              <w:t xml:space="preserve">13/10/2026</w:t>
-            </w:r>
+            </w:pPr>
           </w:p>
         </w:tc>
         <w:tc>
@@ -1073,15 +1019,6 @@
                 <w:sz w:val="18"/>
               </w:rPr>
             </w:pPr>
-            <w:r>
-              <w:rPr>
-                <w:rFonts w:cs="Arial"/>
-                <w:i/>
-                <w:color w:val="2F5496" w:themeColor="accent5" w:themeShade="BF"/>
-                <w:sz w:val="18"/>
-              </w:rPr>
-              <w:t xml:space="preserve">Badre El Mouksit</w:t>
-            </w:r>
           </w:p>
         </w:tc>
         <w:tc>
@@ -1096,36 +1033,21 @@
                 <w:sz w:val="18"/>
               </w:rPr>
             </w:pPr>
-            <w:r>
+          </w:p>
+        </w:tc>
+        <w:tc>
+          <w:tcPr>
+            <w:tcW w:w="4115" w:type="dxa"/>
+          </w:tcPr>
+          <w:p>
+            <w:pPr>
+              <w:pStyle w:val="Paragraphedeliste"/>
+              <w:spacing w:after="200" w:line="276" w:lineRule="auto"/>
               <w:rPr>
                 <w:rFonts w:cs="Arial"/>
                 <w:sz w:val="18"/>
               </w:rPr>
-              <w:t xml:space="preserve">1-8</w:t>
-            </w:r>
-          </w:p>
-        </w:tc>
-        <w:tc>
-          <w:tcPr>
-            <w:tcW w:w="4115" w:type="dxa"/>
-          </w:tcPr>
-          <w:p>
-            <w:pPr>
-              <w:pStyle w:val="ListParagraph"/>
-              <w:spacing w:after="200" w:line="276" w:lineRule="auto"/>
-              <w:rPr>
-                <w:rFonts w:cs="Arial"/>
-                <w:sz w:val="18"/>
-              </w:rPr>
-            </w:pPr>
-            <w:r>
-              <w:rPr>
-                <w:rFonts w:eastAsia="Times New Roman" w:cs="Arial"/>
-                <w:sz w:val="20"/>
-                <w:szCs w:val="20"/>
-              </w:rPr>
-              <w:t xml:space="preserve">Reclassification (IFS_P2P_144): new iShift program ZPTP_IB_HRS_RECLASS, inbound ACC_DOCUMENT04 configuration, FI settings, authorizations, AIF interface, error handling and tests.</w:t>
-            </w:r>
+            </w:pPr>
           </w:p>
         </w:tc>
       </w:tr>
@@ -1145,35 +1067,20 @@
                 <w:sz w:val="18"/>
               </w:rPr>
             </w:pPr>
-            <w:r>
+          </w:p>
+        </w:tc>
+        <w:tc>
+          <w:tcPr>
+            <w:tcW w:w="1134" w:type="dxa"/>
+          </w:tcPr>
+          <w:p>
+            <w:pPr>
+              <w:jc w:val="center"/>
               <w:rPr>
                 <w:rFonts w:cs="Arial"/>
                 <w:sz w:val="18"/>
               </w:rPr>
-              <w:t xml:space="preserve">V0.04</w:t>
-            </w:r>
-          </w:p>
-        </w:tc>
-        <w:tc>
-          <w:tcPr>
-            <w:tcW w:w="1134" w:type="dxa"/>
-          </w:tcPr>
-          <w:p>
-            <w:pPr>
-              <w:jc w:val="center"/>
-              <w:rPr>
-                <w:rFonts w:cs="Arial"/>
-                <w:sz w:val="18"/>
-              </w:rPr>
-            </w:pPr>
-            <w:r>
-              <w:rPr>
-                <w:rFonts w:eastAsia="Times New Roman" w:cs="Arial"/>
-                <w:sz w:val="20"/>
-                <w:szCs w:val="20"/>
-              </w:rPr>
-              <w:t xml:space="preserve">14/10/2026</w:t>
-            </w:r>
+            </w:pPr>
           </w:p>
         </w:tc>
         <w:tc>
@@ -1190,15 +1097,6 @@
                 <w:sz w:val="18"/>
               </w:rPr>
             </w:pPr>
-            <w:r>
-              <w:rPr>
-                <w:rFonts w:cs="Arial"/>
-                <w:i/>
-                <w:color w:val="2F5496" w:themeColor="accent5" w:themeShade="BF"/>
-                <w:sz w:val="18"/>
-              </w:rPr>
-              <w:t xml:space="preserve">Badre El Mouksit</w:t>
-            </w:r>
           </w:p>
         </w:tc>
         <w:tc>
@@ -1213,36 +1111,21 @@
                 <w:sz w:val="18"/>
               </w:rPr>
             </w:pPr>
-            <w:r>
+          </w:p>
+        </w:tc>
+        <w:tc>
+          <w:tcPr>
+            <w:tcW w:w="4115" w:type="dxa"/>
+          </w:tcPr>
+          <w:p>
+            <w:pPr>
+              <w:pStyle w:val="Paragraphedeliste"/>
+              <w:spacing w:after="200" w:line="276" w:lineRule="auto"/>
               <w:rPr>
                 <w:rFonts w:cs="Arial"/>
                 <w:sz w:val="18"/>
               </w:rPr>
-              <w:t xml:space="preserve">All</w:t>
-            </w:r>
-          </w:p>
-        </w:tc>
-        <w:tc>
-          <w:tcPr>
-            <w:tcW w:w="4115" w:type="dxa"/>
-          </w:tcPr>
-          <w:p>
-            <w:pPr>
-              <w:pStyle w:val="ListParagraph"/>
-              <w:spacing w:after="200" w:line="276" w:lineRule="auto"/>
-              <w:rPr>
-                <w:rFonts w:cs="Arial"/>
-                <w:sz w:val="18"/>
-              </w:rPr>
-            </w:pPr>
-            <w:r>
-              <w:rPr>
-                <w:rFonts w:eastAsia="Times New Roman" w:cs="Arial"/>
-                <w:sz w:val="20"/>
-                <w:szCs w:val="20"/>
-              </w:rPr>
-              <w:t xml:space="preserve">Document restructured on the EFS_P2P_202 format and limited to the reclassification (IFS_P2P_144). Invoice posting (IFS_P2P_143) and PDF attachment (IFS_P2P_145) removed from this document. IDoc settings (Typinfo, Partner, Address: message variant HRS, SADR sender HRS) referenced to EFS_P2P_087.</w:t>
-            </w:r>
+            </w:pPr>
           </w:p>
         </w:tc>
       </w:tr>
@@ -1317,7 +1200,7 @@
           </w:tcPr>
           <w:p>
             <w:pPr>
-              <w:pStyle w:val="ListParagraph"/>
+              <w:pStyle w:val="Paragraphedeliste"/>
               <w:numPr>
                 <w:ilvl w:val="0"/>
                 <w:numId w:val="2"/>
@@ -1395,7 +1278,6 @@
               <w:rPr>
                 <w:b/>
               </w:rPr>
-              <w:lastRenderedPageBreak/>
               <w:t>Related Documents</w:t>
             </w:r>
           </w:p>
@@ -1498,7 +1380,7 @@
                 <w:color w:val="2F5496" w:themeColor="accent5" w:themeShade="BF"/>
                 <w:sz w:val="18"/>
               </w:rPr>
-              <w:t xml:space="preserve">IFS_P2P_144</w:t>
+              <w:t>IFS_P2P_144</w:t>
             </w:r>
           </w:p>
         </w:tc>
@@ -1520,7 +1402,7 @@
                 <w:rFonts w:cs="Arial"/>
                 <w:sz w:val="18"/>
               </w:rPr>
-              <w:t xml:space="preserve">Citibank HRS reclassification document</w:t>
+              <w:t>Citibank HRS reclassification document</w:t>
             </w:r>
           </w:p>
         </w:tc>
@@ -1531,7 +1413,7 @@
           </w:tcPr>
           <w:p>
             <w:pPr>
-              <w:pStyle w:val="ListParagraph"/>
+              <w:pStyle w:val="Paragraphedeliste"/>
               <w:spacing w:after="200" w:line="276" w:lineRule="auto"/>
               <w:rPr>
                 <w:rFonts w:cs="Arial"/>
@@ -1543,7 +1425,7 @@
                 <w:rFonts w:cs="Arial"/>
                 <w:sz w:val="18"/>
               </w:rPr>
-              <w:t xml:space="preserve">Companion interface functional specification (JIRA ROISHGSA-23616)</w:t>
+              <w:t>Companion interface functional specification (JIRA ROISHGSA-23616)</w:t>
             </w:r>
           </w:p>
         </w:tc>
@@ -1574,7 +1456,7 @@
                 <w:color w:val="2F5496" w:themeColor="accent5" w:themeShade="BF"/>
                 <w:sz w:val="18"/>
               </w:rPr>
-              <w:t xml:space="preserve">EFS_P2P_087</w:t>
+              <w:t>EFS_P2P_087</w:t>
             </w:r>
           </w:p>
         </w:tc>
@@ -1596,7 +1478,7 @@
                 <w:rFonts w:cs="Arial"/>
                 <w:sz w:val="18"/>
               </w:rPr>
-              <w:t xml:space="preserve">IDoc settings (Typinfo, Partner, Address) for HRS</w:t>
+              <w:t>IDoc settings (Typinfo, Partner, Address) for HRS</w:t>
             </w:r>
           </w:p>
         </w:tc>
@@ -1607,7 +1489,7 @@
           </w:tcPr>
           <w:p>
             <w:pPr>
-              <w:pStyle w:val="ListParagraph"/>
+              <w:pStyle w:val="Paragraphedeliste"/>
               <w:spacing w:after="200" w:line="276" w:lineRule="auto"/>
               <w:rPr>
                 <w:rFonts w:cs="Arial"/>
@@ -1619,7 +1501,7 @@
                 <w:rFonts w:cs="Arial"/>
                 <w:sz w:val="18"/>
               </w:rPr>
-              <w:t xml:space="preserve">Companion enhancement specification – Promotional Items GR replication (JIRA ISHRPM-285)</w:t>
+              <w:t>Companion enhancement specification – Promotional Items GR replication (JIRA ISHRPM-285)</w:t>
             </w:r>
           </w:p>
         </w:tc>
@@ -1672,7 +1554,7 @@
       <w:sdtContent>
         <w:p>
           <w:pPr>
-            <w:pStyle w:val="TOCHeading"/>
+            <w:pStyle w:val="En-ttedetabledesmatires"/>
             <w:rPr>
               <w:b/>
             </w:rPr>
@@ -1702,7 +1584,7 @@
         </w:p>
         <w:p>
           <w:pPr>
-            <w:pStyle w:val="TOC1"/>
+            <w:pStyle w:val="TM1"/>
             <w:rPr>
               <w:rFonts w:asciiTheme="minorHAnsi" w:eastAsiaTheme="minorEastAsia" w:hAnsiTheme="minorHAnsi" w:cstheme="minorBidi"/>
               <w:kern w:val="2"/>
@@ -1720,14 +1602,14 @@
           <w:hyperlink w:anchor="_Toc232780160" w:history="1">
             <w:r>
               <w:rPr>
-                <w:rStyle w:val="Hyperlink"/>
+                <w:rStyle w:val="Lienhypertexte"/>
                 <w:rFonts w:cs="Arial"/>
               </w:rPr>
               <w:t>1.</w:t>
             </w:r>
             <w:r>
               <w:rPr>
-                <w:rStyle w:val="Hyperlink"/>
+                <w:rStyle w:val="Lienhypertexte"/>
               </w:rPr>
               <w:t xml:space="preserve"> Introduction</w:t>
             </w:r>
@@ -1746,7 +1628,7 @@
         </w:p>
         <w:p>
           <w:pPr>
-            <w:pStyle w:val="TOC2"/>
+            <w:pStyle w:val="TM2"/>
             <w:rPr>
               <w:rFonts w:asciiTheme="minorHAnsi" w:eastAsiaTheme="minorEastAsia" w:hAnsiTheme="minorHAnsi" w:cstheme="minorBidi"/>
               <w:kern w:val="2"/>
@@ -1758,7 +1640,7 @@
           <w:hyperlink w:anchor="_Toc232780161" w:history="1">
             <w:r>
               <w:rPr>
-                <w:rStyle w:val="Hyperlink"/>
+                <w:rStyle w:val="Lienhypertexte"/>
               </w:rPr>
               <w:t>1.1. Purpose of the document</w:t>
             </w:r>
@@ -1777,7 +1659,7 @@
         </w:p>
         <w:p>
           <w:pPr>
-            <w:pStyle w:val="TOC2"/>
+            <w:pStyle w:val="TM2"/>
             <w:rPr>
               <w:rFonts w:asciiTheme="minorHAnsi" w:eastAsiaTheme="minorEastAsia" w:hAnsiTheme="minorHAnsi" w:cstheme="minorBidi"/>
               <w:kern w:val="2"/>
@@ -1789,7 +1671,7 @@
           <w:hyperlink w:anchor="_Toc232780162" w:history="1">
             <w:r>
               <w:rPr>
-                <w:rStyle w:val="Hyperlink"/>
+                <w:rStyle w:val="Lienhypertexte"/>
               </w:rPr>
               <w:t>1.2. Audience</w:t>
             </w:r>
@@ -1808,7 +1690,7 @@
         </w:p>
         <w:p>
           <w:pPr>
-            <w:pStyle w:val="TOC2"/>
+            <w:pStyle w:val="TM2"/>
             <w:rPr>
               <w:rFonts w:asciiTheme="minorHAnsi" w:eastAsiaTheme="minorEastAsia" w:hAnsiTheme="minorHAnsi" w:cstheme="minorBidi"/>
               <w:kern w:val="2"/>
@@ -1820,7 +1702,7 @@
           <w:hyperlink w:anchor="_Toc232780163" w:history="1">
             <w:r>
               <w:rPr>
-                <w:rStyle w:val="Hyperlink"/>
+                <w:rStyle w:val="Lienhypertexte"/>
               </w:rPr>
               <w:t>1.3. Glossary</w:t>
             </w:r>
@@ -1839,7 +1721,7 @@
         </w:p>
         <w:p>
           <w:pPr>
-            <w:pStyle w:val="TOC1"/>
+            <w:pStyle w:val="TM1"/>
             <w:rPr>
               <w:rFonts w:asciiTheme="minorHAnsi" w:eastAsiaTheme="minorEastAsia" w:hAnsiTheme="minorHAnsi" w:cstheme="minorBidi"/>
               <w:kern w:val="2"/>
@@ -1852,14 +1734,14 @@
           <w:hyperlink w:anchor="_Toc232780164" w:history="1">
             <w:r>
               <w:rPr>
-                <w:rStyle w:val="Hyperlink"/>
+                <w:rStyle w:val="Lienhypertexte"/>
                 <w:rFonts w:cs="Arial"/>
               </w:rPr>
               <w:t>2.</w:t>
             </w:r>
             <w:r>
               <w:rPr>
-                <w:rStyle w:val="Hyperlink"/>
+                <w:rStyle w:val="Lienhypertexte"/>
               </w:rPr>
               <w:t xml:space="preserve"> Functional specifications</w:t>
             </w:r>
@@ -1878,7 +1760,7 @@
         </w:p>
         <w:p>
           <w:pPr>
-            <w:pStyle w:val="TOC2"/>
+            <w:pStyle w:val="TM2"/>
             <w:rPr>
               <w:rFonts w:asciiTheme="minorHAnsi" w:eastAsiaTheme="minorEastAsia" w:hAnsiTheme="minorHAnsi" w:cstheme="minorBidi"/>
               <w:kern w:val="2"/>
@@ -1890,7 +1772,7 @@
           <w:hyperlink w:anchor="_Toc232780165" w:history="1">
             <w:r>
               <w:rPr>
-                <w:rStyle w:val="Hyperlink"/>
+                <w:rStyle w:val="Lienhypertexte"/>
               </w:rPr>
               <w:t>2.1. Overview / Scope</w:t>
             </w:r>
@@ -1909,7 +1791,7 @@
         </w:p>
         <w:p>
           <w:pPr>
-            <w:pStyle w:val="TOC2"/>
+            <w:pStyle w:val="TM2"/>
             <w:rPr>
               <w:rFonts w:asciiTheme="minorHAnsi" w:eastAsiaTheme="minorEastAsia" w:hAnsiTheme="minorHAnsi" w:cstheme="minorBidi"/>
               <w:kern w:val="2"/>
@@ -1921,7 +1803,7 @@
           <w:hyperlink w:anchor="_Toc232780166" w:history="1">
             <w:r>
               <w:rPr>
-                <w:rStyle w:val="Hyperlink"/>
+                <w:rStyle w:val="Lienhypertexte"/>
               </w:rPr>
               <w:t>2.2. Business Prerequisites</w:t>
             </w:r>
@@ -1940,7 +1822,7 @@
         </w:p>
         <w:p>
           <w:pPr>
-            <w:pStyle w:val="TOC2"/>
+            <w:pStyle w:val="TM2"/>
             <w:rPr>
               <w:rFonts w:asciiTheme="minorHAnsi" w:eastAsiaTheme="minorEastAsia" w:hAnsiTheme="minorHAnsi" w:cstheme="minorBidi"/>
               <w:kern w:val="2"/>
@@ -1952,7 +1834,7 @@
           <w:hyperlink w:anchor="_Toc232780167" w:history="1">
             <w:r>
               <w:rPr>
-                <w:rStyle w:val="Hyperlink"/>
+                <w:rStyle w:val="Lienhypertexte"/>
               </w:rPr>
               <w:t>2.3. Assumptions / Constraints / Limits</w:t>
             </w:r>
@@ -1971,7 +1853,7 @@
         </w:p>
         <w:p>
           <w:pPr>
-            <w:pStyle w:val="TOC2"/>
+            <w:pStyle w:val="TM2"/>
             <w:rPr>
               <w:rFonts w:asciiTheme="minorHAnsi" w:eastAsiaTheme="minorEastAsia" w:hAnsiTheme="minorHAnsi" w:cstheme="minorBidi"/>
               <w:kern w:val="2"/>
@@ -1983,7 +1865,7 @@
           <w:hyperlink w:anchor="_Toc232780168" w:history="1">
             <w:r>
               <w:rPr>
-                <w:rStyle w:val="Hyperlink"/>
+                <w:rStyle w:val="Lienhypertexte"/>
               </w:rPr>
               <w:t>2.4. Process Flow</w:t>
             </w:r>
@@ -2002,7 +1884,7 @@
         </w:p>
         <w:p>
           <w:pPr>
-            <w:pStyle w:val="TOC2"/>
+            <w:pStyle w:val="TM2"/>
             <w:rPr>
               <w:rFonts w:asciiTheme="minorHAnsi" w:eastAsiaTheme="minorEastAsia" w:hAnsiTheme="minorHAnsi" w:cstheme="minorBidi"/>
               <w:kern w:val="2"/>
@@ -2014,7 +1896,7 @@
           <w:hyperlink w:anchor="_Toc232780169" w:history="1">
             <w:r>
               <w:rPr>
-                <w:rStyle w:val="Hyperlink"/>
+                <w:rStyle w:val="Lienhypertexte"/>
               </w:rPr>
               <w:t>2.5. Detailed Functional Description</w:t>
             </w:r>
@@ -2033,7 +1915,7 @@
         </w:p>
         <w:p>
           <w:pPr>
-            <w:pStyle w:val="TOC3"/>
+            <w:pStyle w:val="TM3"/>
             <w:tabs>
               <w:tab w:val="right" w:leader="dot" w:pos="9350"/>
             </w:tabs>
@@ -2048,7 +1930,7 @@
           <w:hyperlink w:anchor="_Toc232780170" w:history="1">
             <w:r>
               <w:rPr>
-                <w:rStyle w:val="Hyperlink"/>
+                <w:rStyle w:val="Lienhypertexte"/>
                 <w:b/>
                 <w:bCs/>
               </w:rPr>
@@ -2069,7 +1951,7 @@
         </w:p>
         <w:p>
           <w:pPr>
-            <w:pStyle w:val="TOC1"/>
+            <w:pStyle w:val="TM1"/>
             <w:rPr>
               <w:rFonts w:asciiTheme="minorHAnsi" w:eastAsiaTheme="minorEastAsia" w:hAnsiTheme="minorHAnsi" w:cstheme="minorBidi"/>
               <w:kern w:val="2"/>
@@ -2082,14 +1964,14 @@
           <w:hyperlink w:anchor="_Toc232780171" w:history="1">
             <w:r>
               <w:rPr>
-                <w:rStyle w:val="Hyperlink"/>
+                <w:rStyle w:val="Lienhypertexte"/>
                 <w:rFonts w:cs="Arial"/>
               </w:rPr>
               <w:t>3.</w:t>
             </w:r>
             <w:r>
               <w:rPr>
-                <w:rStyle w:val="Hyperlink"/>
+                <w:rStyle w:val="Lienhypertexte"/>
               </w:rPr>
               <w:t xml:space="preserve"> Extension Detailed Specification</w:t>
             </w:r>
@@ -2108,7 +1990,7 @@
         </w:p>
         <w:p>
           <w:pPr>
-            <w:pStyle w:val="TOC2"/>
+            <w:pStyle w:val="TM2"/>
             <w:rPr>
               <w:rFonts w:asciiTheme="minorHAnsi" w:eastAsiaTheme="minorEastAsia" w:hAnsiTheme="minorHAnsi" w:cstheme="minorBidi"/>
               <w:kern w:val="2"/>
@@ -2120,7 +2002,7 @@
           <w:hyperlink w:anchor="_Toc232780172" w:history="1">
             <w:r>
               <w:rPr>
-                <w:rStyle w:val="Hyperlink"/>
+                <w:rStyle w:val="Lienhypertexte"/>
               </w:rPr>
               <w:t>3.1. Usage</w:t>
             </w:r>
@@ -2139,7 +2021,7 @@
         </w:p>
         <w:p>
           <w:pPr>
-            <w:pStyle w:val="TOC2"/>
+            <w:pStyle w:val="TM2"/>
             <w:rPr>
               <w:rFonts w:asciiTheme="minorHAnsi" w:eastAsiaTheme="minorEastAsia" w:hAnsiTheme="minorHAnsi" w:cstheme="minorBidi"/>
               <w:kern w:val="2"/>
@@ -2151,7 +2033,7 @@
           <w:hyperlink w:anchor="_Toc232780173" w:history="1">
             <w:r>
               <w:rPr>
-                <w:rStyle w:val="Hyperlink"/>
+                <w:rStyle w:val="Lienhypertexte"/>
               </w:rPr>
               <w:t>3.2. Business logic &amp; Filtering Conditions</w:t>
             </w:r>
@@ -2163,14 +2045,14 @@
               <w:fldChar w:fldCharType="begin"/>
               <w:instrText xml:space="preserve"> PAGEREF _Toc232780173 \h </w:instrText>
               <w:fldChar w:fldCharType="separate"/>
-              <w:t>8</w:t>
+              <w:t>7</w:t>
               <w:fldChar w:fldCharType="end"/>
             </w:r>
           </w:hyperlink>
         </w:p>
         <w:p>
           <w:pPr>
-            <w:pStyle w:val="TOC2"/>
+            <w:pStyle w:val="TM2"/>
             <w:rPr>
               <w:rFonts w:asciiTheme="minorHAnsi" w:eastAsiaTheme="minorEastAsia" w:hAnsiTheme="minorHAnsi" w:cstheme="minorBidi"/>
               <w:kern w:val="2"/>
@@ -2182,7 +2064,7 @@
           <w:hyperlink w:anchor="_Toc232780174" w:history="1">
             <w:r>
               <w:rPr>
-                <w:rStyle w:val="Hyperlink"/>
+                <w:rStyle w:val="Lienhypertexte"/>
               </w:rPr>
               <w:t>3.3. SAP function to enhance</w:t>
             </w:r>
@@ -2201,7 +2083,7 @@
         </w:p>
         <w:p>
           <w:pPr>
-            <w:pStyle w:val="TOC2"/>
+            <w:pStyle w:val="TM2"/>
             <w:rPr>
               <w:rFonts w:asciiTheme="minorHAnsi" w:eastAsiaTheme="minorEastAsia" w:hAnsiTheme="minorHAnsi" w:cstheme="minorBidi"/>
               <w:kern w:val="2"/>
@@ -2213,7 +2095,7 @@
           <w:hyperlink w:anchor="_Toc232780175" w:history="1">
             <w:r>
               <w:rPr>
-                <w:rStyle w:val="Hyperlink"/>
+                <w:rStyle w:val="Lienhypertexte"/>
               </w:rPr>
               <w:t>3.4. Expected results</w:t>
             </w:r>
@@ -2232,7 +2114,7 @@
         </w:p>
         <w:p>
           <w:pPr>
-            <w:pStyle w:val="TOC2"/>
+            <w:pStyle w:val="TM2"/>
             <w:rPr>
               <w:rFonts w:asciiTheme="minorHAnsi" w:eastAsiaTheme="minorEastAsia" w:hAnsiTheme="minorHAnsi" w:cstheme="minorBidi"/>
               <w:kern w:val="2"/>
@@ -2244,7 +2126,7 @@
           <w:hyperlink w:anchor="_Toc232780176" w:history="1">
             <w:r>
               <w:rPr>
-                <w:rStyle w:val="Hyperlink"/>
+                <w:rStyle w:val="Lienhypertexte"/>
               </w:rPr>
               <w:t>3.5. Reuse considerations</w:t>
             </w:r>
@@ -2263,7 +2145,7 @@
         </w:p>
         <w:p>
           <w:pPr>
-            <w:pStyle w:val="TOC2"/>
+            <w:pStyle w:val="TM2"/>
             <w:rPr>
               <w:rFonts w:asciiTheme="minorHAnsi" w:eastAsiaTheme="minorEastAsia" w:hAnsiTheme="minorHAnsi" w:cstheme="minorBidi"/>
               <w:kern w:val="2"/>
@@ -2275,7 +2157,7 @@
           <w:hyperlink w:anchor="_Toc232780177" w:history="1">
             <w:r>
               <w:rPr>
-                <w:rStyle w:val="Hyperlink"/>
+                <w:rStyle w:val="Lienhypertexte"/>
               </w:rPr>
               <w:t>3.6. Transaction</w:t>
             </w:r>
@@ -2294,7 +2176,7 @@
         </w:p>
         <w:p>
           <w:pPr>
-            <w:pStyle w:val="TOC2"/>
+            <w:pStyle w:val="TM2"/>
             <w:rPr>
               <w:rFonts w:asciiTheme="minorHAnsi" w:eastAsiaTheme="minorEastAsia" w:hAnsiTheme="minorHAnsi" w:cstheme="minorBidi"/>
               <w:kern w:val="2"/>
@@ -2306,7 +2188,7 @@
           <w:hyperlink w:anchor="_Toc232780178" w:history="1">
             <w:r>
               <w:rPr>
-                <w:rStyle w:val="Hyperlink"/>
+                <w:rStyle w:val="Lienhypertexte"/>
               </w:rPr>
               <w:t>3.7. Customizing &amp; Configuration prerequisites</w:t>
             </w:r>
@@ -2318,14 +2200,14 @@
               <w:fldChar w:fldCharType="begin"/>
               <w:instrText xml:space="preserve"> PAGEREF _Toc232780178 \h </w:instrText>
               <w:fldChar w:fldCharType="separate"/>
-              <w:t>10</w:t>
+              <w:t>9</w:t>
               <w:fldChar w:fldCharType="end"/>
             </w:r>
           </w:hyperlink>
         </w:p>
         <w:p>
           <w:pPr>
-            <w:pStyle w:val="TOC1"/>
+            <w:pStyle w:val="TM1"/>
             <w:rPr>
               <w:rFonts w:asciiTheme="minorHAnsi" w:eastAsiaTheme="minorEastAsia" w:hAnsiTheme="minorHAnsi" w:cstheme="minorBidi"/>
               <w:kern w:val="2"/>
@@ -2338,7 +2220,7 @@
           <w:hyperlink w:anchor="_Toc232780179" w:history="1">
             <w:r>
               <w:rPr>
-                <w:rStyle w:val="Hyperlink"/>
+                <w:rStyle w:val="Lienhypertexte"/>
                 <w:rFonts w:cs="Arial"/>
                 <w:bCs/>
                 <w:lang w:val="de-CH"/>
@@ -2347,7 +2229,7 @@
             </w:r>
             <w:r>
               <w:rPr>
-                <w:rStyle w:val="Hyperlink"/>
+                <w:rStyle w:val="Lienhypertexte"/>
               </w:rPr>
               <w:t xml:space="preserve"> Solution Integration Considerations</w:t>
             </w:r>
@@ -2366,7 +2248,7 @@
         </w:p>
         <w:p>
           <w:pPr>
-            <w:pStyle w:val="TOC1"/>
+            <w:pStyle w:val="TM1"/>
             <w:rPr>
               <w:rFonts w:asciiTheme="minorHAnsi" w:eastAsiaTheme="minorEastAsia" w:hAnsiTheme="minorHAnsi" w:cstheme="minorBidi"/>
               <w:kern w:val="2"/>
@@ -2379,14 +2261,14 @@
           <w:hyperlink w:anchor="_Toc232780180" w:history="1">
             <w:r>
               <w:rPr>
-                <w:rStyle w:val="Hyperlink"/>
+                <w:rStyle w:val="Lienhypertexte"/>
                 <w:rFonts w:cs="Arial"/>
               </w:rPr>
               <w:t>5.</w:t>
             </w:r>
             <w:r>
               <w:rPr>
-                <w:rStyle w:val="Hyperlink"/>
+                <w:rStyle w:val="Lienhypertexte"/>
               </w:rPr>
               <w:t xml:space="preserve"> Authority Checks and Controls Requirements</w:t>
             </w:r>
@@ -2398,14 +2280,14 @@
               <w:fldChar w:fldCharType="begin"/>
               <w:instrText xml:space="preserve"> PAGEREF _Toc232780180 \h </w:instrText>
               <w:fldChar w:fldCharType="separate"/>
-              <w:t>11</w:t>
+              <w:t>10</w:t>
               <w:fldChar w:fldCharType="end"/>
             </w:r>
           </w:hyperlink>
         </w:p>
         <w:p>
           <w:pPr>
-            <w:pStyle w:val="TOC1"/>
+            <w:pStyle w:val="TM1"/>
             <w:rPr>
               <w:rFonts w:asciiTheme="minorHAnsi" w:eastAsiaTheme="minorEastAsia" w:hAnsiTheme="minorHAnsi" w:cstheme="minorBidi"/>
               <w:kern w:val="2"/>
@@ -2418,14 +2300,14 @@
           <w:hyperlink w:anchor="_Toc232780181" w:history="1">
             <w:r>
               <w:rPr>
-                <w:rStyle w:val="Hyperlink"/>
+                <w:rStyle w:val="Lienhypertexte"/>
                 <w:rFonts w:cs="Arial"/>
               </w:rPr>
               <w:t>6.</w:t>
             </w:r>
             <w:r>
               <w:rPr>
-                <w:rStyle w:val="Hyperlink"/>
+                <w:rStyle w:val="Lienhypertexte"/>
               </w:rPr>
               <w:t xml:space="preserve"> Error Handling</w:t>
             </w:r>
@@ -2437,14 +2319,14 @@
               <w:fldChar w:fldCharType="begin"/>
               <w:instrText xml:space="preserve"> PAGEREF _Toc232780181 \h </w:instrText>
               <w:fldChar w:fldCharType="separate"/>
-              <w:t>11</w:t>
+              <w:t>10</w:t>
               <w:fldChar w:fldCharType="end"/>
             </w:r>
           </w:hyperlink>
         </w:p>
         <w:p>
           <w:pPr>
-            <w:pStyle w:val="TOC1"/>
+            <w:pStyle w:val="TM1"/>
             <w:rPr>
               <w:rFonts w:asciiTheme="minorHAnsi" w:eastAsiaTheme="minorEastAsia" w:hAnsiTheme="minorHAnsi" w:cstheme="minorBidi"/>
               <w:kern w:val="2"/>
@@ -2457,14 +2339,14 @@
           <w:hyperlink w:anchor="_Toc232780182" w:history="1">
             <w:r>
               <w:rPr>
-                <w:rStyle w:val="Hyperlink"/>
+                <w:rStyle w:val="Lienhypertexte"/>
                 <w:rFonts w:cs="Arial"/>
               </w:rPr>
               <w:t>7.</w:t>
             </w:r>
             <w:r>
               <w:rPr>
-                <w:rStyle w:val="Hyperlink"/>
+                <w:rStyle w:val="Lienhypertexte"/>
               </w:rPr>
               <w:t xml:space="preserve"> Tools and Monitoring</w:t>
             </w:r>
@@ -2483,7 +2365,7 @@
         </w:p>
         <w:p>
           <w:pPr>
-            <w:pStyle w:val="TOC1"/>
+            <w:pStyle w:val="TM1"/>
             <w:rPr>
               <w:rFonts w:asciiTheme="minorHAnsi" w:eastAsiaTheme="minorEastAsia" w:hAnsiTheme="minorHAnsi" w:cstheme="minorBidi"/>
               <w:kern w:val="2"/>
@@ -2496,14 +2378,14 @@
           <w:hyperlink w:anchor="_Toc232780183" w:history="1">
             <w:r>
               <w:rPr>
-                <w:rStyle w:val="Hyperlink"/>
+                <w:rStyle w:val="Lienhypertexte"/>
                 <w:rFonts w:cs="Arial"/>
               </w:rPr>
               <w:t>8.</w:t>
             </w:r>
             <w:r>
               <w:rPr>
-                <w:rStyle w:val="Hyperlink"/>
+                <w:rStyle w:val="Lienhypertexte"/>
               </w:rPr>
               <w:t xml:space="preserve"> Testing</w:t>
             </w:r>
@@ -2515,7 +2397,7 @@
               <w:fldChar w:fldCharType="begin"/>
               <w:instrText xml:space="preserve"> PAGEREF _Toc232780183 \h </w:instrText>
               <w:fldChar w:fldCharType="separate"/>
-              <w:t>12</w:t>
+              <w:t>11</w:t>
               <w:fldChar w:fldCharType="end"/>
             </w:r>
           </w:hyperlink>
@@ -2553,7 +2435,7 @@
     </w:p>
     <w:p>
       <w:pPr>
-        <w:pStyle w:val="Heading1"/>
+        <w:pStyle w:val="Titre1"/>
         <w:ind w:left="716"/>
       </w:pPr>
       <w:bookmarkStart w:id="0" w:name="_Toc479838498"/>
@@ -2567,7 +2449,7 @@
     </w:p>
     <w:p>
       <w:pPr>
-        <w:pStyle w:val="Heading2"/>
+        <w:pStyle w:val="Titre2"/>
         <w:ind w:left="860"/>
       </w:pPr>
       <w:bookmarkStart w:id="2" w:name="_Toc479838499"/>
@@ -2591,12 +2473,12 @@
         <w:rPr>
           <w:rFonts w:eastAsia="Times New Roman" w:cs="Arial"/>
         </w:rPr>
-        <w:t xml:space="preserve">This document specifies the SAP (iShift) configuration, customizing and enhancement required to execute the Citibank HRS reclassification interface (IFS_P2P_144): the new iShift program ZPTP_IB_HRS_RECLASS, the inbound ACC_DOCUMENT04 IDoc configuration, the FI settings, the authorizations and the AIF monitoring of the flow. The data exchanged and the field-level mapping are described in the interface specification IFS_P2P_144; the IDoc settings (Typinfo, Partner, Address: message variant HRS, SADR sender HRS) are described in EFS_P2P_087.</w:t>
+        <w:t xml:space="preserve">This document specifies the SAP (iShift) configuration, customizing and enhancement required to execute the Citibank HRS reclassification interface (IFS_P2P_144): the new iShift program ZPTP_IB_HRS_RECLASS, the inbound ACC_DOCUMENT04 IDoc configuration and the AIF monitoring of the flow. The data exchanged and the field-level mapping are described in the interface specification IFS_P2P_144.</w:t>
       </w:r>
     </w:p>
     <w:p>
       <w:pPr>
-        <w:pStyle w:val="Heading2"/>
+        <w:pStyle w:val="Titre2"/>
         <w:ind w:left="860"/>
       </w:pPr>
       <w:bookmarkStart w:id="4" w:name="_Toc232780162"/>
@@ -2615,12 +2497,12 @@
         <w:rPr>
           <w:rFonts w:eastAsia="Times New Roman" w:cs="Arial"/>
         </w:rPr>
-        <w:t xml:space="preserve">This document is intended for the iShift Purchase-to-Pay (P2P) and Finance (FI/CO) functional and configuration teams, the iShift ABAP team, the TIBCO integration team, and the Basis/Integration team responsible for connectivity.</w:t>
+        <w:t>This document is intended for the iShift Purchase-to-Pay (P2P) and Finance (FI/CO) functional and configuration teams, the iShift ABAP team, the TIBCO integration team, and the Basis/Integration team responsible for connectivity.</w:t>
       </w:r>
     </w:p>
     <w:p>
       <w:pPr>
-        <w:pStyle w:val="Heading2"/>
+        <w:pStyle w:val="Titre2"/>
         <w:ind w:left="860"/>
       </w:pPr>
       <w:bookmarkStart w:id="5" w:name="_Toc232780163"/>
@@ -2755,7 +2637,7 @@
                 <w:rFonts w:cs="Arial"/>
                 <w:szCs w:val="20"/>
               </w:rPr>
-              <w:t xml:space="preserve">iShift</w:t>
+              <w:t>iShift</w:t>
             </w:r>
           </w:p>
         </w:tc>
@@ -2783,7 +2665,7 @@
                 <w:rFonts w:cs="Arial"/>
                 <w:szCs w:val="20"/>
               </w:rPr>
-              <w:t xml:space="preserve">Target SAP system (S/4HANA) in which the reclassification documents are posted.</w:t>
+              <w:t>Target SAP system (S/4HANA) in which the reclassification documents are posted.</w:t>
             </w:r>
           </w:p>
         </w:tc>
@@ -2823,7 +2705,7 @@
                 <w:rFonts w:cs="Arial"/>
                 <w:szCs w:val="20"/>
               </w:rPr>
-              <w:t xml:space="preserve">GTW</w:t>
+              <w:t>GTW</w:t>
             </w:r>
           </w:p>
         </w:tc>
@@ -2855,7 +2737,7 @@
                 <w:rFonts w:cs="Arial"/>
                 <w:szCs w:val="20"/>
               </w:rPr>
-              <w:t xml:space="preserve">Gateway component receiving the Citibank CDF3 statement file.</w:t>
+              <w:t>Gateway component receiving the Citibank CDF3 statement file.</w:t>
             </w:r>
           </w:p>
         </w:tc>
@@ -2895,7 +2777,7 @@
                 <w:rFonts w:cs="Arial"/>
                 <w:szCs w:val="20"/>
               </w:rPr>
-              <w:t xml:space="preserve">TIBCO</w:t>
+              <w:t>TIBCO</w:t>
             </w:r>
           </w:p>
         </w:tc>
@@ -2927,7 +2809,7 @@
                 <w:rFonts w:cs="Arial"/>
                 <w:szCs w:val="20"/>
               </w:rPr>
-              <w:t xml:space="preserve">Middleware transforming the CDF3 XML into the ACC_DOCUMENT04 IDoc-XML.</w:t>
+              <w:t xml:space="preserve">Middleware transforming the CDF3 XML into the ACC_DOCUMENT04 IDoc-XML, after retrieving the G/L account to debit in ZUT_T_CAT02.</w:t>
             </w:r>
           </w:p>
         </w:tc>
@@ -2967,7 +2849,7 @@
                 <w:rFonts w:cs="Arial"/>
                 <w:szCs w:val="20"/>
               </w:rPr>
-              <w:t xml:space="preserve">ACC_DOCUMENT04</w:t>
+              <w:t>ACC_DOCUMENT04</w:t>
             </w:r>
           </w:p>
         </w:tc>
@@ -2999,7 +2881,7 @@
                 <w:rFonts w:cs="Arial"/>
                 <w:szCs w:val="20"/>
               </w:rPr>
-              <w:t xml:space="preserve">Standard SAP IDoc basic type used for the GL reclassification posting (IFS_P2P_144, written ACCDOCUMENT04 in the IFS), message type ACC_DOCUMENT. Processed by the new program ZPTP_IB_HRS_RECLASS.</w:t>
+              <w:t>Standard SAP IDoc basic type used for the GL reclassification posting (IFS_P2P_144, written ACCDOCUMENT04 in the IFS), message type ACC_DOCUMENT. Processed by the new program ZPTP_IB_HRS_RECLASS.</w:t>
             </w:r>
           </w:p>
         </w:tc>
@@ -3039,7 +2921,7 @@
                 <w:rFonts w:cs="Arial"/>
                 <w:szCs w:val="20"/>
               </w:rPr>
-              <w:t xml:space="preserve">ZUT_T_CAT02</w:t>
+              <w:t>ZUT_T_CAT02</w:t>
             </w:r>
           </w:p>
         </w:tc>
@@ -3071,7 +2953,7 @@
                 <w:rFonts w:cs="Arial"/>
                 <w:szCs w:val="20"/>
               </w:rPr>
-              <w:t xml:space="preserve">iShift custom table: G/L account lookup by company code and Product Code (equivalent of ZHRSCITI_GLMAP on P08).</w:t>
+              <w:t xml:space="preserve">iShift custom table: G/L account lookup by company code and Product Code (equivalent of ZHRSCITI_GLMAP on P08), read by TIBCO to retrieve the G/L account to debit.</w:t>
             </w:r>
           </w:p>
         </w:tc>
@@ -3111,7 +2993,7 @@
                 <w:rFonts w:cs="Arial"/>
                 <w:szCs w:val="20"/>
               </w:rPr>
-              <w:t xml:space="preserve">AIF</w:t>
+              <w:t>AIF</w:t>
             </w:r>
           </w:p>
         </w:tc>
@@ -3143,7 +3025,7 @@
                 <w:rFonts w:cs="Arial"/>
                 <w:szCs w:val="20"/>
               </w:rPr>
-              <w:t xml:space="preserve">Application Interface Framework – SAP tool used on iShift to monitor and reprocess errors for outbound and inbound interfaces.</w:t>
+              <w:t>Application Interface Framework – SAP tool used on iShift to monitor and reprocess errors for outbound and inbound interfaces.</w:t>
             </w:r>
           </w:p>
         </w:tc>
@@ -3183,7 +3065,7 @@
                 <w:rFonts w:cs="Arial"/>
                 <w:szCs w:val="20"/>
               </w:rPr>
-              <w:t xml:space="preserve">Product Code</w:t>
+              <w:t>Product Code</w:t>
             </w:r>
           </w:p>
         </w:tc>
@@ -3215,7 +3097,7 @@
                 <w:rFonts w:cs="Arial"/>
                 <w:szCs w:val="20"/>
               </w:rPr>
-              <w:t xml:space="preserve">Code of the CDF3 line item (for example L-1101). It gives the G/L account to debit in the reclassification.</w:t>
+              <w:t>Code of the CDF3 line item (for example L-1101). It gives the G/L account to debit in the reclassification.</w:t>
             </w:r>
           </w:p>
         </w:tc>
@@ -3255,7 +3137,7 @@
                 <w:rFonts w:cs="Arial"/>
                 <w:szCs w:val="20"/>
               </w:rPr>
-              <w:t xml:space="preserve">PO / GR</w:t>
+              <w:t>PO / GR</w:t>
             </w:r>
           </w:p>
         </w:tc>
@@ -3287,7 +3169,7 @@
                 <w:rFonts w:cs="Arial"/>
                 <w:szCs w:val="20"/>
               </w:rPr>
-              <w:t xml:space="preserve">Purchase order / goods receipt. The goods receipt posts the cost on the P&amp;L account of the PO.</w:t>
+              <w:t>Purchase order / goods receipt. The goods receipt posts the cost on the P&amp;L account of the PO.</w:t>
             </w:r>
           </w:p>
         </w:tc>
@@ -3327,7 +3209,7 @@
                 <w:rFonts w:cs="Arial"/>
                 <w:szCs w:val="20"/>
               </w:rPr>
-              <w:t xml:space="preserve">BAPI_PO_GETDETAIL</w:t>
+              <w:t>BAPI_PO_GETDETAIL</w:t>
             </w:r>
           </w:p>
         </w:tc>
@@ -3359,7 +3241,7 @@
                 <w:rFonts w:cs="Arial"/>
                 <w:szCs w:val="20"/>
               </w:rPr>
-              <w:t xml:space="preserve">Standard BAPI that returns the data of a PO, including the account assignment (G/L account, cost center).</w:t>
+              <w:t>Standard BAPI that returns the data of a PO, including the account assignment (G/L account, cost center).</w:t>
             </w:r>
           </w:p>
         </w:tc>
@@ -3394,13 +3276,6 @@
                 <w:szCs w:val="22"/>
               </w:rPr>
             </w:pPr>
-            <w:r>
-              <w:rPr>
-                <w:rFonts w:cs="Arial"/>
-                <w:szCs w:val="20"/>
-              </w:rPr>
-              <w:t xml:space="preserve">BAPI_ACC_DOCUMENT_POST</w:t>
-            </w:r>
           </w:p>
         </w:tc>
         <w:tc>
@@ -3426,13 +3301,6 @@
                 <w:szCs w:val="22"/>
               </w:rPr>
             </w:pPr>
-            <w:r>
-              <w:rPr>
-                <w:rFonts w:cs="Arial"/>
-                <w:szCs w:val="20"/>
-              </w:rPr>
-              <w:t xml:space="preserve">Standard BAPI used to post the reclassification document in FI.</w:t>
-            </w:r>
           </w:p>
         </w:tc>
       </w:tr>
@@ -3441,17 +3309,17 @@
     <w:p/>
     <w:p>
       <w:pPr>
-        <w:pStyle w:val="Heading1"/>
+        <w:pStyle w:val="Titre1"/>
       </w:pPr>
       <w:bookmarkStart w:id="6" w:name="_Toc232780164"/>
       <w:r>
-        <w:t xml:space="preserve">Functional specifications</w:t>
+        <w:t>Functional specifications</w:t>
       </w:r>
       <w:bookmarkEnd w:id="6"/>
     </w:p>
     <w:p>
       <w:pPr>
-        <w:pStyle w:val="Heading2"/>
+        <w:pStyle w:val="Titre2"/>
         <w:ind w:left="860"/>
       </w:pPr>
       <w:bookmarkStart w:id="7" w:name="_Toc479612403"/>
@@ -3472,7 +3340,7 @@
         <w:rPr>
           <w:rFonts w:eastAsia="Times New Roman" w:cs="Arial"/>
         </w:rPr>
-        <w:t xml:space="preserve">This document covers the SAP configuration and enhancement needed in iShift to execute the Citibank HRS reclassification (IFS_P2P_144): GL reclassification of the Citibank statement, where the G/L account of the Product Code is debited and the P&amp;L account of the PO is credited. The posting is direct (no SAP VIM) and is done by the new iShift program ZPTP_IB_HRS_RECLASS.</w:t>
+        <w:t>This document covers the SAP configuration and enhancement needed in iShift to execute the Citibank HRS reclassification (IFS_P2P_144): GL reclassification of the Citibank statement, where the G/L account of the Product Code is debited and the P&amp;L account of the PO is credited. The posting is direct (no SAP VIM).</w:t>
       </w:r>
     </w:p>
     <w:p>
@@ -3484,24 +3352,12 @@
         <w:rPr>
           <w:rFonts w:eastAsia="Times New Roman" w:cs="Arial"/>
         </w:rPr>
-        <w:t xml:space="preserve">This document lists all the changes to be done in iShift for the reclassification: new program, inbound IDoc configuration, FI settings, authorizations and AIF interface.</w:t>
+        <w:t xml:space="preserve">This document lists all the changes to be done in iShift for the reclassification: new program, inbound IDoc configuration and AIF interface. TIBCO retrieves the G/L account to debit in ZUT_T_CAT02 and builds the IDoc; iShift completes the missing fields (G/L account to credit, cost center) from the PO of the IDoc with BAPI_PO_GETDETAIL. The amounts to debit and to credit are those of the Citibank file.</w:t>
       </w:r>
     </w:p>
     <w:p>
       <w:pPr>
-        <w:spacing w:after="120" w:line="240" w:lineRule="auto"/>
-        <w:jc w:val="both"/>
-      </w:pPr>
-      <w:r>
-        <w:rPr>
-          <w:rFonts w:eastAsia="Times New Roman" w:cs="Arial"/>
-        </w:rPr>
-        <w:t xml:space="preserve">Out of scope: the content and the field-level mapping of the IDoc (IFS_P2P_144), the posting of the incoming HRS invoices (IFS_P2P_143) and the attachment of the HRS PDF invoice (IFS_P2P_145).</w:t>
-      </w:r>
-    </w:p>
-    <w:p>
-      <w:pPr>
-        <w:pStyle w:val="Heading2"/>
+        <w:pStyle w:val="Titre2"/>
         <w:ind w:left="860"/>
       </w:pPr>
       <w:bookmarkStart w:id="9" w:name="_Toc232780166"/>
@@ -3522,7 +3378,7 @@
         </w:rPr>
         <w:t>-</w:t>
         <w:tab/>
-        <w:t xml:space="preserve">AIF is already active on iShift and used to monitor other inbound Citibank interfaces.</w:t>
+        <w:t>AIF is already active on iShift and used to monitor other inbound Citibank interfaces.</w:t>
       </w:r>
     </w:p>
     <w:p>
@@ -3537,7 +3393,7 @@
         </w:rPr>
         <w:t>-</w:t>
         <w:tab/>
-        <w:t xml:space="preserve">The purchase orders referenced by the Citibank statement already exist in iShift (created via eBuy/Coupa).</w:t>
+        <w:t>The purchase orders referenced by the Citibank statement already exist in iShift (created via eBuy/Coupa).</w:t>
       </w:r>
     </w:p>
     <w:p>
@@ -3552,7 +3408,7 @@
         </w:rPr>
         <w:t>-</w:t>
         <w:tab/>
-        <w:t xml:space="preserve">The goods receipts are posted, so that each PO line item has a P&amp;L G/L account and a cost center in its account assignment.</w:t>
+        <w:t>The goods receipts are posted, so that each PO line item has a P&amp;L G/L account and a cost center in its account assignment.</w:t>
       </w:r>
     </w:p>
     <w:p>
@@ -3567,12 +3423,12 @@
         </w:rPr>
         <w:t>-</w:t>
         <w:tab/>
-        <w:t xml:space="preserve">The ZUT_T_CAT02 table is maintained with the G/L accounts to debit (one entry per Product Code and company code).</w:t>
+        <w:t xml:space="preserve">The ZUT_T_CAT02 table is maintained with the G/L accounts to debit (one entry per Product Code and company code); it is read by TIBCO.</w:t>
       </w:r>
     </w:p>
     <w:p>
       <w:pPr>
-        <w:pStyle w:val="Heading2"/>
+        <w:pStyle w:val="Titre2"/>
         <w:ind w:left="860"/>
       </w:pPr>
       <w:bookmarkStart w:id="10" w:name="_Toc479612404"/>
@@ -3596,7 +3452,7 @@
         </w:rPr>
         <w:t>-</w:t>
         <w:tab/>
-        <w:t xml:space="preserve">The connection between TIBCO and iShift is confirmed to use the IDoc basic type ACC_DOCUMENT04, message type ACC_DOCUMENT, message variant HRS and SADR sender HRS (see EFS_P2P_087).</w:t>
+        <w:t>The connection between TIBCO and iShift is confirmed to use the IDoc basic type ACC_DOCUMENT04, message type ACC_DOCUMENT, message variant HRS and SADR sender HRS (see EFS_P2P_087).</w:t>
       </w:r>
     </w:p>
     <w:p>
@@ -3611,7 +3467,7 @@
         </w:rPr>
         <w:t>-</w:t>
         <w:tab/>
-        <w:t xml:space="preserve">This document does not cover the business content or the field mapping of the IDoc, which is addressed by IFS_P2P_144.</w:t>
+        <w:t>This document does not cover the business content or the field mapping of the IDoc, which is addressed by IFS_P2P_144.</w:t>
       </w:r>
     </w:p>
     <w:p>
@@ -3626,7 +3482,7 @@
         </w:rPr>
         <w:t>-</w:t>
         <w:tab/>
-        <w:t xml:space="preserve">Expected volume: driven by the monthly HRS/Citibank statement.</w:t>
+        <w:t>Expected volume: driven by the monthly HRS/Citibank statement.</w:t>
       </w:r>
     </w:p>
     <w:p>
@@ -3639,29 +3495,15 @@
         <w:rPr>
           <w:rFonts w:eastAsia="Times New Roman" w:cs="Arial"/>
         </w:rPr>
+        <w:lastRenderedPageBreak/>
         <w:t>-</w:t>
         <w:tab/>
-        <w:t xml:space="preserve">The debit lines of the ACC_DOCUMENT04 IDoc have no G/L account. The new program ZPTP_IB_HRS_RECLASS finds it in ZUT_T_CAT02 with the Product Code, and finds the credit account and the cost center with BAPI_PO_GETDETAIL.</w:t>
+        <w:t xml:space="preserve">The debit lines of the ACC_DOCUMENT04 IDoc already carry the G/L account to debit, found by TIBCO in ZUT_T_CAT02 with the Product Code. The IDoc is sent to iShift without the cost center and without the G/L account to credit: the new program completes them from the PO of the IDoc with BAPI_PO_GETDETAIL. The amounts to debit and to credit are those of the Citibank file.</w:t>
       </w:r>
     </w:p>
     <w:p>
       <w:pPr>
-        <w:rPr>
-          <w:rFonts w:eastAsia="Times New Roman" w:cs="Arial"/>
-        </w:rPr>
-      </w:pPr>
-      <w:r>
-        <w:rPr>
-          <w:rFonts w:eastAsia="Times New Roman" w:cs="Arial"/>
-        </w:rPr>
-        <w:t>-</w:t>
-        <w:tab/>
-        <w:t xml:space="preserve">The distribution of the credit over several account assignment lines of a PO line item is not part of this version (TBC).</w:t>
-      </w:r>
-    </w:p>
-    <w:p>
-      <w:pPr>
-        <w:pStyle w:val="Heading2"/>
+        <w:pStyle w:val="Titre2"/>
         <w:ind w:left="860"/>
       </w:pPr>
       <w:bookmarkStart w:id="12" w:name="_Toc479612405"/>
@@ -3678,8 +3520,12 @@
     <w:p/>
     <w:p>
       <w:pPr>
+        <w:pStyle w:val="Paragraphedeliste"/>
+        <w:numPr>
+          <w:ilvl w:val="0"/>
+          <w:numId w:val="21"/>
+        </w:numPr>
         <w:spacing w:after="0" w:line="240" w:lineRule="auto"/>
-        <w:jc w:val="both"/>
         <w:rPr>
           <w:rFonts w:eastAsia="Times New Roman" w:cs="Arial"/>
           <w:color w:val="000000"/>
@@ -3690,15 +3536,17 @@
           <w:rFonts w:eastAsia="Times New Roman" w:cs="Arial"/>
           <w:color w:val="000000"/>
         </w:rPr>
-        <w:t>-</w:t>
-        <w:tab/>
-        <w:t xml:space="preserve">1. TIBCO transforms the Citibank CDF3 statement file received in GTW into an ACC_DOCUMENT04 IDoc-XML (message type ACC_DOCUMENT, message variant HRS, SADR sender HRS) and sends it to iShift.</w:t>
+        <w:t xml:space="preserve">TIBCO receives the Citibank CDF3 statement file from GTW.</w:t>
       </w:r>
     </w:p>
     <w:p>
       <w:pPr>
+        <w:pStyle w:val="Paragraphedeliste"/>
+        <w:numPr>
+          <w:ilvl w:val="0"/>
+          <w:numId w:val="21"/>
+        </w:numPr>
         <w:spacing w:after="0" w:line="240" w:lineRule="auto"/>
-        <w:jc w:val="both"/>
         <w:rPr>
           <w:rFonts w:eastAsia="Times New Roman" w:cs="Arial"/>
           <w:color w:val="000000"/>
@@ -3709,15 +3557,17 @@
           <w:rFonts w:eastAsia="Times New Roman" w:cs="Arial"/>
           <w:color w:val="000000"/>
         </w:rPr>
-        <w:t>-</w:t>
-        <w:tab/>
-        <w:t xml:space="preserve">2. iShift receives the IDoc through the inbound partner profile; the process code linked to the program ZPTP_IB_HRS_RECLASS is triggered (immediately or by background job, TBC).</w:t>
+        <w:t xml:space="preserve">TIBCO retrieves, for each line, the G/L account to debit in ZUT_T_CAT02 from the company code and the Product Code (access to the table from TIBCO: TBC).</w:t>
       </w:r>
     </w:p>
     <w:p>
       <w:pPr>
+        <w:pStyle w:val="Paragraphedeliste"/>
+        <w:numPr>
+          <w:ilvl w:val="0"/>
+          <w:numId w:val="21"/>
+        </w:numPr>
         <w:spacing w:after="0" w:line="240" w:lineRule="auto"/>
-        <w:jc w:val="both"/>
         <w:rPr>
           <w:rFonts w:eastAsia="Times New Roman" w:cs="Arial"/>
           <w:color w:val="000000"/>
@@ -3728,15 +3578,17 @@
           <w:rFonts w:eastAsia="Times New Roman" w:cs="Arial"/>
           <w:color w:val="000000"/>
         </w:rPr>
-        <w:t>-</w:t>
-        <w:tab/>
-        <w:t xml:space="preserve">3. The program reads the header, G/L lines and amounts of the IDoc, and finds the G/L account to debit in ZUT_T_CAT02 from the company code and the Product Code.</w:t>
+        <w:t xml:space="preserve">TIBCO builds the ACC_DOCUMENT04 IDoc-XML (message type ACC_DOCUMENT, message variant HRS, SADR sender HRS) with the G/L account to debit, the amounts to debit and to credit of the Citibank file and the PO number / PO line item of each line, checks that it is balanced and sends it to iShift.</w:t>
       </w:r>
     </w:p>
     <w:p>
       <w:pPr>
+        <w:pStyle w:val="Paragraphedeliste"/>
+        <w:numPr>
+          <w:ilvl w:val="0"/>
+          <w:numId w:val="21"/>
+        </w:numPr>
         <w:spacing w:after="0" w:line="240" w:lineRule="auto"/>
-        <w:jc w:val="both"/>
         <w:rPr>
           <w:rFonts w:eastAsia="Times New Roman" w:cs="Arial"/>
           <w:color w:val="000000"/>
@@ -3747,15 +3599,17 @@
           <w:rFonts w:eastAsia="Times New Roman" w:cs="Arial"/>
           <w:color w:val="000000"/>
         </w:rPr>
-        <w:t>-</w:t>
-        <w:tab/>
-        <w:t xml:space="preserve">4. The program groups the lines by PO number and PO line item and calls BAPI_PO_GETDETAIL to find the P&amp;L account to credit and the cost center.</w:t>
+        <w:t xml:space="preserve">iShift receives the IDoc through the inbound partner profile; the program ZPTP_IB_HRS_RECLASS processes it.</w:t>
       </w:r>
     </w:p>
     <w:p>
       <w:pPr>
+        <w:pStyle w:val="Paragraphedeliste"/>
+        <w:numPr>
+          <w:ilvl w:val="0"/>
+          <w:numId w:val="21"/>
+        </w:numPr>
         <w:spacing w:after="0" w:line="240" w:lineRule="auto"/>
-        <w:jc w:val="both"/>
         <w:rPr>
           <w:rFonts w:eastAsia="Times New Roman" w:cs="Arial"/>
           <w:color w:val="000000"/>
@@ -3766,15 +3620,17 @@
           <w:rFonts w:eastAsia="Times New Roman" w:cs="Arial"/>
           <w:color w:val="000000"/>
         </w:rPr>
-        <w:t>-</w:t>
-        <w:tab/>
-        <w:t xml:space="preserve">5. The program builds the document, checks that it is balanced and posts it with BAPI_ACC_DOCUMENT_POST; the IDoc gets status 53 (posted).</w:t>
+        <w:t xml:space="preserve">The program completes the missing fields of the IDoc based on the PO of the IDoc: it calls BAPI_PO_GETDETAIL to find the G/L account to credit and the cost center.</w:t>
       </w:r>
     </w:p>
     <w:p>
       <w:pPr>
+        <w:pStyle w:val="Paragraphedeliste"/>
+        <w:numPr>
+          <w:ilvl w:val="0"/>
+          <w:numId w:val="21"/>
+        </w:numPr>
         <w:spacing w:after="0" w:line="240" w:lineRule="auto"/>
-        <w:jc w:val="both"/>
         <w:rPr>
           <w:rFonts w:eastAsia="Times New Roman" w:cs="Arial"/>
           <w:color w:val="000000"/>
@@ -3785,21 +3641,18 @@
           <w:rFonts w:eastAsia="Times New Roman" w:cs="Arial"/>
           <w:color w:val="000000"/>
         </w:rPr>
-        <w:t>-</w:t>
-        <w:tab/>
-        <w:t xml:space="preserve">6. If a control or the posting fails, nothing is posted, the IDoc gets status 51 and the error is shown in AIF; the IDoc is reprocessed from AIF after correction.</w:t>
+        <w:t xml:space="preserve">The program posts the document with BAPI_ACC_DOCUMENT_POST; the amounts to debit and to credit are those of the Citibank file and the IDoc gets status 53. If a control or the posting fails, nothing is posted, the IDoc gets status 51 and the error is shown in AIF; the IDoc is reprocessed from AIF after correction.</w:t>
       </w:r>
     </w:p>
     <w:p/>
     <w:p/>
     <w:p>
       <w:pPr>
-        <w:pStyle w:val="Heading2"/>
+        <w:pStyle w:val="Titre2"/>
         <w:ind w:left="860"/>
       </w:pPr>
       <w:bookmarkStart w:id="14" w:name="_Toc232780169"/>
       <w:r>
-        <w:lastRenderedPageBreak/>
         <w:t>Detailed Functional Description</w:t>
       </w:r>
       <w:bookmarkEnd w:id="14"/>
@@ -3813,7 +3666,7 @@
         <w:rPr>
           <w:rFonts w:eastAsia="Times New Roman" w:cs="Arial"/>
         </w:rPr>
-        <w:t xml:space="preserve">The table below lists the configuration objects to be set up in iShift for the reclassification. The functional content of the IDoc (fields, mapping) is specified in IFS_P2P_144.</w:t>
+        <w:t>The table below lists the configuration objects to be set up in iShift for the reclassification. The functional content of the IDoc (fields, mapping) is specified in IFS_P2P_144.</w:t>
       </w:r>
     </w:p>
     <w:p>
@@ -3827,12 +3680,12 @@
           <w:b/>
           <w:bCs/>
         </w:rPr>
-        <w:t xml:space="preserve">Configuration objects to be set up:</w:t>
+        <w:t>Configuration objects to be set up:</w:t>
       </w:r>
     </w:p>
     <w:tbl>
       <w:tblPr>
-        <w:tblStyle w:val="TableGrid"/>
+        <w:tblStyle w:val="Grilledutableau"/>
         <w:tblW w:w="9360" w:type="dxa"/>
         <w:tblBorders>
           <w:top w:val="single" w:sz="4" w:space="0" w:color="BFBFBF"/>
@@ -3882,7 +3735,7 @@
                 <w:sz w:val="20"/>
                 <w:szCs w:val="20"/>
               </w:rPr>
-              <w:t xml:space="preserve">Configuration object</w:t>
+              <w:t>Configuration object</w:t>
             </w:r>
           </w:p>
         </w:tc>
@@ -3913,7 +3766,7 @@
                 <w:sz w:val="20"/>
                 <w:szCs w:val="20"/>
               </w:rPr>
-              <w:t xml:space="preserve">Purpose</w:t>
+              <w:t>Purpose</w:t>
             </w:r>
           </w:p>
         </w:tc>
@@ -3944,7 +3797,7 @@
                 <w:sz w:val="20"/>
                 <w:szCs w:val="20"/>
               </w:rPr>
-              <w:t xml:space="preserve">Mandatory</w:t>
+              <w:t>Mandatory</w:t>
             </w:r>
           </w:p>
         </w:tc>
@@ -3977,7 +3830,7 @@
                 <w:sz w:val="20"/>
                 <w:szCs w:val="20"/>
               </w:rPr>
-              <w:t xml:space="preserve">ZUT_T_CAT02 – G/L lookup</w:t>
+              <w:t>ZUT_T_CAT02 – G/L lookup</w:t>
             </w:r>
           </w:p>
         </w:tc>
@@ -4005,7 +3858,7 @@
                 <w:sz w:val="20"/>
                 <w:szCs w:val="20"/>
               </w:rPr>
-              <w:t xml:space="preserve">Resolves the G/L account (HKONT) to debit from the company code and the Product Code. One entry per Product Code and company code.</w:t>
+              <w:t xml:space="preserve">Read by TIBCO to retrieve the G/L account (HKONT) to debit from the company code and the Product Code. One entry per Product Code and company code.</w:t>
             </w:r>
           </w:p>
         </w:tc>
@@ -4033,7 +3886,7 @@
                 <w:sz w:val="20"/>
                 <w:szCs w:val="20"/>
               </w:rPr>
-              <w:t xml:space="preserve">Yes</w:t>
+              <w:t>Yes</w:t>
             </w:r>
           </w:p>
         </w:tc>
@@ -4066,7 +3919,7 @@
                 <w:sz w:val="20"/>
                 <w:szCs w:val="20"/>
               </w:rPr>
-              <w:t xml:space="preserve">ALE/IDoc inbound configuration (ACC_DOCUMENT04)</w:t>
+              <w:t>ALE/IDoc inbound configuration (ACC_DOCUMENT04)</w:t>
             </w:r>
           </w:p>
         </w:tc>
@@ -4094,7 +3947,7 @@
                 <w:sz w:val="20"/>
                 <w:szCs w:val="20"/>
               </w:rPr>
-              <w:t xml:space="preserve">Receives the IDoc generated by TIBCO: message type ACC_DOCUMENT, message variant HRS, SADR sender HRS (Typinfo, Partner, Address as described in EFS_P2P_087), process code linked to ZPTP_IB_HRS_RECLASS, inbound partner profile.</w:t>
+              <w:t xml:space="preserve">Receives the IDoc generated by TIBCO: message type ACC_DOCUMENT, message variant HRS, SADR sender HRS (Typinfo, Partner, Address as described in EFS_P2P_087), inbound partner profile.</w:t>
             </w:r>
           </w:p>
         </w:tc>
@@ -4122,7 +3975,7 @@
                 <w:sz w:val="20"/>
                 <w:szCs w:val="20"/>
               </w:rPr>
-              <w:t xml:space="preserve">Yes</w:t>
+              <w:t>Yes</w:t>
             </w:r>
           </w:p>
         </w:tc>
@@ -4155,7 +4008,7 @@
                 <w:sz w:val="20"/>
                 <w:szCs w:val="20"/>
               </w:rPr>
-              <w:t xml:space="preserve">AIF namespace/interface + bridge enhancement</w:t>
+              <w:t>AIF namespace/interface + bridge enhancement</w:t>
             </w:r>
           </w:p>
         </w:tc>
@@ -4183,7 +4036,7 @@
                 <w:sz w:val="20"/>
                 <w:szCs w:val="20"/>
               </w:rPr>
-              <w:t xml:space="preserve">Captures the IDoc/processing errors of the reclassification in its own AIF interface (ACC_DOCUMENT04).</w:t>
+              <w:t>Captures the IDoc/processing errors of the reclassification in its own AIF interface (ACC_DOCUMENT04).</w:t>
             </w:r>
           </w:p>
         </w:tc>
@@ -4211,7 +4064,7 @@
                 <w:sz w:val="20"/>
                 <w:szCs w:val="20"/>
               </w:rPr>
-              <w:t xml:space="preserve">Yes</w:t>
+              <w:t>Yes</w:t>
             </w:r>
           </w:p>
         </w:tc>
@@ -4244,7 +4097,7 @@
                 <w:sz w:val="20"/>
                 <w:szCs w:val="20"/>
               </w:rPr>
-              <w:t xml:space="preserve">Currency code conversion rule (ISO 4217 numeric to SAP code)</w:t>
+              <w:t>Currency code conversion rule (ISO 4217 numeric to SAP code)</w:t>
             </w:r>
           </w:p>
         </w:tc>
@@ -4272,7 +4125,7 @@
                 <w:sz w:val="20"/>
                 <w:szCs w:val="20"/>
               </w:rPr>
-              <w:t xml:space="preserve">Converts the numeric currency code sent by Citibank (e.g. 978) into the SAP currency (EUR) for ACC_DOCUMENT04. Either an EDI conversion rule in iShift, as on P08, or done in TIBCO.</w:t>
+              <w:t>Converts the numeric currency code sent by Citibank (e.g. 978) into the SAP currency (EUR) for ACC_DOCUMENT04. Either an EDI conversion rule in iShift, as on P08, or done in TIBCO.</w:t>
             </w:r>
           </w:p>
         </w:tc>
@@ -4300,7 +4153,7 @@
                 <w:sz w:val="20"/>
                 <w:szCs w:val="20"/>
               </w:rPr>
-              <w:t xml:space="preserve">TBC</w:t>
+              <w:t>TBC</w:t>
             </w:r>
           </w:p>
         </w:tc>
@@ -4333,7 +4186,8 @@
                 <w:sz w:val="20"/>
                 <w:szCs w:val="20"/>
               </w:rPr>
-              <w:t xml:space="preserve">New program ZPTP_IB_HRS_RECLASS (ABAP)</w:t>
+              <w:lastRenderedPageBreak/>
+              <w:t>New program ZPTP_IB_HRS_RECLASS (ABAP)</w:t>
             </w:r>
           </w:p>
         </w:tc>
@@ -4361,7 +4215,7 @@
                 <w:sz w:val="20"/>
                 <w:szCs w:val="20"/>
               </w:rPr>
-              <w:t xml:space="preserve">Inbound processing of the ACC_DOCUMENT04 IDoc: G/L account lookup in ZUT_T_CAT02, PO data with BAPI_PO_GETDETAIL, posting with BAPI_ACC_DOCUMENT_POST.</w:t>
+              <w:t xml:space="preserve">Inbound processing of the ACC_DOCUMENT04 IDoc: completion of the missing fields (G/L account to credit, cost center) from the PO of the IDoc with BAPI_PO_GETDETAIL, posting with BAPI_ACC_DOCUMENT_POST.</w:t>
             </w:r>
           </w:p>
         </w:tc>
@@ -4389,7 +4243,7 @@
                 <w:sz w:val="20"/>
                 <w:szCs w:val="20"/>
               </w:rPr>
-              <w:t xml:space="preserve">Yes</w:t>
+              <w:t>Yes</w:t>
             </w:r>
           </w:p>
         </w:tc>
@@ -4422,7 +4276,7 @@
                 <w:sz w:val="20"/>
                 <w:szCs w:val="20"/>
               </w:rPr>
-              <w:t xml:space="preserve">FI settings for the reclassification document</w:t>
+              <w:t>FI settings for the reclassification document</w:t>
             </w:r>
           </w:p>
         </w:tc>
@@ -4450,7 +4304,7 @@
                 <w:sz w:val="20"/>
                 <w:szCs w:val="20"/>
               </w:rPr>
-              <w:t xml:space="preserve">FI document type, field status of the G/L accounts (cost center, assignment), cost elements of the debit and credit accounts.</w:t>
+              <w:t>FI document type, field status of the G/L accounts (cost center, assignment), cost elements of the debit and credit accounts.</w:t>
             </w:r>
           </w:p>
         </w:tc>
@@ -4478,7 +4332,7 @@
                 <w:sz w:val="20"/>
                 <w:szCs w:val="20"/>
               </w:rPr>
-              <w:t xml:space="preserve">Yes</w:t>
+              <w:t>Yes</w:t>
             </w:r>
           </w:p>
         </w:tc>
@@ -4487,7 +4341,7 @@
     <w:p/>
     <w:p>
       <w:pPr>
-        <w:pStyle w:val="Heading3"/>
+        <w:pStyle w:val="Titre3"/>
         <w:rPr>
           <w:b/>
           <w:bCs/>
@@ -4519,23 +4373,23 @@
         <w:rPr>
           <w:rFonts w:eastAsia="Times New Roman" w:cs="Arial"/>
         </w:rPr>
-        <w:t xml:space="preserve">ZUT_T_CAT02 (G/L lookup, equivalent of ZHRSCITI_GLMAP on P08) and the new program ZPTP_IB_HRS_RECLASS (name proposed, to be confirmed). No other custom table is required for the reclassification.</w:t>
+        <w:t xml:space="preserve">ZUT_T_CAT02 (G/L lookup read by TIBCO, equivalent of ZHRSCITI_GLMAP on P08) and the new program ZPTP_IB_HRS_RECLASS (name proposed, to be confirmed).</w:t>
       </w:r>
     </w:p>
     <w:p/>
     <w:p>
       <w:pPr>
-        <w:pStyle w:val="Heading1"/>
+        <w:pStyle w:val="Titre1"/>
       </w:pPr>
       <w:bookmarkStart w:id="16" w:name="_Toc232780171"/>
       <w:r>
-        <w:t xml:space="preserve">Extension Detailed Specification</w:t>
+        <w:t>Extension Detailed Specification</w:t>
       </w:r>
       <w:bookmarkEnd w:id="16"/>
     </w:p>
     <w:p>
       <w:pPr>
-        <w:pStyle w:val="Heading2"/>
+        <w:pStyle w:val="Titre2"/>
         <w:ind w:left="860"/>
       </w:pPr>
       <w:bookmarkStart w:id="17" w:name="_Toc232780172"/>
@@ -4546,7 +4400,7 @@
     </w:p>
     <w:p>
       <w:pPr>
-        <w:pStyle w:val="ListParagraph"/>
+        <w:pStyle w:val="Paragraphedeliste"/>
         <w:spacing w:after="0" w:line="240" w:lineRule="auto"/>
         <w:rPr>
           <w:rFonts w:eastAsia="Times New Roman" w:cs="Arial"/>
@@ -4648,7 +4502,7 @@
                 <w:rFonts w:eastAsia="Times New Roman" w:cs="Arial"/>
                 <w:color w:val="000000"/>
               </w:rPr>
-              <w:t xml:space="preserve">SAP configuration, new reclassification program ZPTP_IB_HRS_RECLASS and AIF-based error monitoring for the Citibank HRS reclassification (see IFS_P2P_144)</w:t>
+              <w:t>SAP configuration, new reclassification program ZPTP_IB_HRS_RECLASS and AIF-based error monitoring for the Citibank HRS reclassification (see IFS_P2P_144)</w:t>
             </w:r>
           </w:p>
         </w:tc>
@@ -4729,7 +4583,7 @@
                 <w:rFonts w:eastAsia="Times New Roman" w:cs="Arial"/>
                 <w:color w:val="000000"/>
               </w:rPr>
-              <w:t xml:space="preserve">Driven by the monthly HRS/Citibank statement (TBC)</w:t>
+              <w:t>Driven by the monthly HRS/Citibank statement (TBC)</w:t>
             </w:r>
           </w:p>
         </w:tc>
@@ -4774,7 +4628,6 @@
                 <w:szCs w:val="20"/>
                 <w:lang w:val="de-CH"/>
               </w:rPr>
-              <w:lastRenderedPageBreak/>
               <w:t>Mode:</w:t>
             </w:r>
             <w:r>
@@ -4847,13 +4700,6 @@
                 <w:color w:val="000000"/>
               </w:rPr>
               <w:t>(-) Online      (X) Background</w:t>
-            </w:r>
-            <w:r>
-              <w:rPr>
-                <w:rFonts w:eastAsia="Times New Roman" w:cs="Arial"/>
-                <w:color w:val="000000"/>
-              </w:rPr>
-              <w:t>      (-) Background</w:t>
             </w:r>
           </w:p>
         </w:tc>
@@ -5004,12 +4850,12 @@
     <w:p/>
     <w:p>
       <w:pPr>
-        <w:pStyle w:val="Heading2"/>
+        <w:pStyle w:val="Titre2"/>
         <w:ind w:left="860"/>
       </w:pPr>
       <w:bookmarkStart w:id="18" w:name="_Toc232780173"/>
       <w:r>
-        <w:t xml:space="preserve">Business logic &amp; Filtering Conditions</w:t>
+        <w:t>Business logic &amp; Filtering Conditions</w:t>
       </w:r>
       <w:bookmarkEnd w:id="18"/>
     </w:p>
@@ -5023,7 +4869,7 @@
         <w:rPr>
           <w:rFonts w:eastAsia="Times New Roman" w:cs="Arial"/>
         </w:rPr>
-        <w:t xml:space="preserve">Triggering event: reception of the ACC_DOCUMENT04 IDoc generated by TIBCO from the Citibank statement. The AIF bridge monitors these IDocs (processed by ZPTP_IB_HRS_RECLASS). Any IDoc left in an error/exception status is captured and pushed into the dedicated AIF namespace/interface, making it visible and actionable in the AIF error monitor.</w:t>
+        <w:t>Triggering event: reception of the ACC_DOCUMENT04 IDoc generated by TIBCO from the Citibank statement. The AIF bridge monitors these IDocs (processed by ZPTP_IB_HRS_RECLASS). Any IDoc left in an error/exception status is captured and pushed into the dedicated AIF namespace/interface, making it visible and actionable in the AIF error monitor.</w:t>
       </w:r>
     </w:p>
     <w:p>
@@ -5035,12 +4881,12 @@
         <w:rPr>
           <w:rFonts w:eastAsia="Times New Roman" w:cs="Arial"/>
         </w:rPr>
-        <w:t xml:space="preserve">The message type, IDoc type, message variant and sender to be used for the IDoc posting in iShift (EFS_P2P_087) are:</w:t>
+        <w:t>The message type, IDoc type, message variant and sender to be used for the IDoc posting in iShift (EFS_P2P_087) are:</w:t>
       </w:r>
     </w:p>
     <w:p>
       <w:pPr>
-        <w:pStyle w:val="ListParagraph"/>
+        <w:pStyle w:val="Paragraphedeliste"/>
         <w:numPr>
           <w:ilvl w:val="0"/>
           <w:numId w:val="2"/>
@@ -5052,12 +4898,13 @@
         <w:rPr>
           <w:rFonts w:eastAsia="Times New Roman" w:cs="Arial"/>
         </w:rPr>
-        <w:t xml:space="preserve">Name space: PP_IF</w:t>
+        <w:lastRenderedPageBreak/>
+        <w:t>Name space: PP_IF</w:t>
       </w:r>
     </w:p>
     <w:p>
       <w:pPr>
-        <w:pStyle w:val="ListParagraph"/>
+        <w:pStyle w:val="Paragraphedeliste"/>
         <w:numPr>
           <w:ilvl w:val="0"/>
           <w:numId w:val="2"/>
@@ -5069,12 +4916,12 @@
         <w:rPr>
           <w:rFonts w:eastAsia="Times New Roman" w:cs="Arial"/>
         </w:rPr>
-        <w:t xml:space="preserve">Interface name: IB_RCL_PST (proposed, own interface for ACC_DOCUMENT04)</w:t>
+        <w:t>Interface name: IB_RCL_PST (proposed, own interface for ACC_DOCUMENT04)</w:t>
       </w:r>
     </w:p>
     <w:p>
       <w:pPr>
-        <w:pStyle w:val="ListParagraph"/>
+        <w:pStyle w:val="Paragraphedeliste"/>
         <w:numPr>
           <w:ilvl w:val="0"/>
           <w:numId w:val="2"/>
@@ -5086,12 +4933,12 @@
         <w:rPr>
           <w:rFonts w:eastAsia="Times New Roman" w:cs="Arial"/>
         </w:rPr>
-        <w:t xml:space="preserve">IDoc type: ACC_DOCUMENT04</w:t>
+        <w:t>IDoc type: ACC_DOCUMENT04</w:t>
       </w:r>
     </w:p>
     <w:p>
       <w:pPr>
-        <w:pStyle w:val="ListParagraph"/>
+        <w:pStyle w:val="Paragraphedeliste"/>
         <w:numPr>
           <w:ilvl w:val="0"/>
           <w:numId w:val="2"/>
@@ -5103,12 +4950,12 @@
         <w:rPr>
           <w:rFonts w:eastAsia="Times New Roman" w:cs="Arial"/>
         </w:rPr>
-        <w:t xml:space="preserve">Message type: ACC_DOCUMENT</w:t>
+        <w:t>Message type: ACC_DOCUMENT</w:t>
       </w:r>
     </w:p>
     <w:p>
       <w:pPr>
-        <w:pStyle w:val="ListParagraph"/>
+        <w:pStyle w:val="Paragraphedeliste"/>
         <w:numPr>
           <w:ilvl w:val="0"/>
           <w:numId w:val="2"/>
@@ -5120,12 +4967,12 @@
         <w:rPr>
           <w:rFonts w:eastAsia="Times New Roman" w:cs="Arial"/>
         </w:rPr>
-        <w:t xml:space="preserve">Message variant: HRS, so that the process code can be selected for this flow</w:t>
+        <w:t>Message variant: HRS, so that the process code can be selected for this flow</w:t>
       </w:r>
     </w:p>
     <w:p>
       <w:pPr>
-        <w:pStyle w:val="ListParagraph"/>
+        <w:pStyle w:val="Paragraphedeliste"/>
         <w:numPr>
           <w:ilvl w:val="0"/>
           <w:numId w:val="2"/>
@@ -5137,13 +4984,13 @@
         <w:rPr>
           <w:rFonts w:eastAsia="Times New Roman" w:cs="Arial"/>
         </w:rPr>
-        <w:t xml:space="preserve">Sender (SADR): HRS</w:t>
+        <w:t>Sender (SADR): HRS</w:t>
       </w:r>
     </w:p>
     <w:p/>
     <w:tbl>
       <w:tblPr>
-        <w:tblStyle w:val="TableGrid"/>
+        <w:tblStyle w:val="Grilledutableau"/>
         <w:tblW w:w="9360" w:type="dxa"/>
         <w:tblBorders>
           <w:top w:val="single" w:sz="4" w:space="0" w:color="BFBFBF"/>
@@ -5284,7 +5131,7 @@
                 <w:sz w:val="20"/>
                 <w:szCs w:val="20"/>
               </w:rPr>
-              <w:t xml:space="preserve">Monitored message types</w:t>
+              <w:t>Monitored message types</w:t>
             </w:r>
           </w:p>
         </w:tc>
@@ -5306,13 +5153,19 @@
             <w:vAlign w:val="center"/>
           </w:tcPr>
           <w:p>
+            <w:pPr>
+              <w:rPr>
+                <w:lang w:val="fr-FR"/>
+              </w:rPr>
+            </w:pPr>
             <w:r>
               <w:rPr>
                 <w:rFonts w:eastAsia="Times New Roman" w:cs="Arial"/>
                 <w:sz w:val="20"/>
                 <w:szCs w:val="20"/>
-              </w:rPr>
-              <w:t xml:space="preserve">ACC_DOCUMENT04 (message type ACC_DOCUMENT, message variant HRS).</w:t>
+                <w:lang w:val="fr-FR"/>
+              </w:rPr>
+              <w:t>ACC_DOCUMENT04 (message type ACC_DOCUMENT, message variant HRS).</w:t>
             </w:r>
           </w:p>
         </w:tc>
@@ -5340,7 +5193,7 @@
                 <w:sz w:val="20"/>
                 <w:szCs w:val="20"/>
               </w:rPr>
-              <w:t xml:space="preserve">–</w:t>
+              <w:t>–</w:t>
             </w:r>
           </w:p>
         </w:tc>
@@ -5370,7 +5223,7 @@
                 <w:sz w:val="20"/>
                 <w:szCs w:val="20"/>
               </w:rPr>
-              <w:t xml:space="preserve">Monitored status codes</w:t>
+              <w:t>Monitored status codes</w:t>
             </w:r>
           </w:p>
         </w:tc>
@@ -5398,7 +5251,7 @@
                 <w:sz w:val="20"/>
                 <w:szCs w:val="20"/>
               </w:rPr>
-              <w:t xml:space="preserve">Inbound error or exception statuses (e.g. IDoc not posted, G/L lookup failure, PO or PO account not found, posting refused).</w:t>
+              <w:t>Inbound error or exception statuses (e.g. IDoc not posted, PO or PO account not found, posting refused).</w:t>
             </w:r>
           </w:p>
         </w:tc>
@@ -5426,7 +5279,7 @@
                 <w:sz w:val="20"/>
                 <w:szCs w:val="20"/>
               </w:rPr>
-              <w:t xml:space="preserve">–</w:t>
+              <w:t>–</w:t>
             </w:r>
           </w:p>
         </w:tc>
@@ -5456,7 +5309,7 @@
                 <w:sz w:val="20"/>
                 <w:szCs w:val="20"/>
               </w:rPr>
-              <w:t xml:space="preserve">AIF Namespace / Interface</w:t>
+              <w:t>AIF Namespace / Interface</w:t>
             </w:r>
           </w:p>
         </w:tc>
@@ -5484,7 +5337,7 @@
                 <w:sz w:val="20"/>
                 <w:szCs w:val="20"/>
               </w:rPr>
-              <w:t xml:space="preserve">PP_IF / IB_RCL_PST (proposed, to be defined in AIF).</w:t>
+              <w:t>PP_IF / IB_RCL_PST (proposed, to be defined in AIF).</w:t>
             </w:r>
           </w:p>
         </w:tc>
@@ -5512,7 +5365,7 @@
                 <w:sz w:val="20"/>
                 <w:szCs w:val="20"/>
               </w:rPr>
-              <w:t xml:space="preserve">–</w:t>
+              <w:t>–</w:t>
             </w:r>
           </w:p>
         </w:tc>
@@ -5542,7 +5395,7 @@
                 <w:sz w:val="20"/>
                 <w:szCs w:val="20"/>
               </w:rPr>
-              <w:t xml:space="preserve">Monitoring frequency</w:t>
+              <w:t>Monitoring frequency</w:t>
             </w:r>
           </w:p>
         </w:tc>
@@ -5570,7 +5423,7 @@
                 <w:sz w:val="20"/>
                 <w:szCs w:val="20"/>
               </w:rPr>
-              <w:t xml:space="preserve">Via the AIF error monitor.</w:t>
+              <w:t>Via the AIF error monitor.</w:t>
             </w:r>
           </w:p>
         </w:tc>
@@ -5598,7 +5451,7 @@
                 <w:sz w:val="20"/>
                 <w:szCs w:val="20"/>
               </w:rPr>
-              <w:t xml:space="preserve">–</w:t>
+              <w:t>–</w:t>
             </w:r>
           </w:p>
         </w:tc>
@@ -5607,7 +5460,7 @@
     <w:p/>
     <w:p>
       <w:pPr>
-        <w:pStyle w:val="Heading2"/>
+        <w:pStyle w:val="Titre2"/>
         <w:ind w:left="860"/>
       </w:pPr>
       <w:bookmarkStart w:id="19" w:name="_Toc232780174"/>
@@ -5626,7 +5479,7 @@
         <w:rPr>
           <w:rFonts w:eastAsia="Times New Roman" w:cs="Arial"/>
         </w:rPr>
-        <w:t xml:space="preserve">AIF configuration to capture the IDoc processing status and to allow monitoring.</w:t>
+        <w:t>AIF configuration to capture the IDoc processing status and to allow monitoring.</w:t>
       </w:r>
     </w:p>
     <w:p>
@@ -5638,7 +5491,7 @@
         <w:rPr>
           <w:rFonts w:eastAsia="Times New Roman" w:cs="Arial"/>
         </w:rPr>
-        <w:t xml:space="preserve">New program ZPTP_IB_HRS_RECLASS (name proposed) for the reclassification (IFS_P2P_144): inbound processing function of the ACC_DOCUMENT04 IDoc, linked to a new process code (WE42) and assigned to the message type (WE57).</w:t>
+        <w:t>New program ZPTP_IB_HRS_RECLASS (name proposed) for the reclassification (IFS_P2P_144): inbound processing function of the ACC_DOCUMENT04 IDoc.</w:t>
       </w:r>
     </w:p>
     <w:p>
@@ -5650,7 +5503,7 @@
         <w:rPr>
           <w:rFonts w:eastAsia="Times New Roman" w:cs="Arial"/>
         </w:rPr>
-        <w:t xml:space="preserve">The program reads the segments E1BPACHE09 (header), E1BPACGL09 (G/L lines) and E1BPACCR09 (amounts), the Product Codes (REF_KEY_1) and the PO references (PO_NUMBER, PO_ITEM) of the lines, and the G/L account to debit in ZUT_T_CAT02; it groups the lines by PO number and PO line item and calls BAPI_PO_GETDETAIL (PO_ITEM_ACCOUNT_ASSIGNMENT: GL_ACCOUNT, COSTCENTER, WBS_ELEMENT, ORDERID) to find the P&amp;L account to credit and the cost center.</w:t>
+        <w:t xml:space="preserve">The program reads the PO references (PO_NUMBER, PO_ITEM) of the IDoc lines, groups the lines by PO number and PO line item and calls BAPI_PO_GETDETAIL (PO_ITEM_ACCOUNT_ASSIGNMENT: GL_ACCOUNT, COSTCENTER, WBS_ELEMENT, ORDERID) to complete the missing fields: the G/L account to credit and the cost center.</w:t>
       </w:r>
     </w:p>
     <w:p>
@@ -5662,7 +5515,7 @@
         <w:rPr>
           <w:rFonts w:eastAsia="Times New Roman" w:cs="Arial"/>
         </w:rPr>
-        <w:t xml:space="preserve">The program builds the document with debit amounts positive and credit amounts negative (reversed if DebitOrCreditIndicator = C), the amounts of the CDF3 file, the cost center of the PO and ALLOC_NMBR = PO number + PO line item; it checks that the document is balanced, posts it with BAPI_ACC_DOCUMENT_POST and BAPI_TRANSACTION_COMMIT, and sets the IDoc status (53 posted / 51 error).</w:t>
+        <w:t xml:space="preserve">The G/L account to debit and the amounts of the Citibank file (debit amounts positive and credit amounts negative, reversed if DebitOrCreditIndicator = C) are already in the IDoc, built by TIBCO; the program does not change the amounts. It adds the cost center and the G/L account to credit of the PO and ALLOC_NMBR = PO number + PO line item, checks that the document is balanced, posts it with BAPI_ACC_DOCUMENT_POST, and sets the IDoc status (53 posted / 51 error).</w:t>
       </w:r>
     </w:p>
     <w:p>
@@ -5674,7 +5527,7 @@
         <w:rPr>
           <w:rFonts w:eastAsia="Times New Roman" w:cs="Arial"/>
         </w:rPr>
-        <w:t xml:space="preserve">Errors (missing ZUT_T_CAT02 entry, PO not found, no account assignment, posting refused) are returned in the IDoc status record and shown in the AIF interface of the reclassification. The IDoc can be reprocessed after the correction. No selection screen: the program is event driven by the IDoc.</w:t>
+        <w:t xml:space="preserve">Errors in iShift (PO not found, no account assignment, posting refused) are returned in the IDoc status record and shown in the AIF interface of the reclassification. The IDoc can be reprocessed after the correction. No selection screen: the program is event driven by the IDoc.</w:t>
       </w:r>
     </w:p>
     <w:p>
@@ -5686,12 +5539,12 @@
         <w:rPr>
           <w:rFonts w:eastAsia="Times New Roman" w:cs="Arial"/>
         </w:rPr>
-        <w:t xml:space="preserve">Field mapping of the IDoc: see IFS_P2P_144, section 3.3, and the workbook iShift_ACCDOCUMENT04_Mapping_Reclassification.xlsx.</w:t>
+        <w:t>Field mapping of the IDoc: see IFS_P2P_144, section 3.3, and the workbook iShift_ACCDOCUMENT04_Mapping_Reclassification.xlsx.</w:t>
       </w:r>
     </w:p>
     <w:p>
       <w:pPr>
-        <w:pStyle w:val="Heading2"/>
+        <w:pStyle w:val="Titre2"/>
         <w:ind w:left="860"/>
       </w:pPr>
       <w:bookmarkStart w:id="20" w:name="_Toc232780175"/>
@@ -5710,12 +5563,13 @@
         <w:rPr>
           <w:rFonts w:eastAsia="Times New Roman" w:cs="Arial"/>
         </w:rPr>
-        <w:t xml:space="preserve">The ACC_DOCUMENT04 IDocs are posted as G/L reclassification documents in iShift (without SAP VIM). Each reclassification document debits the G/L account of the Product Code and credits the P&amp;L account of the PO for the amount of the CDF3 file, with the cost center of the PO. Any error is visible in AIF, consistent with the monitoring approach already used for other interfaces.</w:t>
+        <w:lastRenderedPageBreak/>
+        <w:t>The ACC_DOCUMENT04 IDocs are posted as G/L reclassification documents in iShift (without SAP VIM). Each reclassification document debits the G/L account of the Product Code (found by TIBCO in ZUT_T_CAT02) and credits the P&amp;L account of the PO (found by the program with BAPI_PO_GETDETAIL) for the amount of the CDF3 file, with the cost center of the PO. Any error is visible in AIF, consistent with the monitoring approach already used for other interfaces.</w:t>
       </w:r>
     </w:p>
     <w:p>
       <w:pPr>
-        <w:pStyle w:val="Heading2"/>
+        <w:pStyle w:val="Titre2"/>
         <w:ind w:left="860"/>
       </w:pPr>
       <w:bookmarkStart w:id="21" w:name="_Toc482860284"/>
@@ -5736,7 +5590,7 @@
         <w:rPr>
           <w:rFonts w:eastAsia="Times New Roman" w:cs="Arial"/>
         </w:rPr>
-        <w:t xml:space="preserve">AIF is already active and used for other outbound and inbound interfaces on iShift; the existing AIF namespace(s)/interface(s) (/AIF/CUST) used for incoming invoices could be reused for the Citibank HRS flow.</w:t>
+        <w:t>AIF is already active and used for other outbound and inbound interfaces on iShift; the existing AIF namespace(s)/interface(s) (/AIF/CUST) used for incoming invoices could be reused for the Citibank HRS flow.</w:t>
       </w:r>
     </w:p>
     <w:p>
@@ -5748,22 +5602,19 @@
         <w:rPr>
           <w:rFonts w:eastAsia="Times New Roman" w:cs="Arial"/>
         </w:rPr>
-        <w:t xml:space="preserve">The standard BAPIs BAPI_PO_GETDETAIL, BAPI_ACC_DOCUMENT_POST and BAPI_TRANSACTION_COMMIT are reused. The standard IDoc type ACC_DOCUMENT04 is used without extension; only the processing program is new. The IDoc settings (Typinfo, Partner, Address) follow EFS_P2P_087.</w:t>
+        <w:t xml:space="preserve">The standard BAPIs BAPI_PO_GETDETAIL and BAPI_ACC_DOCUMENT_POST are reused. The standard IDoc type ACC_DOCUMENT04 is used; only the processing program is new. The IDoc settings (Typinfo, Partner, Address) follow EFS_P2P_087.</w:t>
       </w:r>
     </w:p>
     <w:p>
       <w:pPr>
-        <w:pStyle w:val="Heading2"/>
-        <w:ind w:left="860"/>
-      </w:pPr>
-      <w:bookmarkStart w:id="23" w:name="_Toc232780177"/>
+        <w:pStyle w:val="Titre2"/>
+      </w:pPr>
+      <w:bookmarkStart w:id="23" w:name="_Toc232780178"/>
       <w:r>
-        <w:lastRenderedPageBreak/>
-        <w:t>Transaction</w:t>
+        <w:t>Customizing &amp; Configuration prerequisites</w:t>
       </w:r>
       <w:bookmarkEnd w:id="23"/>
     </w:p>
-    <w:p/>
     <w:p>
       <w:pPr>
         <w:spacing w:after="120" w:line="240" w:lineRule="auto"/>
@@ -5773,34 +5624,12 @@
         <w:rPr>
           <w:rFonts w:eastAsia="Times New Roman" w:cs="Arial"/>
         </w:rPr>
-        <w:t xml:space="preserve">AIF error monitor, WE02/WE05/BD87 (IDoc monitor), WE19 (IDoc test tool), WE20/WE42/WE57/WE82/BD54 (inbound IDoc configuration), SE38/SE37 (program), SM30 (maintenance of ZUT_T_CAT02), FB03 (display of the posted document), FBN1/OBA7/OB52 (number range, document type, posting periods).</w:t>
+        <w:t>The following configuration is required:</w:t>
       </w:r>
     </w:p>
     <w:p>
       <w:pPr>
-        <w:pStyle w:val="Heading2"/>
-      </w:pPr>
-      <w:bookmarkStart w:id="24" w:name="_Toc232780178"/>
-      <w:r>
-        <w:t>Customizing &amp; Configuration prerequisites</w:t>
-      </w:r>
-      <w:bookmarkEnd w:id="24"/>
-    </w:p>
-    <w:p>
-      <w:pPr>
-        <w:spacing w:after="120" w:line="240" w:lineRule="auto"/>
-        <w:jc w:val="both"/>
-      </w:pPr>
-      <w:r>
-        <w:rPr>
-          <w:rFonts w:eastAsia="Times New Roman" w:cs="Arial"/>
-        </w:rPr>
-        <w:t xml:space="preserve">The following configuration is required:</w:t>
-      </w:r>
-    </w:p>
-    <w:p>
-      <w:pPr>
-        <w:pStyle w:val="ListParagraph"/>
+        <w:pStyle w:val="Paragraphedeliste"/>
         <w:numPr>
           <w:ilvl w:val="0"/>
           <w:numId w:val="2"/>
@@ -5812,12 +5641,12 @@
         <w:rPr>
           <w:rFonts w:eastAsia="Times New Roman" w:cs="Arial"/>
         </w:rPr>
-        <w:t xml:space="preserve">ZUT_T_CAT02 entries: company code + Product Code → HKONT (see the reference table in IFS_P2P_144, Appendix; one entry per Product Code and iShift company code). An unmapped Product Code stops the posting.</w:t>
+        <w:t>ZUT_T_CAT02 entries: company code + Product Code → HKONT (see the reference table in IFS_P2P_144, Appendix; one entry per Product Code and iShift company code). The table is read by TIBCO; an unmapped Product Code stops the generation of the IDoc.</w:t>
       </w:r>
     </w:p>
     <w:p>
       <w:pPr>
-        <w:pStyle w:val="ListParagraph"/>
+        <w:pStyle w:val="Paragraphedeliste"/>
         <w:numPr>
           <w:ilvl w:val="0"/>
           <w:numId w:val="2"/>
@@ -5829,12 +5658,12 @@
         <w:rPr>
           <w:rFonts w:eastAsia="Times New Roman" w:cs="Arial"/>
         </w:rPr>
-        <w:t xml:space="preserve">ACC_DOCUMENT04 inbound configuration: IDoc basic type ACC_DOCUMENT04, message type ACC_DOCUMENT, message variant HRS, SADR sender HRS, sender logical system of TIBCO (partner type LS) – Typinfo, Partner and Address settings as described in EFS_P2P_087; new process code (WE42) linked to the program ZPTP_IB_HRS_RECLASS and to the message type (WE57); inbound partner profile (WE20); IDoc processing mode (immediate or background job) TBC.</w:t>
+        <w:t xml:space="preserve">ACC_DOCUMENT04 inbound configuration: IDoc basic type ACC_DOCUMENT04, message type ACC_DOCUMENT, message variant HRS, SADR sender HRS, sender logical system of TIBCO (partner type LS) – Typinfo, Partner and Address settings as described in EFS_P2P_087; </w:t>
       </w:r>
     </w:p>
     <w:p>
       <w:pPr>
-        <w:pStyle w:val="ListParagraph"/>
+        <w:pStyle w:val="Paragraphedeliste"/>
         <w:numPr>
           <w:ilvl w:val="0"/>
           <w:numId w:val="2"/>
@@ -5846,12 +5675,12 @@
         <w:rPr>
           <w:rFonts w:eastAsia="Times New Roman" w:cs="Arial"/>
         </w:rPr>
-        <w:t xml:space="preserve">Currency code conversion: the CDF3 file carries ISO 4217 numeric codes (e.g. 978). The conversion to the SAP code (EUR) is done either in TIBCO or, as on P08, by an EDI conversion rule in iShift. To be decided with the Integration team.</w:t>
+        <w:t>Inbound partner profile (WE20); IDoc processing mode (immediate or background job) TBC.</w:t>
       </w:r>
     </w:p>
     <w:p>
       <w:pPr>
-        <w:pStyle w:val="ListParagraph"/>
+        <w:pStyle w:val="Paragraphedeliste"/>
         <w:numPr>
           <w:ilvl w:val="0"/>
           <w:numId w:val="2"/>
@@ -5863,12 +5692,19 @@
         <w:rPr>
           <w:rFonts w:eastAsia="Times New Roman" w:cs="Arial"/>
         </w:rPr>
-        <w:t xml:space="preserve">FI document type for the reclassification (a dedicated type is recommended) with its number range (OBA7, FBN1) and the posting period open (OB52). The posting date rule is TBC with the FI team.</w:t>
+        <w:t xml:space="preserve">Currency code conversion: the CDF3 file carries ISO 4217 numeric codes (e.g. 978). The conversion to the SAP code (EUR) is done either in TIBCO or, as on P08, by an EDI conversion rule in iShift. To </w:t>
+      </w:r>
+      <w:r>
+        <w:rPr>
+          <w:rFonts w:eastAsia="Times New Roman" w:cs="Arial"/>
+          <w:highlight w:val="yellow"/>
+        </w:rPr>
+        <w:t xml:space="preserve">be decided with the Citibank.</w:t>
       </w:r>
     </w:p>
     <w:p>
       <w:pPr>
-        <w:pStyle w:val="ListParagraph"/>
+        <w:pStyle w:val="Paragraphedeliste"/>
         <w:numPr>
           <w:ilvl w:val="0"/>
           <w:numId w:val="2"/>
@@ -5880,12 +5716,12 @@
         <w:rPr>
           <w:rFonts w:eastAsia="Times New Roman" w:cs="Arial"/>
         </w:rPr>
-        <w:t xml:space="preserve">G/L accounts: the debit accounts of ZUT_T_CAT02 and the credit accounts of the POs must exist in the company code, be open for posting and, if P&amp;L accounts, be cost elements. The field status must accept the cost center (and WBS element / internal order if used) and the assignment field.</w:t>
+        <w:t xml:space="preserve">FI document type for the reclassification is ‘SA’</w:t>
       </w:r>
     </w:p>
     <w:p>
       <w:pPr>
-        <w:pStyle w:val="ListParagraph"/>
+        <w:pStyle w:val="Paragraphedeliste"/>
         <w:numPr>
           <w:ilvl w:val="0"/>
           <w:numId w:val="2"/>
@@ -5897,31 +5733,14 @@
         <w:rPr>
           <w:rFonts w:eastAsia="Times New Roman" w:cs="Arial"/>
         </w:rPr>
-        <w:t xml:space="preserve">Authorizations of the IDoc user: F_BKPF_BUK, F_BKPF_BLA, F_BKPF_KOA for the FI posting; M_BEST_BSA and M_BEST_WRK to read the POs. Authorization trace with SU53 / ST01 during the tests.</w:t>
-      </w:r>
-    </w:p>
-    <w:p>
-      <w:pPr>
-        <w:pStyle w:val="ListParagraph"/>
-        <w:numPr>
-          <w:ilvl w:val="0"/>
-          <w:numId w:val="2"/>
-        </w:numPr>
-        <w:spacing w:after="60" w:line="240" w:lineRule="auto"/>
-        <w:jc w:val="both"/>
-      </w:pPr>
-      <w:r>
-        <w:rPr>
-          <w:rFonts w:eastAsia="Times New Roman" w:cs="Arial"/>
-        </w:rPr>
-        <w:t xml:space="preserve">Transport: the new program, the process code and the table entries are transported through the iShift landscape (transport request to be defined).</w:t>
+        <w:t xml:space="preserve">G/L accounts: the debit accounts of ZUT_T_CAT02 and the credit accounts of the POs must exist in the company code, be open for posting and, if P&amp;L accounts, be cost elements. </w:t>
       </w:r>
     </w:p>
     <w:p/>
     <w:p/>
     <w:p>
       <w:pPr>
-        <w:pStyle w:val="Heading1"/>
+        <w:pStyle w:val="Titre1"/>
         <w:autoSpaceDE w:val="0"/>
         <w:autoSpaceDN w:val="0"/>
         <w:adjustRightInd w:val="0"/>
@@ -5933,11 +5752,11 @@
           <w:lang w:val="de-CH"/>
         </w:rPr>
       </w:pPr>
-      <w:bookmarkStart w:id="25" w:name="_Toc232780179"/>
+      <w:bookmarkStart w:id="24" w:name="_Toc232780179"/>
       <w:r>
         <w:t>Solution Integration Considerations</w:t>
       </w:r>
-      <w:bookmarkEnd w:id="25"/>
+      <w:bookmarkEnd w:id="24"/>
     </w:p>
     <w:p>
       <w:pPr>
@@ -5948,12 +5767,12 @@
         <w:rPr>
           <w:rFonts w:eastAsia="Times New Roman" w:cs="Arial"/>
         </w:rPr>
-        <w:t xml:space="preserve">The following solution elements are impacted:</w:t>
+        <w:t>The following solution elements are impacted:</w:t>
       </w:r>
     </w:p>
     <w:p>
       <w:pPr>
-        <w:pStyle w:val="ListParagraph"/>
+        <w:pStyle w:val="Paragraphedeliste"/>
         <w:numPr>
           <w:ilvl w:val="0"/>
           <w:numId w:val="2"/>
@@ -5965,12 +5784,12 @@
         <w:rPr>
           <w:rFonts w:eastAsia="Times New Roman" w:cs="Arial"/>
         </w:rPr>
-        <w:t xml:space="preserve">TIBCO Integration Team – XML-to-IDoc transformation and transport to iShift.</w:t>
+        <w:t xml:space="preserve">TIBCO Integration Team – read of ZUT_T_CAT02 (G/L account to debit), CDF3-to-IDoc transformation and transport to iShift.</w:t>
       </w:r>
     </w:p>
     <w:p>
       <w:pPr>
-        <w:pStyle w:val="ListParagraph"/>
+        <w:pStyle w:val="Paragraphedeliste"/>
         <w:numPr>
           <w:ilvl w:val="0"/>
           <w:numId w:val="2"/>
@@ -5982,12 +5801,12 @@
         <w:rPr>
           <w:rFonts w:eastAsia="Times New Roman" w:cs="Arial"/>
         </w:rPr>
-        <w:t xml:space="preserve">Integration Team – ALE/IDoc connectivity configuration (see EFS_P2P_087).</w:t>
+        <w:t>Integration Team – ALE/IDoc connectivity configuration (see EFS_P2P_087).</w:t>
       </w:r>
     </w:p>
     <w:p>
       <w:pPr>
-        <w:pStyle w:val="ListParagraph"/>
+        <w:pStyle w:val="Paragraphedeliste"/>
         <w:numPr>
           <w:ilvl w:val="0"/>
           <w:numId w:val="2"/>
@@ -5999,12 +5818,12 @@
         <w:rPr>
           <w:rFonts w:eastAsia="Times New Roman" w:cs="Arial"/>
         </w:rPr>
-        <w:t xml:space="preserve">AIF Administration Team – namespace/interface creation, bridge enhancement, error monitor access.</w:t>
+        <w:t>AIF Administration Team – namespace/interface creation, bridge enhancement, error monitor access.</w:t>
       </w:r>
     </w:p>
     <w:p>
       <w:pPr>
-        <w:pStyle w:val="ListParagraph"/>
+        <w:pStyle w:val="Paragraphedeliste"/>
         <w:numPr>
           <w:ilvl w:val="0"/>
           <w:numId w:val="2"/>
@@ -6016,12 +5835,13 @@
         <w:rPr>
           <w:rFonts w:eastAsia="Times New Roman" w:cs="Arial"/>
         </w:rPr>
-        <w:t xml:space="preserve">iShift ABAP Team – creation of the program ZPTP_IB_HRS_RECLASS and of the inbound IDoc processing for ACC_DOCUMENT04.</w:t>
+        <w:lastRenderedPageBreak/>
+        <w:t>iShift ABAP Team – creation of the program ZPTP_IB_HRS_RECLASS and of the inbound IDoc processing for ACC_DOCUMENT04.</w:t>
       </w:r>
     </w:p>
     <w:p>
       <w:pPr>
-        <w:pStyle w:val="ListParagraph"/>
+        <w:pStyle w:val="Paragraphedeliste"/>
         <w:numPr>
           <w:ilvl w:val="0"/>
           <w:numId w:val="2"/>
@@ -6033,12 +5853,12 @@
         <w:rPr>
           <w:rFonts w:eastAsia="Times New Roman" w:cs="Arial"/>
         </w:rPr>
-        <w:t xml:space="preserve">iShift FI/CO Team – document type, number range, posting period, G/L accounts, cost elements and ZUT_T_CAT02 entries.</w:t>
+        <w:t>iShift FI/CO Team – document type, number range, posting period, G/L accounts, cost elements and ZUT_T_CAT02 entries.</w:t>
       </w:r>
     </w:p>
     <w:p>
       <w:pPr>
-        <w:pStyle w:val="ListParagraph"/>
+        <w:pStyle w:val="Paragraphedeliste"/>
         <w:numPr>
           <w:ilvl w:val="0"/>
           <w:numId w:val="2"/>
@@ -6050,36 +5870,23 @@
         <w:rPr>
           <w:rFonts w:eastAsia="Times New Roman" w:cs="Arial"/>
         </w:rPr>
-        <w:t xml:space="preserve">Security Team – role and authorizations of the IDoc user.</w:t>
+        <w:t>Security Team – role and authorizations of the IDoc user.</w:t>
       </w:r>
     </w:p>
     <w:p>
       <w:pPr>
-        <w:pStyle w:val="Heading1"/>
-      </w:pPr>
-      <w:bookmarkStart w:id="27" w:name="_Toc232780180"/>
+        <w:pStyle w:val="Titre1"/>
+      </w:pPr>
+      <w:bookmarkStart w:id="25" w:name="_Toc232780180"/>
       <w:r>
         <w:t>Authority Checks and Controls Requirements</w:t>
       </w:r>
-      <w:bookmarkEnd w:id="26"/>
-      <w:bookmarkEnd w:id="27"/>
+      <w:bookmarkEnd w:id="25"/>
     </w:p>
     <w:p/>
     <w:p>
       <w:pPr>
-        <w:spacing w:after="120" w:line="240" w:lineRule="auto"/>
-        <w:jc w:val="both"/>
-      </w:pPr>
-      <w:r>
-        <w:rPr>
-          <w:rFonts w:eastAsia="Times New Roman" w:cs="Arial"/>
-        </w:rPr>
-        <w:t xml:space="preserve">The IDoc user that posts the reclassification needs the following authorizations (to be added to its role):</w:t>
-      </w:r>
-    </w:p>
-    <w:p>
-      <w:pPr>
-        <w:pStyle w:val="ListParagraph"/>
+        <w:pStyle w:val="Paragraphedeliste"/>
         <w:numPr>
           <w:ilvl w:val="0"/>
           <w:numId w:val="2"/>
@@ -6088,15 +5895,43 @@
         <w:jc w:val="both"/>
       </w:pPr>
       <w:r>
+        <w:t>N/A</w:t>
+      </w:r>
+    </w:p>
+    <w:p/>
+    <w:p>
+      <w:pPr>
+        <w:pStyle w:val="Titre1"/>
+        <w:autoSpaceDE w:val="0"/>
+        <w:autoSpaceDN w:val="0"/>
+        <w:adjustRightInd w:val="0"/>
+        <w:spacing w:before="179"/>
+      </w:pPr>
+      <w:bookmarkStart w:id="26" w:name="_Toc232780181"/>
+      <w:r>
+        <w:t>Error Handling</w:t>
+      </w:r>
+      <w:bookmarkEnd w:id="26"/>
+      <w:r>
+        <w:t xml:space="preserve"> </w:t>
+      </w:r>
+    </w:p>
+    <w:p/>
+    <w:p>
+      <w:pPr>
+        <w:spacing w:after="120" w:line="240" w:lineRule="auto"/>
+        <w:jc w:val="both"/>
+      </w:pPr>
+      <w:r>
         <w:rPr>
           <w:rFonts w:eastAsia="Times New Roman" w:cs="Arial"/>
         </w:rPr>
-        <w:t xml:space="preserve">F_BKPF_BUK (company code), F_BKPF_BLA (document type) and F_BKPF_KOA (G/L account) for the FI posting.</w:t>
+        <w:t xml:space="preserve">Error handling is managed in AIF. In iShift, nothing is posted when an error occurs, the IDoc gets status 51 and the error is shown in AIF:</w:t>
       </w:r>
     </w:p>
     <w:p>
       <w:pPr>
-        <w:pStyle w:val="ListParagraph"/>
+        <w:pStyle w:val="Paragraphedeliste"/>
         <w:numPr>
           <w:ilvl w:val="0"/>
           <w:numId w:val="2"/>
@@ -6108,12 +5943,12 @@
         <w:rPr>
           <w:rFonts w:eastAsia="Times New Roman" w:cs="Arial"/>
         </w:rPr>
-        <w:t xml:space="preserve">M_BEST_BSA and M_BEST_WRK (display of the purchase orders) for BAPI_PO_GETDETAIL.</w:t>
+        <w:t xml:space="preserve">If the Product Code cannot be found in ZUT_T_CAT02: error raised by TIBCO, no IDoc is generated for the line and nothing is posted in iShift (notification mechanism TBC).</w:t>
       </w:r>
     </w:p>
     <w:p>
       <w:pPr>
-        <w:pStyle w:val="ListParagraph"/>
+        <w:pStyle w:val="Paragraphedeliste"/>
         <w:numPr>
           <w:ilvl w:val="0"/>
           <w:numId w:val="2"/>
@@ -6125,22 +5960,76 @@
         <w:rPr>
           <w:rFonts w:eastAsia="Times New Roman" w:cs="Arial"/>
         </w:rPr>
-        <w:t xml:space="preserve">Controls: the document must be balanced; the posting is refused if the period is closed or the account is blocked. No manual authorization is needed for the end users of AIF other than the existing AIF roles.</w:t>
+        <w:t>If the PO or the PO line item does not exist in iShift: nothing is posted; error in AIF.</w:t>
+      </w:r>
+    </w:p>
+    <w:p>
+      <w:pPr>
+        <w:pStyle w:val="Paragraphedeliste"/>
+        <w:numPr>
+          <w:ilvl w:val="0"/>
+          <w:numId w:val="2"/>
+        </w:numPr>
+        <w:spacing w:after="60" w:line="240" w:lineRule="auto"/>
+        <w:jc w:val="both"/>
+      </w:pPr>
+      <w:r>
+        <w:rPr>
+          <w:rFonts w:eastAsia="Times New Roman" w:cs="Arial"/>
+        </w:rPr>
+        <w:t>If the PO line item has no account assignment or no P&amp;L G/L account (for example a stock item), or several account assignment lines: nothing is posted; error in AIF (distribution of the credit over several lines is not part of this version – TBC).</w:t>
+      </w:r>
+    </w:p>
+    <w:p>
+      <w:pPr>
+        <w:pStyle w:val="Paragraphedeliste"/>
+        <w:numPr>
+          <w:ilvl w:val="0"/>
+          <w:numId w:val="2"/>
+        </w:numPr>
+        <w:spacing w:after="60" w:line="240" w:lineRule="auto"/>
+        <w:jc w:val="both"/>
+      </w:pPr>
+      <w:r>
+        <w:rPr>
+          <w:rFonts w:eastAsia="Times New Roman" w:cs="Arial"/>
+        </w:rPr>
+        <w:t>If SAP refuses the posting (document not balanced, closed posting period, blocked G/L account, G/L account that is not a cost element, closed or invalid cost center): nothing is posted; the message of the BAPI is stored in the IDoc and in AIF. After correction, the IDoc is reprocessed from AIF.</w:t>
+      </w:r>
+    </w:p>
+    <w:p>
+      <w:pPr>
+        <w:pStyle w:val="Paragraphedeliste"/>
+        <w:numPr>
+          <w:ilvl w:val="0"/>
+          <w:numId w:val="2"/>
+        </w:numPr>
+        <w:spacing w:after="60" w:line="240" w:lineRule="auto"/>
+        <w:jc w:val="both"/>
+      </w:pPr>
+      <w:r>
+        <w:rPr>
+          <w:rFonts w:eastAsia="Times New Roman" w:cs="Arial"/>
+        </w:rPr>
+        <w:t xml:space="preserve">If the statement was already posted (same company code, reference and header text): the IDoc is rejected as a duplicate (mechanism already exists in iShift).</w:t>
       </w:r>
     </w:p>
     <w:p/>
+    <w:p/>
     <w:p>
       <w:pPr>
-        <w:pStyle w:val="Heading1"/>
+        <w:pStyle w:val="Titre1"/>
         <w:autoSpaceDE w:val="0"/>
         <w:autoSpaceDN w:val="0"/>
         <w:adjustRightInd w:val="0"/>
         <w:spacing w:before="179"/>
       </w:pPr>
-      <w:bookmarkStart w:id="28" w:name="_Toc232780181"/>
+      <w:bookmarkStart w:id="27" w:name="_Toc483328681"/>
+      <w:bookmarkStart w:id="28" w:name="_Toc232780182"/>
       <w:r>
-        <w:t>Error Handling</w:t>
+        <w:t>Tools and Monitoring</w:t>
       </w:r>
+      <w:bookmarkEnd w:id="27"/>
       <w:bookmarkEnd w:id="28"/>
       <w:r>
         <w:t xml:space="preserve"> </w:t>
@@ -6156,143 +6045,7 @@
         <w:rPr>
           <w:rFonts w:eastAsia="Times New Roman" w:cs="Arial"/>
         </w:rPr>
-        <w:t xml:space="preserve">Error handling is managed in AIF. For the reclassification (program ZPTP_IB_HRS_RECLASS), nothing is posted when an error occurs, the IDoc gets status 51 and the error is shown in AIF:</w:t>
-      </w:r>
-    </w:p>
-    <w:p>
-      <w:pPr>
-        <w:pStyle w:val="ListParagraph"/>
-        <w:numPr>
-          <w:ilvl w:val="0"/>
-          <w:numId w:val="2"/>
-        </w:numPr>
-        <w:spacing w:after="60" w:line="240" w:lineRule="auto"/>
-        <w:jc w:val="both"/>
-      </w:pPr>
-      <w:r>
-        <w:rPr>
-          <w:rFonts w:eastAsia="Times New Roman" w:cs="Arial"/>
-        </w:rPr>
-        <w:t xml:space="preserve">If the Product Code cannot be found in ZUT_T_CAT02: nothing is posted; the IDoc gets status 51 and the error is raised in AIF.</w:t>
-      </w:r>
-    </w:p>
-    <w:p>
-      <w:pPr>
-        <w:pStyle w:val="ListParagraph"/>
-        <w:numPr>
-          <w:ilvl w:val="0"/>
-          <w:numId w:val="2"/>
-        </w:numPr>
-        <w:spacing w:after="60" w:line="240" w:lineRule="auto"/>
-        <w:jc w:val="both"/>
-      </w:pPr>
-      <w:r>
-        <w:rPr>
-          <w:rFonts w:eastAsia="Times New Roman" w:cs="Arial"/>
-        </w:rPr>
-        <w:t xml:space="preserve">If the PO or the PO line item does not exist in iShift: nothing is posted; error in AIF.</w:t>
-      </w:r>
-    </w:p>
-    <w:p>
-      <w:pPr>
-        <w:pStyle w:val="ListParagraph"/>
-        <w:numPr>
-          <w:ilvl w:val="0"/>
-          <w:numId w:val="2"/>
-        </w:numPr>
-        <w:spacing w:after="60" w:line="240" w:lineRule="auto"/>
-        <w:jc w:val="both"/>
-      </w:pPr>
-      <w:r>
-        <w:rPr>
-          <w:rFonts w:eastAsia="Times New Roman" w:cs="Arial"/>
-        </w:rPr>
-        <w:t xml:space="preserve">If the PO line item has no account assignment or no P&amp;L G/L account (for example a stock item), or several account assignment lines: nothing is posted; error in AIF (distribution of the credit over several lines is not part of this version – TBC).</w:t>
-      </w:r>
-    </w:p>
-    <w:p>
-      <w:pPr>
-        <w:pStyle w:val="ListParagraph"/>
-        <w:numPr>
-          <w:ilvl w:val="0"/>
-          <w:numId w:val="2"/>
-        </w:numPr>
-        <w:spacing w:after="60" w:line="240" w:lineRule="auto"/>
-        <w:jc w:val="both"/>
-      </w:pPr>
-      <w:r>
-        <w:rPr>
-          <w:rFonts w:eastAsia="Times New Roman" w:cs="Arial"/>
-        </w:rPr>
-        <w:t xml:space="preserve">If SAP refuses the posting (document not balanced, closed posting period, blocked G/L account, G/L account that is not a cost element, closed or invalid cost center): nothing is posted; the message of the BAPI is stored in the IDoc and in AIF. After correction, the IDoc is reprocessed from AIF.</w:t>
-      </w:r>
-    </w:p>
-    <w:p>
-      <w:pPr>
-        <w:pStyle w:val="ListParagraph"/>
-        <w:numPr>
-          <w:ilvl w:val="0"/>
-          <w:numId w:val="2"/>
-        </w:numPr>
-        <w:spacing w:after="60" w:line="240" w:lineRule="auto"/>
-        <w:jc w:val="both"/>
-      </w:pPr>
-      <w:r>
-        <w:rPr>
-          <w:rFonts w:eastAsia="Times New Roman" w:cs="Arial"/>
-        </w:rPr>
-        <w:t xml:space="preserve">If the statement was already posted (same company code, reference and header text): the IDoc is rejected as a duplicate (mechanism TBC).</w:t>
-      </w:r>
-    </w:p>
-    <w:p>
-      <w:pPr>
-        <w:pStyle w:val="ListParagraph"/>
-        <w:numPr>
-          <w:ilvl w:val="0"/>
-          <w:numId w:val="2"/>
-        </w:numPr>
-        <w:spacing w:after="60" w:line="240" w:lineRule="auto"/>
-        <w:jc w:val="both"/>
-      </w:pPr>
-      <w:r>
-        <w:rPr>
-          <w:rFonts w:eastAsia="Times New Roman" w:cs="Arial"/>
-        </w:rPr>
-        <w:t xml:space="preserve">If the file does not comply with the CDF3 XSD: the file is not processed; a notification is raised (mechanism TBC).</w:t>
-      </w:r>
-    </w:p>
-    <w:p/>
-    <w:p/>
-    <w:p>
-      <w:pPr>
-        <w:pStyle w:val="Heading1"/>
-        <w:autoSpaceDE w:val="0"/>
-        <w:autoSpaceDN w:val="0"/>
-        <w:adjustRightInd w:val="0"/>
-        <w:spacing w:before="179"/>
-      </w:pPr>
-      <w:bookmarkStart w:id="29" w:name="_Toc483328681"/>
-      <w:bookmarkStart w:id="30" w:name="_Toc232780182"/>
-      <w:r>
-        <w:t>Tools and Monitoring</w:t>
-      </w:r>
-      <w:bookmarkEnd w:id="29"/>
-      <w:bookmarkEnd w:id="30"/>
-      <w:r>
-        <w:t xml:space="preserve"> </w:t>
-      </w:r>
-    </w:p>
-    <w:p/>
-    <w:p>
-      <w:pPr>
-        <w:spacing w:after="120" w:line="240" w:lineRule="auto"/>
-        <w:jc w:val="both"/>
-      </w:pPr>
-      <w:r>
-        <w:rPr>
-          <w:rFonts w:eastAsia="Times New Roman" w:cs="Arial"/>
-        </w:rPr>
-        <w:t xml:space="preserve">The error monitoring will be done in AIF.</w:t>
+        <w:t>The error monitoring will be done in AIF.</w:t>
       </w:r>
     </w:p>
     <w:p/>
@@ -6327,7 +6080,6 @@
           </w:tcPr>
           <w:p>
             <w:r>
-              <w:lastRenderedPageBreak/>
               <w:t>How business can identify the interface is working as expected?</w:t>
             </w:r>
           </w:p>
@@ -6349,7 +6101,7 @@
                 <w:sz w:val="20"/>
                 <w:szCs w:val="20"/>
               </w:rPr>
-              <w:t xml:space="preserve">The ACC_DOCUMENT04 IDocs have status 53 (reclassification document posted); no open error entries exist in AIF for the Citibank/HRS reclassification interface.</w:t>
+              <w:t>The ACC_DOCUMENT04 IDocs have status 53 (reclassification document posted); no open error entries exist in AIF for the Citibank/HRS reclassification interface.</w:t>
             </w:r>
           </w:p>
         </w:tc>
@@ -6367,6 +6119,7 @@
           </w:tcPr>
           <w:p>
             <w:r>
+              <w:lastRenderedPageBreak/>
               <w:t>Are there start of day or end of day activities linked to monitoring?</w:t>
             </w:r>
           </w:p>
@@ -6388,7 +6141,7 @@
                 <w:sz w:val="20"/>
                 <w:szCs w:val="20"/>
               </w:rPr>
-              <w:t xml:space="preserve">Monitoring is tied to the monthly Citibank statement reception; AIF.</w:t>
+              <w:t>Monitoring is tied to the monthly Citibank statement reception; AIF.</w:t>
             </w:r>
           </w:p>
         </w:tc>
@@ -6427,7 +6180,7 @@
                 <w:sz w:val="20"/>
                 <w:szCs w:val="20"/>
               </w:rPr>
-              <w:t xml:space="preserve">The G/L document number is stored in the IDoc (WE02) and displayed with FB03. No error entry in AIF.</w:t>
+              <w:t>The G/L document number is stored in the IDoc (WE02) and displayed with FB03. No error entry in AIF.</w:t>
             </w:r>
           </w:p>
         </w:tc>
@@ -6466,7 +6219,7 @@
                 <w:sz w:val="20"/>
                 <w:szCs w:val="20"/>
               </w:rPr>
-              <w:t xml:space="preserve">An error entry is raised in AIF for the reclassification interface.</w:t>
+              <w:t>An error entry is raised in AIF for the reclassification interface.</w:t>
             </w:r>
           </w:p>
         </w:tc>
@@ -6505,7 +6258,7 @@
                 <w:sz w:val="20"/>
                 <w:szCs w:val="20"/>
               </w:rPr>
-              <w:t xml:space="preserve">AIF error monitor (view and reprocess), WE02/WE05 (IDoc monitor).</w:t>
+              <w:t>AIF error monitor (view and reprocess), WE02/WE05 (IDoc monitor).</w:t>
             </w:r>
           </w:p>
         </w:tc>
@@ -6544,7 +6297,7 @@
                 <w:sz w:val="20"/>
                 <w:szCs w:val="20"/>
               </w:rPr>
-              <w:t xml:space="preserve">Yes – once the configuration or technical issue is fixed, the error entry is reprocessed and closed directly in AIF.</w:t>
+              <w:t>Yes – once the configuration or technical issue is fixed, the error entry is reprocessed and closed directly in AIF.</w:t>
             </w:r>
           </w:p>
         </w:tc>
@@ -6583,7 +6336,7 @@
                 <w:sz w:val="20"/>
                 <w:szCs w:val="20"/>
               </w:rPr>
-              <w:t xml:space="preserve">Fallback: manual G/L reclassification entry in iShift (TBC), until the interface is restored.</w:t>
+              <w:t>Fallback: manual G/L reclassification entry in iShift (TBC), until the interface is restored.</w:t>
             </w:r>
           </w:p>
         </w:tc>
@@ -6622,7 +6375,7 @@
                 <w:sz w:val="20"/>
                 <w:szCs w:val="20"/>
               </w:rPr>
-              <w:t xml:space="preserve">This enhancement depends on the TIBCO transport mechanism (TBC) and the AIF namespace/bridge configuration.</w:t>
+              <w:t>This enhancement depends on the TIBCO transport mechanism (TBC) and the AIF namespace/bridge configuration.</w:t>
             </w:r>
           </w:p>
         </w:tc>
@@ -6631,17 +6384,17 @@
     <w:p/>
     <w:p>
       <w:pPr>
-        <w:pStyle w:val="Heading1"/>
+        <w:pStyle w:val="Titre1"/>
         <w:autoSpaceDE w:val="0"/>
         <w:autoSpaceDN w:val="0"/>
         <w:adjustRightInd w:val="0"/>
         <w:spacing w:before="179"/>
       </w:pPr>
-      <w:bookmarkStart w:id="31" w:name="_Toc232780183"/>
+      <w:bookmarkStart w:id="29" w:name="_Toc232780183"/>
       <w:r>
         <w:t>Testing</w:t>
       </w:r>
-      <w:bookmarkEnd w:id="31"/>
+      <w:bookmarkEnd w:id="29"/>
     </w:p>
     <w:p/>
     <w:tbl>
@@ -6897,7 +6650,7 @@
               <w:rPr>
                 <w:rFonts w:cs="Arial"/>
               </w:rPr>
-              <w:t xml:space="preserve">1</w:t>
+              <w:t>1</w:t>
             </w:r>
           </w:p>
         </w:tc>
@@ -6925,7 +6678,7 @@
               <w:rPr>
                 <w:rFonts w:cs="Arial"/>
               </w:rPr>
-              <w:t xml:space="preserve">ZUT_T_CAT02 G/L lookup for a known Product Code</w:t>
+              <w:t xml:space="preserve">TIBCO: ZUT_T_CAT02 G/L lookup for a known Product Code</w:t>
             </w:r>
           </w:p>
         </w:tc>
@@ -6953,7 +6706,7 @@
               <w:rPr>
                 <w:rFonts w:cs="Arial"/>
               </w:rPr>
-              <w:t xml:space="preserve">normal</w:t>
+              <w:t>normal</w:t>
             </w:r>
           </w:p>
         </w:tc>
@@ -6981,7 +6734,7 @@
               <w:rPr>
                 <w:rFonts w:cs="Arial"/>
               </w:rPr>
-              <w:t xml:space="preserve">Product Code L-1101</w:t>
+              <w:t>Product Code L-1101</w:t>
             </w:r>
           </w:p>
         </w:tc>
@@ -7009,7 +6762,7 @@
               <w:rPr>
                 <w:rFonts w:cs="Arial"/>
               </w:rPr>
-              <w:t xml:space="preserve">G/L account 73160100 resolved correctly.</w:t>
+              <w:t xml:space="preserve">G/L account 73160100 found by TIBCO and present in the debit line of the IDoc.</w:t>
             </w:r>
           </w:p>
         </w:tc>
@@ -7044,7 +6797,8 @@
               <w:rPr>
                 <w:rFonts w:cs="Arial"/>
               </w:rPr>
-              <w:t xml:space="preserve">2</w:t>
+              <w:lastRenderedPageBreak/>
+              <w:t>2</w:t>
             </w:r>
           </w:p>
         </w:tc>
@@ -7072,7 +6826,7 @@
               <w:rPr>
                 <w:rFonts w:cs="Arial"/>
               </w:rPr>
-              <w:t xml:space="preserve">ACC_DOCUMENT04 IDoc settings (Typinfo / Partner / Address)</w:t>
+              <w:t>ACC_DOCUMENT04 IDoc settings (Typinfo / Partner / Address)</w:t>
             </w:r>
           </w:p>
         </w:tc>
@@ -7100,7 +6854,7 @@
               <w:rPr>
                 <w:rFonts w:cs="Arial"/>
               </w:rPr>
-              <w:t xml:space="preserve">normal</w:t>
+              <w:t>normal</w:t>
             </w:r>
           </w:p>
         </w:tc>
@@ -7128,7 +6882,7 @@
               <w:rPr>
                 <w:rFonts w:cs="Arial"/>
               </w:rPr>
-              <w:t xml:space="preserve">IDoc with message type ACC_DOCUMENT, message variant HRS, SADR sender HRS</w:t>
+              <w:t>IDoc with message type ACC_DOCUMENT, message variant HRS, SADR sender HRS</w:t>
             </w:r>
           </w:p>
         </w:tc>
@@ -7156,7 +6910,7 @@
               <w:rPr>
                 <w:rFonts w:cs="Arial"/>
               </w:rPr>
-              <w:t xml:space="preserve">IDoc accepted by the inbound partner profile and processed by ZPTP_IB_HRS_RECLASS.</w:t>
+              <w:t>IDoc accepted by the inbound partner profile and processed by ZPTP_IB_HRS_RECLASS.</w:t>
             </w:r>
           </w:p>
         </w:tc>
@@ -7191,7 +6945,7 @@
               <w:rPr>
                 <w:rFonts w:cs="Arial"/>
               </w:rPr>
-              <w:t xml:space="preserve">3</w:t>
+              <w:t>3</w:t>
             </w:r>
           </w:p>
         </w:tc>
@@ -7219,7 +6973,7 @@
               <w:rPr>
                 <w:rFonts w:cs="Arial"/>
               </w:rPr>
-              <w:t xml:space="preserve">ACC_DOCUMENT04: one Product Code on one PO line item</w:t>
+              <w:t>ACC_DOCUMENT04: one Product Code on one PO line item</w:t>
             </w:r>
           </w:p>
         </w:tc>
@@ -7247,7 +7001,7 @@
               <w:rPr>
                 <w:rFonts w:cs="Arial"/>
               </w:rPr>
-              <w:t xml:space="preserve">normal</w:t>
+              <w:t>normal</w:t>
             </w:r>
           </w:p>
         </w:tc>
@@ -7275,7 +7029,7 @@
               <w:rPr>
                 <w:rFonts w:cs="Arial"/>
               </w:rPr>
-              <w:t xml:space="preserve">IDoc with one line, Product Code L-1101</w:t>
+              <w:t>IDoc with one line, Product Code L-1101</w:t>
             </w:r>
           </w:p>
         </w:tc>
@@ -7303,7 +7057,7 @@
               <w:rPr>
                 <w:rFonts w:cs="Arial"/>
               </w:rPr>
-              <w:t xml:space="preserve">G/L document: debit G/L of L-1101 (ZUT_T_CAT02), credit P&amp;L account of the PO, same amount, cost center of the PO; IDoc status 53.</w:t>
+              <w:t xml:space="preserve">G/L document: debit G/L of L-1101 (found by TIBCO in ZUT_T_CAT02), credit P&amp;L account of the PO (BAPI_PO_GETDETAIL), amounts of the Citibank file, cost center of the PO; IDoc status 53.</w:t>
             </w:r>
           </w:p>
         </w:tc>
@@ -7338,7 +7092,7 @@
               <w:rPr>
                 <w:rFonts w:cs="Arial"/>
               </w:rPr>
-              <w:t xml:space="preserve">4</w:t>
+              <w:t>4</w:t>
             </w:r>
           </w:p>
         </w:tc>
@@ -7366,7 +7120,7 @@
               <w:rPr>
                 <w:rFonts w:cs="Arial"/>
               </w:rPr>
-              <w:t xml:space="preserve">ACC_DOCUMENT04: several Product Codes and PO line items</w:t>
+              <w:t>ACC_DOCUMENT04: several Product Codes and PO line items</w:t>
             </w:r>
           </w:p>
         </w:tc>
@@ -7394,7 +7148,7 @@
               <w:rPr>
                 <w:rFonts w:cs="Arial"/>
               </w:rPr>
-              <w:t xml:space="preserve">normal</w:t>
+              <w:t>normal</w:t>
             </w:r>
           </w:p>
         </w:tc>
@@ -7422,7 +7176,7 @@
               <w:rPr>
                 <w:rFonts w:cs="Arial"/>
               </w:rPr>
-              <w:t xml:space="preserve">PO with two line items, five Product Codes (see IFS_P2P_144 example)</w:t>
+              <w:t>PO with two line items, five Product Codes (see IFS_P2P_144 example)</w:t>
             </w:r>
           </w:p>
         </w:tc>
@@ -7450,7 +7204,7 @@
               <w:rPr>
                 <w:rFonts w:cs="Arial"/>
               </w:rPr>
-              <w:t xml:space="preserve">Five debit lines and two credit lines (sum per PO line item); document balanced; ALLOC_NMBR = PO + line item.</w:t>
+              <w:t>Five debit lines and two credit lines (sum per PO line item); document balanced; ALLOC_NMBR = PO + line item.</w:t>
             </w:r>
           </w:p>
         </w:tc>
@@ -7485,7 +7239,7 @@
               <w:rPr>
                 <w:rFonts w:cs="Arial"/>
               </w:rPr>
-              <w:t xml:space="preserve">5</w:t>
+              <w:t>5</w:t>
             </w:r>
           </w:p>
         </w:tc>
@@ -7513,7 +7267,7 @@
               <w:rPr>
                 <w:rFonts w:cs="Arial"/>
               </w:rPr>
-              <w:t xml:space="preserve">Currency code conversion (ISO 4217 numeric to SAP code)</w:t>
+              <w:t>Currency code conversion (ISO 4217 numeric to SAP code)</w:t>
             </w:r>
           </w:p>
         </w:tc>
@@ -7541,7 +7295,7 @@
               <w:rPr>
                 <w:rFonts w:cs="Arial"/>
               </w:rPr>
-              <w:t xml:space="preserve">normal</w:t>
+              <w:t>normal</w:t>
             </w:r>
           </w:p>
         </w:tc>
@@ -7569,7 +7323,7 @@
               <w:rPr>
                 <w:rFonts w:cs="Arial"/>
               </w:rPr>
-              <w:t xml:space="preserve">CDF3 file with the numeric currency code 978</w:t>
+              <w:t>CDF3 file with the numeric currency code 978</w:t>
             </w:r>
           </w:p>
         </w:tc>
@@ -7597,7 +7351,7 @@
               <w:rPr>
                 <w:rFonts w:cs="Arial"/>
               </w:rPr>
-              <w:t xml:space="preserve">Currency EUR in the ACC_DOCUMENT04 IDoc; document posted in EUR.</w:t>
+              <w:t>Currency EUR in the ACC_DOCUMENT04 IDoc; document posted in EUR.</w:t>
             </w:r>
           </w:p>
         </w:tc>
@@ -7632,7 +7386,7 @@
               <w:rPr>
                 <w:rFonts w:cs="Arial"/>
               </w:rPr>
-              <w:t xml:space="preserve">6</w:t>
+              <w:t>6</w:t>
             </w:r>
           </w:p>
         </w:tc>
@@ -7660,7 +7414,7 @@
               <w:rPr>
                 <w:rFonts w:cs="Arial"/>
               </w:rPr>
-              <w:t xml:space="preserve">ACC_DOCUMENT04: Product Code not in ZUT_T_CAT02</w:t>
+              <w:t xml:space="preserve">TIBCO: Product Code not in ZUT_T_CAT02</w:t>
             </w:r>
           </w:p>
         </w:tc>
@@ -7688,7 +7442,7 @@
               <w:rPr>
                 <w:rFonts w:cs="Arial"/>
               </w:rPr>
-              <w:t xml:space="preserve">error</w:t>
+              <w:t>error</w:t>
             </w:r>
           </w:p>
         </w:tc>
@@ -7716,7 +7470,7 @@
               <w:rPr>
                 <w:rFonts w:cs="Arial"/>
               </w:rPr>
-              <w:t xml:space="preserve">Unmapped Product Code</w:t>
+              <w:t>Unmapped Product Code</w:t>
             </w:r>
           </w:p>
         </w:tc>
@@ -7744,7 +7498,7 @@
               <w:rPr>
                 <w:rFonts w:cs="Arial"/>
               </w:rPr>
-              <w:t xml:space="preserve">Nothing posted; IDoc status 51; error visible in AIF.</w:t>
+              <w:t xml:space="preserve">No IDoc generated for the line; nothing posted in iShift; error notified by TIBCO (TBC).</w:t>
             </w:r>
           </w:p>
         </w:tc>
@@ -7779,7 +7533,7 @@
               <w:rPr>
                 <w:rFonts w:cs="Arial"/>
               </w:rPr>
-              <w:t xml:space="preserve">7</w:t>
+              <w:t>7</w:t>
             </w:r>
           </w:p>
         </w:tc>
@@ -7807,7 +7561,7 @@
               <w:rPr>
                 <w:rFonts w:cs="Arial"/>
               </w:rPr>
-              <w:t xml:space="preserve">ACC_DOCUMENT04: PO or PO line item not found</w:t>
+              <w:t>ACC_DOCUMENT04: PO or PO line item not found</w:t>
             </w:r>
           </w:p>
         </w:tc>
@@ -7835,7 +7589,7 @@
               <w:rPr>
                 <w:rFonts w:cs="Arial"/>
               </w:rPr>
-              <w:t xml:space="preserve">error</w:t>
+              <w:t>error</w:t>
             </w:r>
           </w:p>
         </w:tc>
@@ -7863,7 +7617,7 @@
               <w:rPr>
                 <w:rFonts w:cs="Arial"/>
               </w:rPr>
-              <w:t xml:space="preserve">PO number that does not exist</w:t>
+              <w:t>PO number that does not exist</w:t>
             </w:r>
           </w:p>
         </w:tc>
@@ -7891,7 +7645,7 @@
               <w:rPr>
                 <w:rFonts w:cs="Arial"/>
               </w:rPr>
-              <w:t xml:space="preserve">Nothing posted; IDoc status 51; error visible in AIF.</w:t>
+              <w:t>Nothing posted; IDoc status 51; error visible in AIF.</w:t>
             </w:r>
           </w:p>
         </w:tc>
@@ -7926,7 +7680,7 @@
               <w:rPr>
                 <w:rFonts w:cs="Arial"/>
               </w:rPr>
-              <w:t xml:space="preserve">8</w:t>
+              <w:t>8</w:t>
             </w:r>
           </w:p>
         </w:tc>
@@ -7954,7 +7708,7 @@
               <w:rPr>
                 <w:rFonts w:cs="Arial"/>
               </w:rPr>
-              <w:t xml:space="preserve">ACC_DOCUMENT04: PO line item without account assignment</w:t>
+              <w:t>ACC_DOCUMENT04: PO line item without account assignment</w:t>
             </w:r>
           </w:p>
         </w:tc>
@@ -7982,7 +7736,7 @@
               <w:rPr>
                 <w:rFonts w:cs="Arial"/>
               </w:rPr>
-              <w:t xml:space="preserve">error</w:t>
+              <w:t>error</w:t>
             </w:r>
           </w:p>
         </w:tc>
@@ -8010,7 +7764,7 @@
               <w:rPr>
                 <w:rFonts w:cs="Arial"/>
               </w:rPr>
-              <w:t xml:space="preserve">PO line item for a stock material</w:t>
+              <w:t>PO line item for a stock material</w:t>
             </w:r>
           </w:p>
         </w:tc>
@@ -8038,7 +7792,7 @@
               <w:rPr>
                 <w:rFonts w:cs="Arial"/>
               </w:rPr>
-              <w:t xml:space="preserve">Nothing posted; error visible in AIF.</w:t>
+              <w:t>Nothing posted; error visible in AIF.</w:t>
             </w:r>
           </w:p>
         </w:tc>
@@ -8073,7 +7827,7 @@
               <w:rPr>
                 <w:rFonts w:cs="Arial"/>
               </w:rPr>
-              <w:t xml:space="preserve">9</w:t>
+              <w:t>9</w:t>
             </w:r>
           </w:p>
         </w:tc>
@@ -8101,7 +7855,7 @@
               <w:rPr>
                 <w:rFonts w:cs="Arial"/>
               </w:rPr>
-              <w:t xml:space="preserve">ACC_DOCUMENT04: posting refused by SAP</w:t>
+              <w:t>ACC_DOCUMENT04: posting refused by SAP</w:t>
             </w:r>
           </w:p>
         </w:tc>
@@ -8129,7 +7883,7 @@
               <w:rPr>
                 <w:rFonts w:cs="Arial"/>
               </w:rPr>
-              <w:t xml:space="preserve">error</w:t>
+              <w:t>error</w:t>
             </w:r>
           </w:p>
         </w:tc>
@@ -8157,7 +7911,7 @@
               <w:rPr>
                 <w:rFonts w:cs="Arial"/>
               </w:rPr>
-              <w:t xml:space="preserve">Posting date in a closed period</w:t>
+              <w:t>Posting date in a closed period</w:t>
             </w:r>
           </w:p>
         </w:tc>
@@ -8185,7 +7939,7 @@
               <w:rPr>
                 <w:rFonts w:cs="Arial"/>
               </w:rPr>
-              <w:t xml:space="preserve">Nothing posted; BAPI message in the IDoc and in AIF.</w:t>
+              <w:t>Nothing posted; BAPI message in the IDoc and in AIF.</w:t>
             </w:r>
           </w:p>
         </w:tc>
@@ -8220,7 +7974,7 @@
               <w:rPr>
                 <w:rFonts w:cs="Arial"/>
               </w:rPr>
-              <w:t xml:space="preserve">10</w:t>
+              <w:t>10</w:t>
             </w:r>
           </w:p>
         </w:tc>
@@ -8248,7 +8002,7 @@
               <w:rPr>
                 <w:rFonts w:cs="Arial"/>
               </w:rPr>
-              <w:t xml:space="preserve">ACC_DOCUMENT04: reprocessing after correction (AIF)</w:t>
+              <w:t>ACC_DOCUMENT04: reprocessing after correction (AIF)</w:t>
             </w:r>
           </w:p>
         </w:tc>
@@ -8276,7 +8030,7 @@
               <w:rPr>
                 <w:rFonts w:cs="Arial"/>
               </w:rPr>
-              <w:t xml:space="preserve">normal</w:t>
+              <w:t>normal</w:t>
             </w:r>
           </w:p>
         </w:tc>
@@ -8304,7 +8058,7 @@
               <w:rPr>
                 <w:rFonts w:cs="Arial"/>
               </w:rPr>
-              <w:t xml:space="preserve">IDoc in error; the missing ZUT_T_CAT02 entry is created</w:t>
+              <w:t xml:space="preserve">IDoc in error; the PO is corrected (account assignment) and the IDoc reprocessed</w:t>
             </w:r>
           </w:p>
         </w:tc>
@@ -8332,7 +8086,7 @@
               <w:rPr>
                 <w:rFonts w:cs="Arial"/>
               </w:rPr>
-              <w:t xml:space="preserve">IDoc reprocessed from AIF; status 53; document posted; error closed in AIF.</w:t>
+              <w:t>IDoc reprocessed from AIF; status 53; document posted; error closed in AIF.</w:t>
             </w:r>
           </w:p>
         </w:tc>
@@ -8367,7 +8121,7 @@
               <w:rPr>
                 <w:rFonts w:cs="Arial"/>
               </w:rPr>
-              <w:t xml:space="preserve">11</w:t>
+              <w:t>11</w:t>
             </w:r>
           </w:p>
         </w:tc>
@@ -8395,7 +8149,7 @@
               <w:rPr>
                 <w:rFonts w:cs="Arial"/>
               </w:rPr>
-              <w:t xml:space="preserve">ACC_DOCUMENT04: authorizations of the IDoc user</w:t>
+              <w:t>ACC_DOCUMENT04: authorizations of the IDoc user</w:t>
             </w:r>
           </w:p>
         </w:tc>
@@ -8423,7 +8177,7 @@
               <w:rPr>
                 <w:rFonts w:cs="Arial"/>
               </w:rPr>
-              <w:t xml:space="preserve">normal</w:t>
+              <w:t>normal</w:t>
             </w:r>
           </w:p>
         </w:tc>
@@ -8451,7 +8205,7 @@
               <w:rPr>
                 <w:rFonts w:cs="Arial"/>
               </w:rPr>
-              <w:t xml:space="preserve">IDoc processed with the real IDoc user</w:t>
+              <w:t>IDoc processed with the real IDoc user</w:t>
             </w:r>
           </w:p>
         </w:tc>
@@ -8479,7 +8233,7 @@
               <w:rPr>
                 <w:rFonts w:cs="Arial"/>
               </w:rPr>
-              <w:t xml:space="preserve">No authorization error (SU53 / ST01 clean); document posted.</w:t>
+              <w:t>No authorization error (SU53 / ST01 clean); document posted.</w:t>
             </w:r>
           </w:p>
         </w:tc>
@@ -8568,7 +8322,7 @@
         </w:tcPr>
         <w:p>
           <w:pPr>
-            <w:pStyle w:val="Header"/>
+            <w:pStyle w:val="En-tte"/>
             <w:spacing w:before="60"/>
             <w:jc w:val="center"/>
             <w:rPr>
@@ -8595,7 +8349,7 @@
         </w:tcPr>
         <w:p>
           <w:pPr>
-            <w:pStyle w:val="Header"/>
+            <w:pStyle w:val="En-tte"/>
             <w:spacing w:before="60"/>
             <w:jc w:val="center"/>
             <w:rPr>
@@ -8628,7 +8382,7 @@
         </w:tcPr>
         <w:p>
           <w:pPr>
-            <w:pStyle w:val="NoSpacing"/>
+            <w:pStyle w:val="Sansinterligne"/>
             <w:pBdr>
               <w:top w:val="single" w:sz="4" w:space="1" w:color="auto"/>
               <w:left w:val="single" w:sz="4" w:space="4" w:color="auto"/>
@@ -8697,7 +8451,6 @@
             </w:rPr>
             <w:t xml:space="preserve"> </w:t>
           </w:r>
-          <w:proofErr w:type="spellStart"/>
           <w:r>
             <w:rPr>
               <w:b/>
@@ -8705,17 +8458,7 @@
               <w:sz w:val="18"/>
               <w:szCs w:val="22"/>
             </w:rPr>
-            <w:t>Citibank HRS</w:t>
-          </w:r>
-          <w:proofErr w:type="spellEnd"/>
-          <w:r>
-            <w:rPr>
-              <w:b/>
-              <w:bCs/>
-              <w:sz w:val="18"/>
-              <w:szCs w:val="22"/>
-            </w:rPr>
-            <w:t xml:space="preserve"> reclassification</w:t>
+            <w:t>Citibank HRS reclassification</w:t>
           </w:r>
           <w:r>
             <w:rPr>
@@ -8740,7 +8483,7 @@
         </w:tcPr>
         <w:p>
           <w:pPr>
-            <w:pStyle w:val="Header"/>
+            <w:pStyle w:val="En-tte"/>
             <w:spacing w:before="60"/>
             <w:jc w:val="center"/>
             <w:rPr>
@@ -8821,7 +8564,7 @@
   </w:tbl>
   <w:p>
     <w:pPr>
-      <w:pStyle w:val="Footer"/>
+      <w:pStyle w:val="Pieddepage"/>
     </w:pPr>
   </w:p>
 </w:ftr>
@@ -8863,7 +8606,7 @@
 <w:hdr xmlns:wpc="http://schemas.microsoft.com/office/word/2010/wordprocessingCanvas" xmlns:cx="http://schemas.microsoft.com/office/drawing/2014/chartex" xmlns:cx1="http://schemas.microsoft.com/office/drawing/2015/9/8/chartex" xmlns:cx2="http://schemas.microsoft.com/office/drawing/2015/10/21/chartex" xmlns:cx3="http://schemas.microsoft.com/office/drawing/2016/5/9/chartex" xmlns:cx4="http://schemas.microsoft.com/office/drawing/2016/5/10/chartex" xmlns:cx5="http://schemas.microsoft.com/office/drawing/2016/5/11/chartex" xmlns:cx6="http://schemas.microsoft.com/office/drawing/2016/5/12/chartex" xmlns:cx7="http://schemas.microsoft.com/office/drawing/2016/5/13/chartex" xmlns:cx8="http://schemas.microsoft.com/office/drawing/2016/5/14/chartex" xmlns:mc="http://schemas.openxmlformats.org/markup-compatibility/2006" xmlns:aink="http://schemas.microsoft.com/office/drawing/2016/ink" xmlns:am3d="http://schemas.microsoft.com/office/drawing/2017/model3d" xmlns:o="urn:schemas-microsoft-com:office:office" xmlns:oel="http://schemas.microsoft.com/office/2019/extlst" xmlns:r="http://schemas.openxmlformats.org/officeDocument/2006/relationships" xmlns:m="http://schemas.openxmlformats.org/officeDocument/2006/math" xmlns:v="urn:schemas-microsoft-com:vml" xmlns:wp14="http://schemas.microsoft.com/office/word/2010/wordprocessingDrawing" xmlns:wp="http://schemas.openxmlformats.org/drawingml/2006/wordprocessingDrawing" xmlns:w10="urn:schemas-microsoft-com:office:word" xmlns:w="http://schemas.openxmlformats.org/wordprocessingml/2006/main" xmlns:w14="http://schemas.microsoft.com/office/word/2010/wordml" xmlns:w15="http://schemas.microsoft.com/office/word/2012/wordml" xmlns:w16cex="http://schemas.microsoft.com/office/word/2018/wordml/cex" xmlns:w16cid="http://schemas.microsoft.com/office/word/2016/wordml/cid" xmlns:w16="http://schemas.microsoft.com/office/word/2018/wordml" xmlns:w16du="http://schemas.microsoft.com/office/word/2023/wordml/word16du" xmlns:w16sdtdh="http://schemas.microsoft.com/office/word/2020/wordml/sdtdatahash" xmlns:w16sdtfl="http://schemas.microsoft.com/office/word/2024/wordml/sdtformatlock" xmlns:w16se="http://schemas.microsoft.com/office/word/2015/wordml/symex" xmlns:wpg="http://schemas.microsoft.com/office/word/2010/wordprocessingGroup" xmlns:wpi="http://schemas.microsoft.com/office/word/2010/wordprocessingInk" xmlns:wne="http://schemas.microsoft.com/office/word/2006/wordml" xmlns:wps="http://schemas.microsoft.com/office/word/2010/wordprocessingShape" mc:Ignorable="w14 w15 w16se w16cid w16 w16cex w16sdtdh w16sdtfl w16du wp14">
   <w:p>
     <w:pPr>
-      <w:pStyle w:val="Header"/>
+      <w:pStyle w:val="En-tte"/>
     </w:pPr>
     <w:r>
       <w:rPr>
@@ -9028,7 +8771,7 @@
         </w:tcPr>
         <w:p>
           <w:pPr>
-            <w:pStyle w:val="Header"/>
+            <w:pStyle w:val="En-tte"/>
             <w:tabs>
               <w:tab w:val="center" w:pos="567"/>
             </w:tabs>
@@ -9385,7 +9128,7 @@
                             <w:txbxContent>
                               <w:p>
                                 <w:pPr>
-                                  <w:pStyle w:val="Header"/>
+                                  <w:pStyle w:val="En-tte"/>
                                   <w:tabs>
                                     <w:tab w:val="center" w:pos="567"/>
                                   </w:tabs>
@@ -9449,7 +9192,7 @@
                       <w:txbxContent>
                         <w:p>
                           <w:pPr>
-                            <w:pStyle w:val="Header"/>
+                            <w:pStyle w:val="En-tte"/>
                             <w:tabs>
                               <w:tab w:val="center" w:pos="567"/>
                             </w:tabs>
@@ -9566,7 +9309,7 @@
                             <w:txbxContent>
                               <w:p>
                                 <w:pPr>
-                                  <w:pStyle w:val="Header"/>
+                                  <w:pStyle w:val="En-tte"/>
                                   <w:jc w:val="center"/>
                                   <w:rPr>
                                     <w:b/>
@@ -9577,7 +9320,7 @@
                               </w:p>
                               <w:p>
                                 <w:pPr>
-                                  <w:pStyle w:val="Header"/>
+                                  <w:pStyle w:val="En-tte"/>
                                   <w:jc w:val="center"/>
                                   <w:rPr>
                                     <w:sz w:val="19"/>
@@ -9614,7 +9357,7 @@
                       <w:txbxContent>
                         <w:p>
                           <w:pPr>
-                            <w:pStyle w:val="Header"/>
+                            <w:pStyle w:val="En-tte"/>
                             <w:jc w:val="center"/>
                             <w:rPr>
                               <w:b/>
@@ -9625,7 +9368,7 @@
                         </w:p>
                         <w:p>
                           <w:pPr>
-                            <w:pStyle w:val="Header"/>
+                            <w:pStyle w:val="En-tte"/>
                             <w:jc w:val="center"/>
                             <w:rPr>
                               <w:sz w:val="19"/>
@@ -9680,7 +9423,7 @@
         </w:tcPr>
         <w:p>
           <w:pPr>
-            <w:pStyle w:val="Header"/>
+            <w:pStyle w:val="En-tte"/>
             <w:spacing w:before="80"/>
             <w:rPr>
               <w:sz w:val="16"/>
@@ -10799,7 +10542,7 @@
         </w:tcPr>
         <w:p>
           <w:pPr>
-            <w:pStyle w:val="Header"/>
+            <w:pStyle w:val="En-tte"/>
             <w:tabs>
               <w:tab w:val="center" w:pos="567"/>
             </w:tabs>
@@ -10846,7 +10589,6 @@
             </w:rPr>
             <w:t xml:space="preserve">cification </w:t>
           </w:r>
-          <w:proofErr w:type="spellStart"/>
           <w:r>
             <w:rPr>
               <w:rFonts w:eastAsia="Times New Roman" w:cs="Arial"/>
@@ -10854,17 +10596,7 @@
               <w:bCs/>
               <w:color w:val="000000"/>
             </w:rPr>
-            <w:t>Citibank HRS</w:t>
-          </w:r>
-          <w:proofErr w:type="spellEnd"/>
-          <w:r>
-            <w:rPr>
-              <w:rFonts w:eastAsia="Times New Roman" w:cs="Arial"/>
-              <w:b/>
-              <w:bCs/>
-              <w:color w:val="000000"/>
-            </w:rPr>
-            <w:t xml:space="preserve"> reclassification</w:t>
+            <w:t>Citibank HRS reclassification</w:t>
           </w:r>
         </w:p>
       </w:tc>
@@ -10875,7 +10607,7 @@
         </w:tcPr>
         <w:p>
           <w:pPr>
-            <w:pStyle w:val="Header"/>
+            <w:pStyle w:val="En-tte"/>
             <w:spacing w:before="80"/>
           </w:pPr>
         </w:p>
@@ -10894,7 +10626,7 @@
         </w:tcPr>
         <w:p>
           <w:pPr>
-            <w:pStyle w:val="Header"/>
+            <w:pStyle w:val="En-tte"/>
             <w:tabs>
               <w:tab w:val="center" w:pos="567"/>
             </w:tabs>
@@ -11010,7 +10742,7 @@
         </w:tcPr>
         <w:p>
           <w:pPr>
-            <w:pStyle w:val="Header"/>
+            <w:pStyle w:val="En-tte"/>
             <w:spacing w:before="80"/>
             <w:rPr>
               <w:sz w:val="16"/>
@@ -11023,7 +10755,7 @@
   </w:tbl>
   <w:p>
     <w:pPr>
-      <w:pStyle w:val="Header"/>
+      <w:pStyle w:val="En-tte"/>
     </w:pPr>
   </w:p>
 </w:hdr>
@@ -11033,7 +10765,7 @@
 <w:hdr xmlns:wpc="http://schemas.microsoft.com/office/word/2010/wordprocessingCanvas" xmlns:cx="http://schemas.microsoft.com/office/drawing/2014/chartex" xmlns:cx1="http://schemas.microsoft.com/office/drawing/2015/9/8/chartex" xmlns:cx2="http://schemas.microsoft.com/office/drawing/2015/10/21/chartex" xmlns:cx3="http://schemas.microsoft.com/office/drawing/2016/5/9/chartex" xmlns:cx4="http://schemas.microsoft.com/office/drawing/2016/5/10/chartex" xmlns:cx5="http://schemas.microsoft.com/office/drawing/2016/5/11/chartex" xmlns:cx6="http://schemas.microsoft.com/office/drawing/2016/5/12/chartex" xmlns:cx7="http://schemas.microsoft.com/office/drawing/2016/5/13/chartex" xmlns:cx8="http://schemas.microsoft.com/office/drawing/2016/5/14/chartex" xmlns:mc="http://schemas.openxmlformats.org/markup-compatibility/2006" xmlns:aink="http://schemas.microsoft.com/office/drawing/2016/ink" xmlns:am3d="http://schemas.microsoft.com/office/drawing/2017/model3d" xmlns:o="urn:schemas-microsoft-com:office:office" xmlns:oel="http://schemas.microsoft.com/office/2019/extlst" xmlns:r="http://schemas.openxmlformats.org/officeDocument/2006/relationships" xmlns:m="http://schemas.openxmlformats.org/officeDocument/2006/math" xmlns:v="urn:schemas-microsoft-com:vml" xmlns:wp14="http://schemas.microsoft.com/office/word/2010/wordprocessingDrawing" xmlns:wp="http://schemas.openxmlformats.org/drawingml/2006/wordprocessingDrawing" xmlns:w10="urn:schemas-microsoft-com:office:word" xmlns:w="http://schemas.openxmlformats.org/wordprocessingml/2006/main" xmlns:w14="http://schemas.microsoft.com/office/word/2010/wordml" xmlns:w15="http://schemas.microsoft.com/office/word/2012/wordml" xmlns:w16cex="http://schemas.microsoft.com/office/word/2018/wordml/cex" xmlns:w16cid="http://schemas.microsoft.com/office/word/2016/wordml/cid" xmlns:w16="http://schemas.microsoft.com/office/word/2018/wordml" xmlns:w16du="http://schemas.microsoft.com/office/word/2023/wordml/word16du" xmlns:w16sdtdh="http://schemas.microsoft.com/office/word/2020/wordml/sdtdatahash" xmlns:w16sdtfl="http://schemas.microsoft.com/office/word/2024/wordml/sdtformatlock" xmlns:w16se="http://schemas.microsoft.com/office/word/2015/wordml/symex" xmlns:wpg="http://schemas.microsoft.com/office/word/2010/wordprocessingGroup" xmlns:wpi="http://schemas.microsoft.com/office/word/2010/wordprocessingInk" xmlns:wne="http://schemas.microsoft.com/office/word/2006/wordml" xmlns:wps="http://schemas.microsoft.com/office/word/2010/wordprocessingShape" mc:Ignorable="w14 w15 w16se w16cid w16 w16cex w16sdtdh w16sdtfl w16du wp14">
   <w:p>
     <w:pPr>
-      <w:pStyle w:val="Header"/>
+      <w:pStyle w:val="En-tte"/>
     </w:pPr>
     <w:r>
       <w:rPr>
@@ -11839,6 +11571,119 @@
     </w:lvl>
   </w:abstractNum>
   <w:abstractNum w:abstractNumId="6" w15:restartNumberingAfterBreak="0">
+    <w:nsid w:val="2DE31B76"/>
+    <w:multiLevelType w:val="hybridMultilevel"/>
+    <w:tmpl w:val="79263D24"/>
+    <w:lvl w:ilvl="0" w:tplc="6434A0C6">
+      <w:start w:val="2"/>
+      <w:numFmt w:val="bullet"/>
+      <w:lvlText w:val="-"/>
+      <w:lvlJc w:val="left"/>
+      <w:pPr>
+        <w:ind w:left="720" w:hanging="360"/>
+      </w:pPr>
+      <w:rPr>
+        <w:rFonts w:ascii="Arial" w:eastAsia="Times New Roman" w:hAnsi="Arial" w:cs="Arial" w:hint="default"/>
+      </w:rPr>
+    </w:lvl>
+    <w:lvl w:ilvl="1" w:tplc="04090003" w:tentative="1">
+      <w:start w:val="1"/>
+      <w:numFmt w:val="bullet"/>
+      <w:lvlText w:val="o"/>
+      <w:lvlJc w:val="left"/>
+      <w:pPr>
+        <w:ind w:left="1440" w:hanging="360"/>
+      </w:pPr>
+      <w:rPr>
+        <w:rFonts w:ascii="Courier New" w:hAnsi="Courier New" w:cs="Courier New" w:hint="default"/>
+      </w:rPr>
+    </w:lvl>
+    <w:lvl w:ilvl="2" w:tplc="04090005" w:tentative="1">
+      <w:start w:val="1"/>
+      <w:numFmt w:val="bullet"/>
+      <w:lvlText w:val=""/>
+      <w:lvlJc w:val="left"/>
+      <w:pPr>
+        <w:ind w:left="2160" w:hanging="360"/>
+      </w:pPr>
+      <w:rPr>
+        <w:rFonts w:ascii="Wingdings" w:hAnsi="Wingdings" w:hint="default"/>
+      </w:rPr>
+    </w:lvl>
+    <w:lvl w:ilvl="3" w:tplc="04090001" w:tentative="1">
+      <w:start w:val="1"/>
+      <w:numFmt w:val="bullet"/>
+      <w:lvlText w:val=""/>
+      <w:lvlJc w:val="left"/>
+      <w:pPr>
+        <w:ind w:left="2880" w:hanging="360"/>
+      </w:pPr>
+      <w:rPr>
+        <w:rFonts w:ascii="Symbol" w:hAnsi="Symbol" w:hint="default"/>
+      </w:rPr>
+    </w:lvl>
+    <w:lvl w:ilvl="4" w:tplc="04090003" w:tentative="1">
+      <w:start w:val="1"/>
+      <w:numFmt w:val="bullet"/>
+      <w:lvlText w:val="o"/>
+      <w:lvlJc w:val="left"/>
+      <w:pPr>
+        <w:ind w:left="3600" w:hanging="360"/>
+      </w:pPr>
+      <w:rPr>
+        <w:rFonts w:ascii="Courier New" w:hAnsi="Courier New" w:cs="Courier New" w:hint="default"/>
+      </w:rPr>
+    </w:lvl>
+    <w:lvl w:ilvl="5" w:tplc="04090005" w:tentative="1">
+      <w:start w:val="1"/>
+      <w:numFmt w:val="bullet"/>
+      <w:lvlText w:val=""/>
+      <w:lvlJc w:val="left"/>
+      <w:pPr>
+        <w:ind w:left="4320" w:hanging="360"/>
+      </w:pPr>
+      <w:rPr>
+        <w:rFonts w:ascii="Wingdings" w:hAnsi="Wingdings" w:hint="default"/>
+      </w:rPr>
+    </w:lvl>
+    <w:lvl w:ilvl="6" w:tplc="04090001" w:tentative="1">
+      <w:start w:val="1"/>
+      <w:numFmt w:val="bullet"/>
+      <w:lvlText w:val=""/>
+      <w:lvlJc w:val="left"/>
+      <w:pPr>
+        <w:ind w:left="5040" w:hanging="360"/>
+      </w:pPr>
+      <w:rPr>
+        <w:rFonts w:ascii="Symbol" w:hAnsi="Symbol" w:hint="default"/>
+      </w:rPr>
+    </w:lvl>
+    <w:lvl w:ilvl="7" w:tplc="04090003" w:tentative="1">
+      <w:start w:val="1"/>
+      <w:numFmt w:val="bullet"/>
+      <w:lvlText w:val="o"/>
+      <w:lvlJc w:val="left"/>
+      <w:pPr>
+        <w:ind w:left="5760" w:hanging="360"/>
+      </w:pPr>
+      <w:rPr>
+        <w:rFonts w:ascii="Courier New" w:hAnsi="Courier New" w:cs="Courier New" w:hint="default"/>
+      </w:rPr>
+    </w:lvl>
+    <w:lvl w:ilvl="8" w:tplc="04090005" w:tentative="1">
+      <w:start w:val="1"/>
+      <w:numFmt w:val="bullet"/>
+      <w:lvlText w:val=""/>
+      <w:lvlJc w:val="left"/>
+      <w:pPr>
+        <w:ind w:left="6480" w:hanging="360"/>
+      </w:pPr>
+      <w:rPr>
+        <w:rFonts w:ascii="Wingdings" w:hAnsi="Wingdings" w:hint="default"/>
+      </w:rPr>
+    </w:lvl>
+  </w:abstractNum>
+  <w:abstractNum w:abstractNumId="7" w15:restartNumberingAfterBreak="0">
     <w:nsid w:val="575D5105"/>
     <w:multiLevelType w:val="hybridMultilevel"/>
     <w:tmpl w:val="E70EA538"/>
@@ -11924,7 +11769,7 @@
       </w:pPr>
     </w:lvl>
   </w:abstractNum>
-  <w:abstractNum w:abstractNumId="7" w15:restartNumberingAfterBreak="0">
+  <w:abstractNum w:abstractNumId="8" w15:restartNumberingAfterBreak="0">
     <w:nsid w:val="6F1248E7"/>
     <w:multiLevelType w:val="hybridMultilevel"/>
     <w:tmpl w:val="1E2AA22E"/>
@@ -12037,14 +11882,14 @@
       </w:rPr>
     </w:lvl>
   </w:abstractNum>
-  <w:abstractNum w:abstractNumId="8" w15:restartNumberingAfterBreak="0">
+  <w:abstractNum w:abstractNumId="9" w15:restartNumberingAfterBreak="0">
     <w:nsid w:val="7AAE379F"/>
     <w:multiLevelType w:val="multilevel"/>
     <w:tmpl w:val="E9700BF6"/>
     <w:lvl w:ilvl="0">
       <w:start w:val="1"/>
       <w:numFmt w:val="decimal"/>
-      <w:pStyle w:val="Heading1"/>
+      <w:pStyle w:val="Titre1"/>
       <w:suff w:val="space"/>
       <w:lvlText w:val="%1."/>
       <w:lvlJc w:val="left"/>
@@ -12060,7 +11905,7 @@
     <w:lvl w:ilvl="1">
       <w:start w:val="1"/>
       <w:numFmt w:val="decimal"/>
-      <w:pStyle w:val="Heading2"/>
+      <w:pStyle w:val="Titre2"/>
       <w:suff w:val="space"/>
       <w:lvlText w:val="%1.%2."/>
       <w:lvlJc w:val="left"/>
@@ -12075,7 +11920,7 @@
     <w:lvl w:ilvl="2">
       <w:start w:val="1"/>
       <w:numFmt w:val="decimal"/>
-      <w:pStyle w:val="Heading3"/>
+      <w:pStyle w:val="Titre3"/>
       <w:suff w:val="space"/>
       <w:lvlText w:val="%1.%2.%3."/>
       <w:lvlJc w:val="left"/>
@@ -12089,7 +11934,7 @@
     <w:lvl w:ilvl="3">
       <w:start w:val="1"/>
       <w:numFmt w:val="decimal"/>
-      <w:pStyle w:val="Heading4"/>
+      <w:pStyle w:val="Titre4"/>
       <w:suff w:val="space"/>
       <w:lvlText w:val="%1.%2.%3.%4."/>
       <w:lvlJc w:val="left"/>
@@ -12103,7 +11948,7 @@
     <w:lvl w:ilvl="4">
       <w:start w:val="1"/>
       <w:numFmt w:val="decimal"/>
-      <w:pStyle w:val="Heading5"/>
+      <w:pStyle w:val="Titre5"/>
       <w:suff w:val="space"/>
       <w:lvlText w:val="%1.%2.%3.%4.%5."/>
       <w:lvlJc w:val="left"/>
@@ -12175,7 +12020,7 @@
       </w:rPr>
     </w:lvl>
   </w:abstractNum>
-  <w:abstractNum w:abstractNumId="9" w15:restartNumberingAfterBreak="0">
+  <w:abstractNum w:abstractNumId="10" w15:restartNumberingAfterBreak="0">
     <w:nsid w:val="7D462E8F"/>
     <w:multiLevelType w:val="hybridMultilevel"/>
     <w:tmpl w:val="50C4E398"/>
@@ -12289,22 +12134,22 @@
     </w:lvl>
   </w:abstractNum>
   <w:num w:numId="1" w16cid:durableId="1958412540">
-    <w:abstractNumId w:val="8"/>
+    <w:abstractNumId w:val="9"/>
   </w:num>
   <w:num w:numId="2" w16cid:durableId="302121749">
-    <w:abstractNumId w:val="9"/>
+    <w:abstractNumId w:val="10"/>
   </w:num>
   <w:num w:numId="3" w16cid:durableId="1950820567">
     <w:abstractNumId w:val="1"/>
   </w:num>
   <w:num w:numId="4" w16cid:durableId="483814136">
-    <w:abstractNumId w:val="7"/>
+    <w:abstractNumId w:val="8"/>
   </w:num>
   <w:num w:numId="5" w16cid:durableId="1150753126">
     <w:abstractNumId w:val="0"/>
   </w:num>
   <w:num w:numId="6" w16cid:durableId="1733505151">
-    <w:abstractNumId w:val="8"/>
+    <w:abstractNumId w:val="9"/>
     <w:lvlOverride w:ilvl="0">
       <w:startOverride w:val="1"/>
     </w:lvlOverride>
@@ -12334,13 +12179,13 @@
     </w:lvlOverride>
   </w:num>
   <w:num w:numId="7" w16cid:durableId="107167226">
-    <w:abstractNumId w:val="8"/>
+    <w:abstractNumId w:val="9"/>
   </w:num>
   <w:num w:numId="8" w16cid:durableId="662393652">
-    <w:abstractNumId w:val="8"/>
+    <w:abstractNumId w:val="9"/>
   </w:num>
   <w:num w:numId="9" w16cid:durableId="798571318">
-    <w:abstractNumId w:val="6"/>
+    <w:abstractNumId w:val="7"/>
   </w:num>
   <w:num w:numId="10" w16cid:durableId="1080718779">
     <w:abstractNumId w:val="4"/>
@@ -12355,25 +12200,28 @@
     <w:abstractNumId w:val="2"/>
   </w:num>
   <w:num w:numId="14" w16cid:durableId="100691699">
-    <w:abstractNumId w:val="8"/>
+    <w:abstractNumId w:val="9"/>
   </w:num>
   <w:num w:numId="15" w16cid:durableId="2095860892">
-    <w:abstractNumId w:val="8"/>
+    <w:abstractNumId w:val="9"/>
   </w:num>
   <w:num w:numId="16" w16cid:durableId="1077827393">
-    <w:abstractNumId w:val="8"/>
+    <w:abstractNumId w:val="9"/>
   </w:num>
   <w:num w:numId="17" w16cid:durableId="731080948">
-    <w:abstractNumId w:val="8"/>
+    <w:abstractNumId w:val="9"/>
   </w:num>
   <w:num w:numId="18" w16cid:durableId="1122963225">
-    <w:abstractNumId w:val="8"/>
+    <w:abstractNumId w:val="9"/>
   </w:num>
   <w:num w:numId="19" w16cid:durableId="1233004397">
-    <w:abstractNumId w:val="8"/>
+    <w:abstractNumId w:val="9"/>
   </w:num>
   <w:num w:numId="20" w16cid:durableId="16546010">
-    <w:abstractNumId w:val="8"/>
+    <w:abstractNumId w:val="9"/>
+  </w:num>
+  <w:num w:numId="21" w16cid:durableId="228157387">
+    <w:abstractNumId w:val="6"/>
   </w:num>
   <w:numIdMacAtCleanup w:val="5"/>
 </w:numbering>
@@ -12778,11 +12626,11 @@
     <w:name w:val="Normal"/>
     <w:qFormat/>
   </w:style>
-  <w:style w:type="paragraph" w:styleId="Heading1">
+  <w:style w:type="paragraph" w:styleId="Titre1">
     <w:name w:val="heading 1"/>
     <w:basedOn w:val="Normal"/>
     <w:next w:val="Normal"/>
-    <w:link w:val="Heading1Char"/>
+    <w:link w:val="Titre1Car"/>
     <w:qFormat/>
     <w:rsid w:val="00AA5D03"/>
     <w:pPr>
@@ -12804,12 +12652,12 @@
       <w:lang w:eastAsia="fr-FR"/>
     </w:rPr>
   </w:style>
-  <w:style w:type="paragraph" w:styleId="Heading2">
+  <w:style w:type="paragraph" w:styleId="Titre2">
     <w:name w:val="heading 2"/>
     <w:aliases w:val="Titre 2 Car"/>
     <w:basedOn w:val="Normal"/>
     <w:next w:val="Normal"/>
-    <w:link w:val="Heading2Char"/>
+    <w:link w:val="Titre2Car1"/>
     <w:qFormat/>
     <w:rsid w:val="00AA5D03"/>
     <w:pPr>
@@ -12832,11 +12680,11 @@
       <w:lang w:eastAsia="fr-FR"/>
     </w:rPr>
   </w:style>
-  <w:style w:type="paragraph" w:styleId="Heading3">
+  <w:style w:type="paragraph" w:styleId="Titre3">
     <w:name w:val="heading 3"/>
     <w:basedOn w:val="Normal"/>
     <w:next w:val="Normal"/>
-    <w:link w:val="Heading3Char"/>
+    <w:link w:val="Titre3Car"/>
     <w:qFormat/>
     <w:rsid w:val="00AA5D03"/>
     <w:pPr>
@@ -12856,11 +12704,11 @@
       <w:lang w:eastAsia="fr-FR"/>
     </w:rPr>
   </w:style>
-  <w:style w:type="paragraph" w:styleId="Heading4">
+  <w:style w:type="paragraph" w:styleId="Titre4">
     <w:name w:val="heading 4"/>
     <w:basedOn w:val="Normal"/>
     <w:next w:val="Normal"/>
-    <w:link w:val="Heading4Char"/>
+    <w:link w:val="Titre4Car"/>
     <w:qFormat/>
     <w:rsid w:val="00AA5D03"/>
     <w:pPr>
@@ -12881,11 +12729,11 @@
       <w:lang w:eastAsia="fr-FR"/>
     </w:rPr>
   </w:style>
-  <w:style w:type="paragraph" w:styleId="Heading5">
+  <w:style w:type="paragraph" w:styleId="Titre5">
     <w:name w:val="heading 5"/>
     <w:basedOn w:val="Normal"/>
     <w:next w:val="Normal"/>
-    <w:link w:val="Heading5Char"/>
+    <w:link w:val="Titre5Car"/>
     <w:qFormat/>
     <w:rsid w:val="00AA5D03"/>
     <w:pPr>
@@ -12907,12 +12755,13 @@
       <w:lang w:eastAsia="fr-FR"/>
     </w:rPr>
   </w:style>
-  <w:style w:type="character" w:default="1" w:styleId="DefaultParagraphFont">
+  <w:style w:type="character" w:default="1" w:styleId="Policepardfaut">
     <w:name w:val="Default Paragraph Font"/>
     <w:uiPriority w:val="1"/>
+    <w:semiHidden/>
     <w:unhideWhenUsed/>
   </w:style>
-  <w:style w:type="table" w:default="1" w:styleId="TableNormal">
+  <w:style w:type="table" w:default="1" w:styleId="TableauNormal">
     <w:name w:val="Normal Table"/>
     <w:uiPriority w:val="99"/>
     <w:semiHidden/>
@@ -12927,7 +12776,7 @@
       </w:tblCellMar>
     </w:tblPr>
   </w:style>
-  <w:style w:type="numbering" w:default="1" w:styleId="NoList">
+  <w:style w:type="numbering" w:default="1" w:styleId="Aucuneliste">
     <w:name w:val="No List"/>
     <w:uiPriority w:val="99"/>
     <w:semiHidden/>
@@ -12949,9 +12798,9 @@
       <w:szCs w:val="24"/>
     </w:rPr>
   </w:style>
-  <w:style w:type="character" w:styleId="Strong">
+  <w:style w:type="character" w:styleId="lev">
     <w:name w:val="Strong"/>
-    <w:basedOn w:val="DefaultParagraphFont"/>
+    <w:basedOn w:val="Policepardfaut"/>
     <w:uiPriority w:val="22"/>
     <w:qFormat/>
     <w:rsid w:val="000D5229"/>
@@ -12960,9 +12809,9 @@
       <w:bCs/>
     </w:rPr>
   </w:style>
-  <w:style w:type="character" w:styleId="Emphasis">
+  <w:style w:type="character" w:styleId="Accentuation">
     <w:name w:val="Emphasis"/>
-    <w:basedOn w:val="DefaultParagraphFont"/>
+    <w:basedOn w:val="Policepardfaut"/>
     <w:uiPriority w:val="20"/>
     <w:qFormat/>
     <w:rsid w:val="000D5229"/>
@@ -12973,13 +12822,13 @@
   </w:style>
   <w:style w:type="character" w:customStyle="1" w:styleId="apple-converted-space">
     <w:name w:val="apple-converted-space"/>
-    <w:basedOn w:val="DefaultParagraphFont"/>
+    <w:basedOn w:val="Policepardfaut"/>
     <w:rsid w:val="000D5229"/>
   </w:style>
-  <w:style w:type="character" w:customStyle="1" w:styleId="Heading1Char">
-    <w:name w:val="Heading 1 Char"/>
-    <w:basedOn w:val="DefaultParagraphFont"/>
-    <w:link w:val="Heading1"/>
+  <w:style w:type="character" w:customStyle="1" w:styleId="Titre1Car">
+    <w:name w:val="Titre 1 Car"/>
+    <w:basedOn w:val="Policepardfaut"/>
+    <w:link w:val="Titre1"/>
     <w:rsid w:val="00AA5D03"/>
     <w:rPr>
       <w:rFonts w:ascii="Arial" w:eastAsia="Times" w:hAnsi="Arial" w:cs="Times New Roman"/>
@@ -12991,11 +12840,11 @@
       <w:lang w:eastAsia="fr-FR"/>
     </w:rPr>
   </w:style>
-  <w:style w:type="character" w:customStyle="1" w:styleId="Heading2Char">
-    <w:name w:val="Heading 2 Char"/>
-    <w:aliases w:val="Titre 2 Car Char"/>
-    <w:basedOn w:val="DefaultParagraphFont"/>
-    <w:link w:val="Heading2"/>
+  <w:style w:type="character" w:customStyle="1" w:styleId="Titre2Car1">
+    <w:name w:val="Titre 2 Car1"/>
+    <w:aliases w:val="Titre 2 Car Car"/>
+    <w:basedOn w:val="Policepardfaut"/>
+    <w:link w:val="Titre2"/>
     <w:rsid w:val="00AA5D03"/>
     <w:rPr>
       <w:rFonts w:ascii="Arial" w:eastAsia="Times New Roman" w:hAnsi="Arial" w:cs="Arial"/>
@@ -13006,10 +12855,10 @@
       <w:lang w:eastAsia="fr-FR"/>
     </w:rPr>
   </w:style>
-  <w:style w:type="character" w:customStyle="1" w:styleId="Heading3Char">
-    <w:name w:val="Heading 3 Char"/>
-    <w:basedOn w:val="DefaultParagraphFont"/>
-    <w:link w:val="Heading3"/>
+  <w:style w:type="character" w:customStyle="1" w:styleId="Titre3Car">
+    <w:name w:val="Titre 3 Car"/>
+    <w:basedOn w:val="Policepardfaut"/>
+    <w:link w:val="Titre3"/>
     <w:rsid w:val="00AA5D03"/>
     <w:rPr>
       <w:rFonts w:ascii="Arial" w:eastAsia="Times New Roman" w:hAnsi="Arial" w:cs="Arial"/>
@@ -13018,10 +12867,10 @@
       <w:lang w:eastAsia="fr-FR"/>
     </w:rPr>
   </w:style>
-  <w:style w:type="character" w:customStyle="1" w:styleId="Heading4Char">
-    <w:name w:val="Heading 4 Char"/>
-    <w:basedOn w:val="DefaultParagraphFont"/>
-    <w:link w:val="Heading4"/>
+  <w:style w:type="character" w:customStyle="1" w:styleId="Titre4Car">
+    <w:name w:val="Titre 4 Car"/>
+    <w:basedOn w:val="Policepardfaut"/>
+    <w:link w:val="Titre4"/>
     <w:rsid w:val="00AA5D03"/>
     <w:rPr>
       <w:rFonts w:ascii="Arial" w:eastAsia="Times New Roman" w:hAnsi="Arial" w:cs="Arial"/>
@@ -13031,10 +12880,10 @@
       <w:lang w:eastAsia="fr-FR"/>
     </w:rPr>
   </w:style>
-  <w:style w:type="character" w:customStyle="1" w:styleId="Heading5Char">
-    <w:name w:val="Heading 5 Char"/>
-    <w:basedOn w:val="DefaultParagraphFont"/>
-    <w:link w:val="Heading5"/>
+  <w:style w:type="character" w:customStyle="1" w:styleId="Titre5Car">
+    <w:name w:val="Titre 5 Car"/>
+    <w:basedOn w:val="Policepardfaut"/>
+    <w:link w:val="Titre5"/>
     <w:rsid w:val="00AA5D03"/>
     <w:rPr>
       <w:rFonts w:ascii="Arial" w:eastAsia="Times New Roman" w:hAnsi="Arial" w:cs="Times New Roman"/>
@@ -13073,11 +12922,11 @@
       <w:lang w:eastAsia="fr-FR"/>
     </w:rPr>
   </w:style>
-  <w:style w:type="paragraph" w:styleId="Subtitle">
+  <w:style w:type="paragraph" w:styleId="Sous-titre">
     <w:name w:val="Subtitle"/>
     <w:basedOn w:val="Normal"/>
     <w:next w:val="Normal"/>
-    <w:link w:val="SubtitleChar"/>
+    <w:link w:val="Sous-titreCar"/>
     <w:qFormat/>
     <w:rsid w:val="00AA5D03"/>
     <w:pPr>
@@ -13094,10 +12943,10 @@
       <w:lang w:eastAsia="fr-FR"/>
     </w:rPr>
   </w:style>
-  <w:style w:type="character" w:customStyle="1" w:styleId="SubtitleChar">
-    <w:name w:val="Subtitle Char"/>
-    <w:basedOn w:val="DefaultParagraphFont"/>
-    <w:link w:val="Subtitle"/>
+  <w:style w:type="character" w:customStyle="1" w:styleId="Sous-titreCar">
+    <w:name w:val="Sous-titre Car"/>
+    <w:basedOn w:val="Policepardfaut"/>
+    <w:link w:val="Sous-titre"/>
     <w:rsid w:val="00AA5D03"/>
     <w:rPr>
       <w:rFonts w:ascii="Arial" w:eastAsia="Times New Roman" w:hAnsi="Arial" w:cs="Arial"/>
@@ -13108,7 +12957,7 @@
       <w:lang w:eastAsia="fr-FR"/>
     </w:rPr>
   </w:style>
-  <w:style w:type="character" w:styleId="Hyperlink">
+  <w:style w:type="character" w:styleId="Lienhypertexte">
     <w:name w:val="Hyperlink"/>
     <w:uiPriority w:val="99"/>
     <w:rsid w:val="00AA5D03"/>
@@ -13117,11 +12966,11 @@
       <w:u w:val="single"/>
     </w:rPr>
   </w:style>
-  <w:style w:type="paragraph" w:styleId="Title">
+  <w:style w:type="paragraph" w:styleId="Titre">
     <w:name w:val="Title"/>
     <w:basedOn w:val="Normal"/>
     <w:next w:val="Normal"/>
-    <w:link w:val="TitleChar"/>
+    <w:link w:val="TitreCar"/>
     <w:qFormat/>
     <w:rsid w:val="00AA5D03"/>
     <w:pPr>
@@ -13140,10 +12989,10 @@
       <w:lang w:eastAsia="fr-FR"/>
     </w:rPr>
   </w:style>
-  <w:style w:type="character" w:customStyle="1" w:styleId="TitleChar">
-    <w:name w:val="Title Char"/>
-    <w:basedOn w:val="DefaultParagraphFont"/>
-    <w:link w:val="Title"/>
+  <w:style w:type="character" w:customStyle="1" w:styleId="TitreCar">
+    <w:name w:val="Titre Car"/>
+    <w:basedOn w:val="Policepardfaut"/>
+    <w:link w:val="Titre"/>
     <w:rsid w:val="00AA5D03"/>
     <w:rPr>
       <w:rFonts w:ascii="Arial" w:eastAsia="Times New Roman" w:hAnsi="Arial" w:cs="Arial"/>
@@ -13156,7 +13005,7 @@
       <w:lang w:eastAsia="fr-FR"/>
     </w:rPr>
   </w:style>
-  <w:style w:type="paragraph" w:styleId="TOC1">
+  <w:style w:type="paragraph" w:styleId="TM1">
     <w:name w:val="toc 1"/>
     <w:basedOn w:val="Normal"/>
     <w:next w:val="Normal"/>
@@ -13179,7 +13028,7 @@
       <w:lang w:eastAsia="fr-FR"/>
     </w:rPr>
   </w:style>
-  <w:style w:type="paragraph" w:styleId="TOC2">
+  <w:style w:type="paragraph" w:styleId="TM2">
     <w:name w:val="toc 2"/>
     <w:basedOn w:val="Normal"/>
     <w:next w:val="Normal"/>
@@ -13203,7 +13052,7 @@
       <w:lang w:eastAsia="fr-FR"/>
     </w:rPr>
   </w:style>
-  <w:style w:type="paragraph" w:styleId="TOC3">
+  <w:style w:type="paragraph" w:styleId="TM3">
     <w:name w:val="toc 3"/>
     <w:basedOn w:val="Normal"/>
     <w:next w:val="Normal"/>
@@ -13224,7 +13073,7 @@
       <w:lang w:eastAsia="fr-FR"/>
     </w:rPr>
   </w:style>
-  <w:style w:type="paragraph" w:styleId="TOC4">
+  <w:style w:type="paragraph" w:styleId="TM4">
     <w:name w:val="toc 4"/>
     <w:basedOn w:val="Normal"/>
     <w:next w:val="Normal"/>
@@ -13245,11 +13094,11 @@
       <w:lang w:eastAsia="fr-FR"/>
     </w:rPr>
   </w:style>
-  <w:style w:type="paragraph" w:styleId="Header">
+  <w:style w:type="paragraph" w:styleId="En-tte">
     <w:name w:val="header"/>
     <w:aliases w:val="wcp_Header,Header_En tete"/>
     <w:basedOn w:val="Normal"/>
-    <w:link w:val="HeaderChar"/>
+    <w:link w:val="En-tteCar"/>
     <w:unhideWhenUsed/>
     <w:rsid w:val="00381EB7"/>
     <w:pPr>
@@ -13260,18 +13109,18 @@
       <w:spacing w:after="0" w:line="240" w:lineRule="auto"/>
     </w:pPr>
   </w:style>
-  <w:style w:type="character" w:customStyle="1" w:styleId="HeaderChar">
-    <w:name w:val="Header Char"/>
-    <w:aliases w:val="wcp_Header Char,Header_En tete Char"/>
-    <w:basedOn w:val="DefaultParagraphFont"/>
-    <w:link w:val="Header"/>
+  <w:style w:type="character" w:customStyle="1" w:styleId="En-tteCar">
+    <w:name w:val="En-tête Car"/>
+    <w:aliases w:val="wcp_Header Car,Header_En tete Car"/>
+    <w:basedOn w:val="Policepardfaut"/>
+    <w:link w:val="En-tte"/>
     <w:uiPriority w:val="99"/>
     <w:rsid w:val="00381EB7"/>
   </w:style>
-  <w:style w:type="paragraph" w:styleId="Footer">
+  <w:style w:type="paragraph" w:styleId="Pieddepage">
     <w:name w:val="footer"/>
     <w:basedOn w:val="Normal"/>
-    <w:link w:val="FooterChar"/>
+    <w:link w:val="PieddepageCar"/>
     <w:uiPriority w:val="99"/>
     <w:unhideWhenUsed/>
     <w:rsid w:val="00381EB7"/>
@@ -13283,16 +13132,16 @@
       <w:spacing w:after="0" w:line="240" w:lineRule="auto"/>
     </w:pPr>
   </w:style>
-  <w:style w:type="character" w:customStyle="1" w:styleId="FooterChar">
-    <w:name w:val="Footer Char"/>
-    <w:basedOn w:val="DefaultParagraphFont"/>
-    <w:link w:val="Footer"/>
+  <w:style w:type="character" w:customStyle="1" w:styleId="PieddepageCar">
+    <w:name w:val="Pied de page Car"/>
+    <w:basedOn w:val="Policepardfaut"/>
+    <w:link w:val="Pieddepage"/>
     <w:uiPriority w:val="99"/>
     <w:rsid w:val="00381EB7"/>
   </w:style>
-  <w:style w:type="table" w:styleId="TableGrid">
+  <w:style w:type="table" w:styleId="Grilledutableau">
     <w:name w:val="Table Grid"/>
-    <w:basedOn w:val="TableNormal"/>
+    <w:basedOn w:val="TableauNormal"/>
     <w:uiPriority w:val="39"/>
     <w:rsid w:val="00C646D1"/>
     <w:pPr>
@@ -13309,9 +13158,9 @@
       </w:tblBorders>
     </w:tblPr>
   </w:style>
-  <w:style w:type="table" w:styleId="PlainTable3">
+  <w:style w:type="table" w:styleId="Tableausimple3">
     <w:name w:val="Plain Table 3"/>
-    <w:basedOn w:val="TableNormal"/>
+    <w:basedOn w:val="TableauNormal"/>
     <w:uiPriority w:val="43"/>
     <w:rsid w:val="00CA5366"/>
     <w:pPr>
@@ -13402,9 +13251,9 @@
       </w:tcPr>
     </w:tblStylePr>
   </w:style>
-  <w:style w:type="table" w:styleId="TableGridLight">
+  <w:style w:type="table" w:styleId="Grilledetableauclaire">
     <w:name w:val="Grid Table Light"/>
-    <w:basedOn w:val="TableNormal"/>
+    <w:basedOn w:val="TableauNormal"/>
     <w:uiPriority w:val="40"/>
     <w:rsid w:val="00CA5366"/>
     <w:pPr>
@@ -13421,7 +13270,7 @@
       </w:tblBorders>
     </w:tblPr>
   </w:style>
-  <w:style w:type="paragraph" w:styleId="ListParagraph">
+  <w:style w:type="paragraph" w:styleId="Paragraphedeliste">
     <w:name w:val="List Paragraph"/>
     <w:basedOn w:val="Normal"/>
     <w:uiPriority w:val="34"/>
@@ -13432,17 +13281,17 @@
       <w:contextualSpacing/>
     </w:pPr>
   </w:style>
-  <w:style w:type="character" w:styleId="LineNumber">
+  <w:style w:type="character" w:styleId="Numrodeligne">
     <w:name w:val="line number"/>
-    <w:basedOn w:val="DefaultParagraphFont"/>
+    <w:basedOn w:val="Policepardfaut"/>
     <w:uiPriority w:val="99"/>
     <w:semiHidden/>
     <w:unhideWhenUsed/>
     <w:rsid w:val="00734FD7"/>
   </w:style>
-  <w:style w:type="character" w:styleId="FollowedHyperlink">
+  <w:style w:type="character" w:styleId="Lienhypertextesuivivisit">
     <w:name w:val="FollowedHyperlink"/>
-    <w:basedOn w:val="DefaultParagraphFont"/>
+    <w:basedOn w:val="Policepardfaut"/>
     <w:uiPriority w:val="99"/>
     <w:semiHidden/>
     <w:unhideWhenUsed/>
@@ -13452,9 +13301,9 @@
       <w:u w:val="single"/>
     </w:rPr>
   </w:style>
-  <w:style w:type="paragraph" w:styleId="TOCHeading">
+  <w:style w:type="paragraph" w:styleId="En-ttedetabledesmatires">
     <w:name w:val="TOC Heading"/>
-    <w:basedOn w:val="Heading1"/>
+    <w:basedOn w:val="Titre1"/>
     <w:next w:val="Normal"/>
     <w:uiPriority w:val="39"/>
     <w:unhideWhenUsed/>
@@ -13482,7 +13331,7 @@
   </w:style>
   <w:style w:type="character" w:customStyle="1" w:styleId="TextoChar">
     <w:name w:val="Texto Char"/>
-    <w:basedOn w:val="DefaultParagraphFont"/>
+    <w:basedOn w:val="Policepardfaut"/>
     <w:link w:val="Texto"/>
     <w:locked/>
     <w:rsid w:val="00DF38A9"/>
@@ -13506,7 +13355,7 @@
   </w:style>
   <w:style w:type="table" w:customStyle="1" w:styleId="MediumShading1-Accent11">
     <w:name w:val="Medium Shading 1 - Accent 11"/>
-    <w:basedOn w:val="TableNormal"/>
+    <w:basedOn w:val="TableauNormal"/>
     <w:uiPriority w:val="63"/>
     <w:rsid w:val="00DF38A9"/>
     <w:pPr>
@@ -13611,7 +13460,7 @@
   </w:style>
   <w:style w:type="paragraph" w:customStyle="1" w:styleId="HeaderProject">
     <w:name w:val="Header Project"/>
-    <w:basedOn w:val="Header"/>
+    <w:basedOn w:val="En-tte"/>
     <w:uiPriority w:val="99"/>
     <w:rsid w:val="002306B1"/>
     <w:pPr>
@@ -13631,7 +13480,7 @@
       <w:lang w:val="en-GB"/>
     </w:rPr>
   </w:style>
-  <w:style w:type="paragraph" w:styleId="NoSpacing">
+  <w:style w:type="paragraph" w:styleId="Sansinterligne">
     <w:name w:val="No Spacing"/>
     <w:uiPriority w:val="1"/>
     <w:qFormat/>
@@ -13650,7 +13499,7 @@
   <w:style w:type="paragraph" w:customStyle="1" w:styleId="HDLGuidance">
     <w:name w:val="HDL_Guidance"/>
     <w:basedOn w:val="Normal"/>
-    <w:next w:val="ListParagraph"/>
+    <w:next w:val="Paragraphedeliste"/>
     <w:link w:val="HDLGuidanceChar"/>
     <w:qFormat/>
     <w:rsid w:val="003149D8"/>
@@ -13687,9 +13536,9 @@
       <w:lang w:val="en-GB"/>
     </w:rPr>
   </w:style>
-  <w:style w:type="character" w:styleId="UnresolvedMention">
+  <w:style w:type="character" w:styleId="Mentionnonrsolue">
     <w:name w:val="Unresolved Mention"/>
-    <w:basedOn w:val="DefaultParagraphFont"/>
+    <w:basedOn w:val="Policepardfaut"/>
     <w:uiPriority w:val="99"/>
     <w:semiHidden/>
     <w:unhideWhenUsed/>
@@ -13736,7 +13585,7 @@
   </w:style>
   <w:style w:type="character" w:customStyle="1" w:styleId="ui-provider">
     <w:name w:val="ui-provider"/>
-    <w:basedOn w:val="DefaultParagraphFont"/>
+    <w:basedOn w:val="Policepardfaut"/>
     <w:rsid w:val="00DA2FF6"/>
   </w:style>
 </w:styles>
@@ -14265,12 +14114,7 @@
 </file>
 
 <file path=customXml/item2.xml><?xml version="1.0" encoding="utf-8"?>
-<?mso-contentType ?>
-<FormTemplates xmlns="http://schemas.microsoft.com/sharepoint/v3/contenttype/forms">
-  <Display>DocumentLibraryForm</Display>
-  <Edit>DocumentLibraryForm</Edit>
-  <New>DocumentLibraryForm</New>
-</FormTemplates>
+<b:Sources xmlns:b="http://schemas.openxmlformats.org/officeDocument/2006/bibliography" xmlns="http://schemas.openxmlformats.org/officeDocument/2006/bibliography" SelectedStyle="\APASixthEditionOfficeOnline.xsl" StyleName="APA" Version="6"/>
 </file>
 
 <file path=customXml/item3.xml><?xml version="1.0" encoding="utf-8"?>
@@ -14286,7 +14130,12 @@
 </file>
 
 <file path=customXml/item4.xml><?xml version="1.0" encoding="utf-8"?>
-<b:Sources xmlns:b="http://schemas.openxmlformats.org/officeDocument/2006/bibliography" xmlns="http://schemas.openxmlformats.org/officeDocument/2006/bibliography" SelectedStyle="\APASixthEditionOfficeOnline.xsl" StyleName="APA" Version="6"/>
+<?mso-contentType ?>
+<FormTemplates xmlns="http://schemas.microsoft.com/sharepoint/v3/contenttype/forms">
+  <Display>DocumentLibraryForm</Display>
+  <Edit>DocumentLibraryForm</Edit>
+  <New>DocumentLibraryForm</New>
+</FormTemplates>
 </file>
 
 <file path=customXml/itemProps1.xml><?xml version="1.0" encoding="utf-8"?>
@@ -14309,9 +14158,9 @@
 </file>
 
 <file path=customXml/itemProps2.xml><?xml version="1.0" encoding="utf-8"?>
-<ds:datastoreItem xmlns:ds="http://schemas.openxmlformats.org/officeDocument/2006/customXml" ds:itemID="{2B75B93F-5EAF-46D2-8238-B627D6E3013C}">
+<ds:datastoreItem xmlns:ds="http://schemas.openxmlformats.org/officeDocument/2006/customXml" ds:itemID="{989B9BF9-0C0C-45CD-A7D7-1158288FD447}">
   <ds:schemaRefs>
-    <ds:schemaRef ds:uri="http://schemas.microsoft.com/sharepoint/v3/contenttype/forms"/>
+    <ds:schemaRef ds:uri="http://schemas.openxmlformats.org/officeDocument/2006/bibliography"/>
   </ds:schemaRefs>
 </ds:datastoreItem>
 </file>
@@ -14328,9 +14177,9 @@
 </file>
 
 <file path=customXml/itemProps4.xml><?xml version="1.0" encoding="utf-8"?>
-<ds:datastoreItem xmlns:ds="http://schemas.openxmlformats.org/officeDocument/2006/customXml" ds:itemID="{989B9BF9-0C0C-45CD-A7D7-1158288FD447}">
+<ds:datastoreItem xmlns:ds="http://schemas.openxmlformats.org/officeDocument/2006/customXml" ds:itemID="{2B75B93F-5EAF-46D2-8238-B627D6E3013C}">
   <ds:schemaRefs>
-    <ds:schemaRef ds:uri="http://schemas.openxmlformats.org/officeDocument/2006/bibliography"/>
+    <ds:schemaRef ds:uri="http://schemas.microsoft.com/sharepoint/v3/contenttype/forms"/>
   </ds:schemaRefs>
 </ds:datastoreItem>
 </file>

</xml_diff>